<commit_message>
DIP-50: Align proposal and topic report with five-outcome MVP
</commit_message>
<xml_diff>
--- a/docs/topic-report.docx
+++ b/docs/topic-report.docx
@@ -147,7 +147,7 @@
           <w:sz w:val="28"/>
           <w:szCs w:val="28"/>
         </w:rPr>
-        <w:t xml:space="preserve">1. Introduction</w:t>
+        <w:t xml:space="preserve">Revision Note</w:t>
       </w:r>
     </w:p>
     <w:p>
@@ -161,7 +161,24 @@
           <w:sz w:val="24"/>
           <w:szCs w:val="24"/>
         </w:rPr>
-        <w:t xml:space="preserve">Travel planning is one of the most time-consuming parts of any trip. A traveler has to decide where to stay, where to eat, which places are worth visiting, what events are happening on the travel dates, and how to fit all of this into a limited budget. When a trip is planned by a group of friends, family members or colleagues, the task becomes even harder: every participant has different preferences, opinions and spending limits, and the discussion usually happens across several messengers, notes and browser tabs.</w:t>
+        <w:t xml:space="preserve">This revision (24 October 2026) replaces the topic report of 20 October 2026. On 23 October 2026 the supervisor, Aigerim Kydyrbekova, advised the team to focus on five essential functions and to give every student real implementation responsibilities. The report therefore describes a reduced minimum viable product (MVP). Features of the earlier version that are not part of the MVP are kept only as deferred future work. The detailed responsibility split is the team's proposed response and is not yet approved by the supervisor (see docs/supervisor-feedback.md and docs/mvp-scope-and-responsibilities.md).</w:t>
+      </w:r>
+    </w:p>
+    <w:p>
+      <w:pPr>
+        <w:pStyle w:val="Heading1"/>
+        <w:spacing w:after="120" w:before="240"/>
+      </w:pPr>
+      <w:r>
+        <w:rPr>
+          <w:rFonts w:ascii="Times New Roman" w:cs="Times New Roman" w:eastAsia="Times New Roman" w:hAnsi="Times New Roman"/>
+          <w:b/>
+          <w:bCs/>
+          <w:color w:val="000000"/>
+          <w:sz w:val="28"/>
+          <w:szCs w:val="28"/>
+        </w:rPr>
+        <w:t xml:space="preserve">1. Introduction</w:t>
       </w:r>
     </w:p>
     <w:p>
@@ -175,7 +192,7 @@
           <w:sz w:val="24"/>
           <w:szCs w:val="24"/>
         </w:rPr>
-        <w:t xml:space="preserve">Our project is a mobile application, with a web version built from the same codebase, that turns this process into a single, simple workflow. The user enters the destination (for example, Astana), the number of travelers, the travel dates and the total budget. Based on this input, the application generates a complete day-by-day trip plan: accommodation options, recommended places to eat, attractions, and events happening on those specific days, all displayed on an interactive map. The budget is automatically distributed across the days of the trip.</w:t>
+        <w:t xml:space="preserve">Travel planning is one of the most time-consuming parts of any trip. A traveler has to decide where to stay, where to eat and which places are worth visiting, and has to fit all of this into a limited budget. When a trip is planned by a group, the task becomes harder: every participant has different preferences, and the discussion usually happens across messengers, notes and browser tabs.</w:t>
       </w:r>
     </w:p>
     <w:p>
@@ -189,7 +206,21 @@
           <w:sz w:val="24"/>
           <w:szCs w:val="24"/>
         </w:rPr>
-        <w:t xml:space="preserve">The key difference of our application is that planning is collaborative. The trip creator can invite friends to the plan, and all participants can vote for places, leave comments, and optionally share and split expenses. Artificial intelligence is used to generate and adjust the plan according to the group's interests, the type of trip and the weather forecast. In addition, a community feed allows travelers to share posts about the places they visited, so that other users can learn from real experiences and travel at the right time to the right places.</w:t>
+        <w:t xml:space="preserve">Our project is a cross-platform application — a mobile application for Android and iOS and a web version built from the same Flutter codebase — that turns this process into one workflow. The user creates a trip to Astana with dates, the number of travelers, interests and a budget. The application proposes a day-by-day route draft built only from checked catalog places, shows the estimated cost by day and category, and displays the route on a map. After the user confirms the draft, friends can be invited to edit the plan together and vote on its items.</w:t>
+      </w:r>
+    </w:p>
+    <w:p>
+      <w:pPr>
+        <w:spacing w:after="120" w:line="300"/>
+        <w:jc w:val="both"/>
+      </w:pPr>
+      <w:r>
+        <w:rPr>
+          <w:rFonts w:ascii="Times New Roman" w:cs="Times New Roman" w:eastAsia="Times New Roman" w:hAnsi="Times New Roman"/>
+          <w:sz w:val="24"/>
+          <w:szCs w:val="24"/>
+        </w:rPr>
+        <w:t xml:space="preserve">Artificial intelligence is used in one clearly limited role: it proposes the route draft from checked candidates. It does not invent places or prices and cannot save a plan; code calculates the budget and validates the draft, and the user confirms it.</w:t>
       </w:r>
     </w:p>
     <w:p>
@@ -307,7 +338,7 @@
           <w:sz w:val="24"/>
           <w:szCs w:val="24"/>
         </w:rPr>
-        <w:t xml:space="preserve"> it is hard to estimate in advance how much the trip will cost per day and per person, and during the trip it is hard to track who paid for what.</w:t>
+        <w:t xml:space="preserve"> it is hard to estimate in advance how much the trip will cost per day and per person, and it is unclear how a change to the plan affects the total cost.</w:t>
       </w:r>
     </w:p>
     <w:p>
@@ -328,35 +359,6 @@
           <w:sz w:val="24"/>
           <w:szCs w:val="24"/>
         </w:rPr>
-        <w:t xml:space="preserve">Missing local events:</w:t>
-      </w:r>
-      <w:r>
-        <w:rPr>
-          <w:rFonts w:ascii="Times New Roman" w:cs="Times New Roman" w:eastAsia="Times New Roman" w:hAnsi="Times New Roman"/>
-          <w:sz w:val="24"/>
-          <w:szCs w:val="24"/>
-        </w:rPr>
-        <w:t xml:space="preserve"> travelers often learn about festivals, concerts or holidays only after they have already left the city.</w:t>
-      </w:r>
-    </w:p>
-    <w:p>
-      <w:pPr>
-        <w:pStyle w:val="ListParagraph"/>
-        <w:numPr>
-          <w:ilvl w:val="0"/>
-          <w:numId w:val="2"/>
-        </w:numPr>
-        <w:spacing w:after="80" w:line="300"/>
-        <w:jc w:val="both"/>
-      </w:pPr>
-      <w:r>
-        <w:rPr>
-          <w:rFonts w:ascii="Times New Roman" w:cs="Times New Roman" w:eastAsia="Times New Roman" w:hAnsi="Times New Roman"/>
-          <w:b/>
-          <w:bCs/>
-          <w:sz w:val="24"/>
-          <w:szCs w:val="24"/>
-        </w:rPr>
         <w:t xml:space="preserve">Lack of personalization:</w:t>
       </w:r>
       <w:r>
@@ -365,7 +367,7 @@
           <w:sz w:val="24"/>
           <w:szCs w:val="24"/>
         </w:rPr>
-        <w:t xml:space="preserve"> generic "top 10" lists do not take into account who is traveling (a family with children, a couple, a group of friends or a business traveler), their interests, or the weather.</w:t>
+        <w:t xml:space="preserve"> generic "top 10" lists do not take into account who is traveling (a family with children, a couple, a group of friends or a business traveler), or their interests.</w:t>
       </w:r>
     </w:p>
     <w:p>
@@ -420,7 +422,7 @@
           <w:sz w:val="24"/>
           <w:szCs w:val="24"/>
         </w:rPr>
-        <w:t xml:space="preserve">to design and develop a cross-platform mobile application (Android and iOS) with a web version that automatically generates a personalized, budget-aware, day-by-day trip plan and allows a group of travelers to plan the trip together.</w:t>
+        <w:t xml:space="preserve">to design, implement and evaluate a cross-platform application that lets a group create a trip to Astana, receive a grounded day-by-day route draft within an estimated budget, view it on a map, and edit and vote on the plan together.</w:t>
       </w:r>
     </w:p>
     <w:p>
@@ -453,7 +455,7 @@
           <w:sz w:val="24"/>
           <w:szCs w:val="24"/>
         </w:rPr>
-        <w:t xml:space="preserve">Analyze existing trip planning applications and identify their strengths and weaknesses.</w:t>
+        <w:t xml:space="preserve">Analyze existing trip planning applications and the relevant literature.</w:t>
       </w:r>
     </w:p>
     <w:p>
@@ -472,7 +474,7 @@
           <w:sz w:val="24"/>
           <w:szCs w:val="24"/>
         </w:rPr>
-        <w:t xml:space="preserve">Define the functional and non-functional requirements of the application.</w:t>
+        <w:t xml:space="preserve">Collect evidence of user needs through a survey of Astana residents.</w:t>
       </w:r>
     </w:p>
     <w:p>
@@ -491,7 +493,7 @@
           <w:sz w:val="24"/>
           <w:szCs w:val="24"/>
         </w:rPr>
-        <w:t xml:space="preserve">Design the system architecture and the database structure.</w:t>
+        <w:t xml:space="preserve">Define functional and non-functional requirements with acceptance criteria for the five MVP outcomes.</w:t>
       </w:r>
     </w:p>
     <w:p>
@@ -510,7 +512,7 @@
           <w:sz w:val="24"/>
           <w:szCs w:val="24"/>
         </w:rPr>
-        <w:t xml:space="preserve">Implement trip plan generation using AI, based on the user's input (destination, dates, number of people, budget, interests, trip type).</w:t>
+        <w:t xml:space="preserve">Design the architecture, the database and the main user scenario.</w:t>
       </w:r>
     </w:p>
     <w:p>
@@ -529,7 +531,7 @@
           <w:sz w:val="24"/>
           <w:szCs w:val="24"/>
         </w:rPr>
-        <w:t xml:space="preserve">Implement collaborative features such as invitations, voting, comments and optional expense splitting.</w:t>
+        <w:t xml:space="preserve">Implement the Flutter client, the Supabase backend, AI route-draft generation with code-based validation, budget calculation, the map, invitations, editing and voting.</w:t>
       </w:r>
     </w:p>
     <w:p>
@@ -548,26 +550,7 @@
           <w:sz w:val="24"/>
           <w:szCs w:val="24"/>
         </w:rPr>
-        <w:t xml:space="preserve">Integrate external services for maps, weather, events and booking links.</w:t>
-      </w:r>
-    </w:p>
-    <w:p>
-      <w:pPr>
-        <w:pStyle w:val="ListParagraph"/>
-        <w:numPr>
-          <w:ilvl w:val="0"/>
-          <w:numId w:val="3"/>
-        </w:numPr>
-        <w:spacing w:after="80" w:line="300"/>
-        <w:jc w:val="both"/>
-      </w:pPr>
-      <w:r>
-        <w:rPr>
-          <w:rFonts w:ascii="Times New Roman" w:cs="Times New Roman" w:eastAsia="Times New Roman" w:hAnsi="Times New Roman"/>
-          <w:sz w:val="24"/>
-          <w:szCs w:val="24"/>
-        </w:rPr>
-        <w:t xml:space="preserve">Test the application with real users and improve it based on their feedback.</w:t>
+        <w:t xml:space="preserve">Verify the application with acceptance, integration and usability tests.</w:t>
       </w:r>
     </w:p>
     <w:p>
@@ -989,7 +972,7 @@
                 <w:sz w:val="22"/>
                 <w:szCs w:val="22"/>
               </w:rPr>
-              <w:t xml:space="preserve">Yes</w:t>
+              <w:t xml:space="preserve">Yes (draft + confirm)</w:t>
             </w:r>
           </w:p>
         </w:tc>
@@ -1705,7 +1688,7 @@
                 <w:sz w:val="22"/>
                 <w:szCs w:val="22"/>
               </w:rPr>
-              <w:t xml:space="preserve">Yes (optional)</w:t>
+              <w:t xml:space="preserve">Deferred</w:t>
             </w:r>
           </w:p>
         </w:tc>
@@ -1884,7 +1867,7 @@
                 <w:sz w:val="22"/>
                 <w:szCs w:val="22"/>
               </w:rPr>
-              <w:t xml:space="preserve">Yes</w:t>
+              <w:t xml:space="preserve">Deferred</w:t>
             </w:r>
           </w:p>
         </w:tc>
@@ -2063,7 +2046,7 @@
                 <w:sz w:val="22"/>
                 <w:szCs w:val="22"/>
               </w:rPr>
-              <w:t xml:space="preserve">Yes</w:t>
+              <w:t xml:space="preserve">Deferred</w:t>
             </w:r>
           </w:p>
         </w:tc>
@@ -2242,7 +2225,7 @@
                 <w:sz w:val="22"/>
                 <w:szCs w:val="22"/>
               </w:rPr>
-              <w:t xml:space="preserve">Yes</w:t>
+              <w:t xml:space="preserve">Yes (Astana first)</w:t>
             </w:r>
           </w:p>
         </w:tc>
@@ -2260,7 +2243,7 @@
           <w:sz w:val="24"/>
           <w:szCs w:val="24"/>
         </w:rPr>
-        <w:t xml:space="preserve">As the table shows, most applications cover only one part of the process: either itinerary storage, maps, or expense sharing. Our application combines plan generation, collaboration and budget management, and pays special attention to local content (restaurants, events and attractions in Kazakhstan).</w:t>
+        <w:t xml:space="preserve">As the table shows, most applications cover only one part of the process: either itinerary storage, maps, or expense sharing. Our application combines plan generation, collaboration and budget management, and pays special attention to local content (places and prices in Astana). This table is a short summary; the detailed comparison with sources and screenshots is in docs/existing-system-comparison.docx.</w:t>
       </w:r>
     </w:p>
     <w:p>
@@ -2420,7 +2403,7 @@
           <w:sz w:val="24"/>
           <w:szCs w:val="24"/>
         </w:rPr>
-        <w:t xml:space="preserve">The quality of a trip plan depends on the quality of the places it recommends. Online ratings show what is popular, but local residents know which places are really worth visiting, which ones are overrated, and what a person should see when they come to the city for the first time. Therefore, before development, we are conducting a survey of Astana residents.</w:t>
+        <w:t xml:space="preserve">To ground the requirements and the initial place catalog in local knowledge, the team surveyed Astana residents with an online questionnaire in Russian and Kazakh. The analysis is in docs/research/survey-results.md; recommended places are listed in docs/research/resident-place-candidates.md.</w:t>
       </w:r>
     </w:p>
     <w:p>
@@ -2436,7 +2419,954 @@
           <w:sz w:val="24"/>
           <w:szCs w:val="24"/>
         </w:rPr>
-        <w:t xml:space="preserve">Goals of the survey:</w:t>
+        <w:t xml:space="preserve">Results (15 responses): </w:t>
+      </w:r>
+      <w:r>
+        <w:rPr>
+          <w:rFonts w:ascii="Times New Roman" w:cs="Times New Roman" w:eastAsia="Times New Roman" w:hAnsi="Times New Roman"/>
+          <w:sz w:val="24"/>
+          <w:szCs w:val="24"/>
+        </w:rPr>
+        <w:t xml:space="preserve">14 of 15 respondents named agreeing where to go as a difficulty of group trips, and 13 rated voting for places 4–5 out of 5; 14 rated automatic day-by-day plans 4–5; 7 named staying within the budget as a difficulty and 10 rated day-by-day budget distribution 4–5. Support for AI plan changes on request was mixed (7 rated it 5, six rated it 3).</w:t>
+      </w:r>
+    </w:p>
+    <w:p>
+      <w:pPr>
+        <w:spacing w:after="120" w:line="300"/>
+        <w:jc w:val="both"/>
+      </w:pPr>
+      <w:r>
+        <w:rPr>
+          <w:rFonts w:ascii="Times New Roman" w:cs="Times New Roman" w:eastAsia="Times New Roman" w:hAnsi="Times New Roman"/>
+          <w:b/>
+          <w:bCs/>
+          <w:sz w:val="24"/>
+          <w:szCs w:val="24"/>
+        </w:rPr>
+        <w:t xml:space="preserve">Limits: </w:t>
+      </w:r>
+      <w:r>
+        <w:rPr>
+          <w:rFonts w:ascii="Times New Roman" w:cs="Times New Roman" w:eastAsia="Times New Roman" w:hAnsi="Times New Roman"/>
+          <w:sz w:val="24"/>
+          <w:szCs w:val="24"/>
+        </w:rPr>
+        <w:t xml:space="preserve">the sample is small and not representative; the answers describe stated usefulness, not measured usability. Interviews were not used for this submission.</w:t>
+      </w:r>
+    </w:p>
+    <w:p>
+      <w:pPr>
+        <w:pStyle w:val="Heading1"/>
+        <w:spacing w:after="120" w:before="240"/>
+      </w:pPr>
+      <w:r>
+        <w:rPr>
+          <w:rFonts w:ascii="Times New Roman" w:cs="Times New Roman" w:eastAsia="Times New Roman" w:hAnsi="Times New Roman"/>
+          <w:b/>
+          <w:bCs/>
+          <w:color w:val="000000"/>
+          <w:sz w:val="28"/>
+          <w:szCs w:val="28"/>
+        </w:rPr>
+        <w:t xml:space="preserve">6. How the Application Works (MVP)</w:t>
+      </w:r>
+    </w:p>
+    <w:p>
+      <w:pPr>
+        <w:spacing w:after="120" w:line="300"/>
+        <w:jc w:val="both"/>
+      </w:pPr>
+      <w:r>
+        <w:rPr>
+          <w:rFonts w:ascii="Times New Roman" w:cs="Times New Roman" w:eastAsia="Times New Roman" w:hAnsi="Times New Roman"/>
+          <w:sz w:val="24"/>
+          <w:szCs w:val="24"/>
+        </w:rPr>
+        <w:t xml:space="preserve">The main scenario is: create a trip → receive and review a draft → confirm → view the budget and the map → invite participants, edit together and vote.</w:t>
+      </w:r>
+    </w:p>
+    <w:p>
+      <w:pPr>
+        <w:pStyle w:val="Heading2"/>
+        <w:spacing w:after="100" w:before="180"/>
+      </w:pPr>
+      <w:r>
+        <w:rPr>
+          <w:rFonts w:ascii="Times New Roman" w:cs="Times New Roman" w:eastAsia="Times New Roman" w:hAnsi="Times New Roman"/>
+          <w:b/>
+          <w:bCs/>
+          <w:color w:val="000000"/>
+          <w:sz w:val="24"/>
+          <w:szCs w:val="24"/>
+        </w:rPr>
+        <w:t xml:space="preserve">6.1 Creating a Trip (M1)</w:t>
+      </w:r>
+    </w:p>
+    <w:p>
+      <w:pPr>
+        <w:spacing w:after="120" w:line="300"/>
+        <w:jc w:val="both"/>
+      </w:pPr>
+      <w:r>
+        <w:rPr>
+          <w:rFonts w:ascii="Times New Roman" w:cs="Times New Roman" w:eastAsia="Times New Roman" w:hAnsi="Times New Roman"/>
+          <w:sz w:val="24"/>
+          <w:szCs w:val="24"/>
+        </w:rPr>
+        <w:t xml:space="preserve">The user enters the destination (Astana), inclusive travel dates, the number of travelers, the total budget in tenge, the trip type and interests (food, culture, nature, nightlife, shopping). Invalid values, such as reversed dates or a zero budget, are rejected with a message.</w:t>
+      </w:r>
+    </w:p>
+    <w:p>
+      <w:pPr>
+        <w:pStyle w:val="Heading2"/>
+        <w:spacing w:after="100" w:before="180"/>
+      </w:pPr>
+      <w:r>
+        <w:rPr>
+          <w:rFonts w:ascii="Times New Roman" w:cs="Times New Roman" w:eastAsia="Times New Roman" w:hAnsi="Times New Roman"/>
+          <w:b/>
+          <w:bCs/>
+          <w:color w:val="000000"/>
+          <w:sz w:val="24"/>
+          <w:szCs w:val="24"/>
+        </w:rPr>
+        <w:t xml:space="preserve">6.2 Generating and Confirming the Route Draft (M2)</w:t>
+      </w:r>
+    </w:p>
+    <w:p>
+      <w:pPr>
+        <w:spacing w:after="120" w:line="300"/>
+        <w:jc w:val="both"/>
+      </w:pPr>
+      <w:r>
+        <w:rPr>
+          <w:rFonts w:ascii="Times New Roman" w:cs="Times New Roman" w:eastAsia="Times New Roman" w:hAnsi="Times New Roman"/>
+          <w:sz w:val="24"/>
+          <w:szCs w:val="24"/>
+        </w:rPr>
+        <w:t xml:space="preserve">The application selects eligible places from a curated Astana catalog (open on the planned dates, matching the interests, with a checked price) and asks the AI model to arrange them into a day-by-day draft. The draft contains catalog IDs, dates and time slots only. Code calculates its cost and checks that every place exists, fits the schedule and has a known price. The user reviews the draft and its checks: Cancel discards it, Confirm sends it to the server, which rechecks permissions, data and the current version before saving it.</w:t>
+      </w:r>
+    </w:p>
+    <w:p>
+      <w:pPr>
+        <w:pStyle w:val="Heading2"/>
+        <w:spacing w:after="100" w:before="180"/>
+      </w:pPr>
+      <w:r>
+        <w:rPr>
+          <w:rFonts w:ascii="Times New Roman" w:cs="Times New Roman" w:eastAsia="Times New Roman" w:hAnsi="Times New Roman"/>
+          <w:b/>
+          <w:bCs/>
+          <w:color w:val="000000"/>
+          <w:sz w:val="24"/>
+          <w:szCs w:val="24"/>
+        </w:rPr>
+        <w:t xml:space="preserve">6.3 Budget (M3)</w:t>
+      </w:r>
+    </w:p>
+    <w:p>
+      <w:pPr>
+        <w:spacing w:after="120" w:line="300"/>
+        <w:jc w:val="both"/>
+      </w:pPr>
+      <w:r>
+        <w:rPr>
+          <w:rFonts w:ascii="Times New Roman" w:cs="Times New Roman" w:eastAsia="Times New Roman" w:hAnsi="Times New Roman"/>
+          <w:sz w:val="24"/>
+          <w:szCs w:val="24"/>
+        </w:rPr>
+        <w:t xml:space="preserve">The plan shows the estimated cost by day, by category (accommodation, meals, activities, local transport) and for the whole trip, together with the remaining budget. The budget is an estimate for the whole group; it is not a record of actual payments. Unknown prices are shown as missing data and are never counted as zero. Every edit is recalculated before it is saved.</w:t>
+      </w:r>
+    </w:p>
+    <w:p>
+      <w:pPr>
+        <w:pStyle w:val="Heading2"/>
+        <w:spacing w:after="100" w:before="180"/>
+      </w:pPr>
+      <w:r>
+        <w:rPr>
+          <w:rFonts w:ascii="Times New Roman" w:cs="Times New Roman" w:eastAsia="Times New Roman" w:hAnsi="Times New Roman"/>
+          <w:b/>
+          <w:bCs/>
+          <w:color w:val="000000"/>
+          <w:sz w:val="24"/>
+          <w:szCs w:val="24"/>
+        </w:rPr>
+        <w:t xml:space="preserve">6.4 Map (M4)</w:t>
+      </w:r>
+    </w:p>
+    <w:p>
+      <w:pPr>
+        <w:spacing w:after="120" w:line="300"/>
+        <w:jc w:val="both"/>
+      </w:pPr>
+      <w:r>
+        <w:rPr>
+          <w:rFonts w:ascii="Times New Roman" w:cs="Times New Roman" w:eastAsia="Times New Roman" w:hAnsi="Times New Roman"/>
+          <w:sz w:val="24"/>
+          <w:szCs w:val="24"/>
+        </w:rPr>
+        <w:t xml:space="preserve">The selected day is shown on a map with the places in visiting order and the travel time between them. The list and the map always show the same day and plan version. If the route provider fails, the list remains readable and the error is shown.</w:t>
+      </w:r>
+    </w:p>
+    <w:p>
+      <w:pPr>
+        <w:pStyle w:val="Heading2"/>
+        <w:spacing w:after="100" w:before="180"/>
+      </w:pPr>
+      <w:r>
+        <w:rPr>
+          <w:rFonts w:ascii="Times New Roman" w:cs="Times New Roman" w:eastAsia="Times New Roman" w:hAnsi="Times New Roman"/>
+          <w:b/>
+          <w:bCs/>
+          <w:color w:val="000000"/>
+          <w:sz w:val="24"/>
+          <w:szCs w:val="24"/>
+        </w:rPr>
+        <w:t xml:space="preserve">6.5 Planning Together (M5)</w:t>
+      </w:r>
+    </w:p>
+    <w:p>
+      <w:pPr>
+        <w:spacing w:after="120" w:line="300"/>
+        <w:jc w:val="both"/>
+      </w:pPr>
+      <w:r>
+        <w:rPr>
+          <w:rFonts w:ascii="Times New Roman" w:cs="Times New Roman" w:eastAsia="Times New Roman" w:hAnsi="Times New Roman"/>
+          <w:sz w:val="24"/>
+          <w:szCs w:val="24"/>
+        </w:rPr>
+        <w:t xml:space="preserve">The trip owner invites friends by code or link; they join as editors. Editors can add, remove, replace or reorder items with a budget preview, and every participant can vote for or against each item. Saves are versioned: if someone saved a newer version first, a conflicting change is rejected and the user is asked to refresh, so no change is silently overwritten.</w:t>
+      </w:r>
+    </w:p>
+    <w:p>
+      <w:pPr>
+        <w:pStyle w:val="Heading2"/>
+        <w:spacing w:after="100" w:before="180"/>
+      </w:pPr>
+      <w:r>
+        <w:rPr>
+          <w:rFonts w:ascii="Times New Roman" w:cs="Times New Roman" w:eastAsia="Times New Roman" w:hAnsi="Times New Roman"/>
+          <w:b/>
+          <w:bCs/>
+          <w:color w:val="000000"/>
+          <w:sz w:val="24"/>
+          <w:szCs w:val="24"/>
+        </w:rPr>
+        <w:t xml:space="preserve">6.6 Example</w:t>
+      </w:r>
+    </w:p>
+    <w:p>
+      <w:pPr>
+        <w:spacing w:after="120" w:line="300"/>
+        <w:jc w:val="both"/>
+      </w:pPr>
+      <w:r>
+        <w:rPr>
+          <w:rFonts w:ascii="Times New Roman" w:cs="Times New Roman" w:eastAsia="Times New Roman" w:hAnsi="Times New Roman"/>
+          <w:sz w:val="24"/>
+          <w:szCs w:val="24"/>
+        </w:rPr>
+        <w:t xml:space="preserve">Four friends plan a trip to Astana from 3 to 6 November with a budget of 400,000 tenge. The application proposes a draft with lunch at a restaurant with national cuisine, Baiterek and a guided tour of the Astana Opera on the first day, and lodging for three nights. The draft's estimated total is shown before saving. After confirmation, one friend replaces an item with a cheaper museum visit; the preview shows the new day and trip totals, and the group votes on the remaining items. (Places and amounts are illustrative.)</w:t>
+      </w:r>
+    </w:p>
+    <w:p>
+      <w:pPr>
+        <w:pStyle w:val="Heading1"/>
+        <w:spacing w:after="120" w:before="240"/>
+      </w:pPr>
+      <w:r>
+        <w:rPr>
+          <w:rFonts w:ascii="Times New Roman" w:cs="Times New Roman" w:eastAsia="Times New Roman" w:hAnsi="Times New Roman"/>
+          <w:b/>
+          <w:bCs/>
+          <w:color w:val="000000"/>
+          <w:sz w:val="28"/>
+          <w:szCs w:val="28"/>
+        </w:rPr>
+        <w:t xml:space="preserve">7. Features</w:t>
+      </w:r>
+    </w:p>
+    <w:p>
+      <w:pPr>
+        <w:pStyle w:val="Heading2"/>
+        <w:spacing w:after="100" w:before="180"/>
+      </w:pPr>
+      <w:r>
+        <w:rPr>
+          <w:rFonts w:ascii="Times New Roman" w:cs="Times New Roman" w:eastAsia="Times New Roman" w:hAnsi="Times New Roman"/>
+          <w:b/>
+          <w:bCs/>
+          <w:color w:val="000000"/>
+          <w:sz w:val="24"/>
+          <w:szCs w:val="24"/>
+        </w:rPr>
+        <w:t xml:space="preserve">7.1 Mandatory MVP Features</w:t>
+      </w:r>
+    </w:p>
+    <w:tbl>
+      <w:tblPr>
+        <w:tblW w:type="dxa" w:w="9026"/>
+        <w:tblBorders>
+          <w:top w:val="single" w:color="auto" w:sz="4"/>
+          <w:left w:val="single" w:color="auto" w:sz="4"/>
+          <w:bottom w:val="single" w:color="auto" w:sz="4"/>
+          <w:right w:val="single" w:color="auto" w:sz="4"/>
+          <w:insideH w:val="single" w:color="auto" w:sz="4"/>
+          <w:insideV w:val="single" w:color="auto" w:sz="4"/>
+        </w:tblBorders>
+      </w:tblPr>
+      <w:tblGrid>
+        <w:gridCol w:w="2200"/>
+        <w:gridCol w:w="5226"/>
+        <w:gridCol w:w="1600"/>
+      </w:tblGrid>
+      <w:tr>
+        <w:trPr>
+          <w:tblHeader/>
+        </w:trPr>
+        <w:tc>
+          <w:tcPr>
+            <w:tcW w:type="dxa" w:w="2200"/>
+            <w:tcBorders>
+              <w:top w:val="single" w:color="000000" w:sz="4"/>
+              <w:left w:val="single" w:color="000000" w:sz="4"/>
+              <w:bottom w:val="single" w:color="000000" w:sz="4"/>
+              <w:right w:val="single" w:color="000000" w:sz="4"/>
+            </w:tcBorders>
+            <w:tcMar>
+              <w:top w:type="dxa" w:w="60"/>
+              <w:left w:type="dxa" w:w="100"/>
+              <w:bottom w:type="dxa" w:w="60"/>
+              <w:right w:type="dxa" w:w="100"/>
+            </w:tcMar>
+          </w:tcPr>
+          <w:p>
+            <w:r>
+              <w:rPr>
+                <w:rFonts w:ascii="Times New Roman" w:cs="Times New Roman" w:eastAsia="Times New Roman" w:hAnsi="Times New Roman"/>
+                <w:b/>
+                <w:bCs/>
+                <w:sz w:val="22"/>
+                <w:szCs w:val="22"/>
+              </w:rPr>
+              <w:t xml:space="preserve">MVP outcome</w:t>
+            </w:r>
+          </w:p>
+        </w:tc>
+        <w:tc>
+          <w:tcPr>
+            <w:tcW w:type="dxa" w:w="5226"/>
+            <w:tcBorders>
+              <w:top w:val="single" w:color="000000" w:sz="4"/>
+              <w:left w:val="single" w:color="000000" w:sz="4"/>
+              <w:bottom w:val="single" w:color="000000" w:sz="4"/>
+              <w:right w:val="single" w:color="000000" w:sz="4"/>
+            </w:tcBorders>
+            <w:tcMar>
+              <w:top w:type="dxa" w:w="60"/>
+              <w:left w:type="dxa" w:w="100"/>
+              <w:bottom w:type="dxa" w:w="60"/>
+              <w:right w:type="dxa" w:w="100"/>
+            </w:tcMar>
+          </w:tcPr>
+          <w:p>
+            <w:r>
+              <w:rPr>
+                <w:rFonts w:ascii="Times New Roman" w:cs="Times New Roman" w:eastAsia="Times New Roman" w:hAnsi="Times New Roman"/>
+                <w:b/>
+                <w:bCs/>
+                <w:sz w:val="22"/>
+                <w:szCs w:val="22"/>
+              </w:rPr>
+              <w:t xml:space="preserve">What the user can do</w:t>
+            </w:r>
+          </w:p>
+        </w:tc>
+        <w:tc>
+          <w:tcPr>
+            <w:tcW w:type="dxa" w:w="1600"/>
+            <w:tcBorders>
+              <w:top w:val="single" w:color="000000" w:sz="4"/>
+              <w:left w:val="single" w:color="000000" w:sz="4"/>
+              <w:bottom w:val="single" w:color="000000" w:sz="4"/>
+              <w:right w:val="single" w:color="000000" w:sz="4"/>
+            </w:tcBorders>
+            <w:tcMar>
+              <w:top w:type="dxa" w:w="60"/>
+              <w:left w:type="dxa" w:w="100"/>
+              <w:bottom w:type="dxa" w:w="60"/>
+              <w:right w:type="dxa" w:w="100"/>
+            </w:tcMar>
+          </w:tcPr>
+          <w:p>
+            <w:r>
+              <w:rPr>
+                <w:rFonts w:ascii="Times New Roman" w:cs="Times New Roman" w:eastAsia="Times New Roman" w:hAnsi="Times New Roman"/>
+                <w:b/>
+                <w:bCs/>
+                <w:sz w:val="22"/>
+                <w:szCs w:val="22"/>
+              </w:rPr>
+              <w:t xml:space="preserve">Requirements</w:t>
+            </w:r>
+          </w:p>
+        </w:tc>
+      </w:tr>
+      <w:tr>
+        <w:trPr>
+          <w:tblHeader w:val="false"/>
+        </w:trPr>
+        <w:tc>
+          <w:tcPr>
+            <w:tcW w:type="dxa" w:w="2200"/>
+            <w:tcBorders>
+              <w:top w:val="single" w:color="000000" w:sz="4"/>
+              <w:left w:val="single" w:color="000000" w:sz="4"/>
+              <w:bottom w:val="single" w:color="000000" w:sz="4"/>
+              <w:right w:val="single" w:color="000000" w:sz="4"/>
+            </w:tcBorders>
+            <w:tcMar>
+              <w:top w:type="dxa" w:w="60"/>
+              <w:left w:type="dxa" w:w="100"/>
+              <w:bottom w:type="dxa" w:w="60"/>
+              <w:right w:type="dxa" w:w="100"/>
+            </w:tcMar>
+          </w:tcPr>
+          <w:p>
+            <w:r>
+              <w:rPr>
+                <w:rFonts w:ascii="Times New Roman" w:cs="Times New Roman" w:eastAsia="Times New Roman" w:hAnsi="Times New Roman"/>
+                <w:b w:val="false"/>
+                <w:bCs w:val="false"/>
+                <w:sz w:val="22"/>
+                <w:szCs w:val="22"/>
+              </w:rPr>
+              <w:t xml:space="preserve">M1 Create a trip</w:t>
+            </w:r>
+          </w:p>
+        </w:tc>
+        <w:tc>
+          <w:tcPr>
+            <w:tcW w:type="dxa" w:w="5226"/>
+            <w:tcBorders>
+              <w:top w:val="single" w:color="000000" w:sz="4"/>
+              <w:left w:val="single" w:color="000000" w:sz="4"/>
+              <w:bottom w:val="single" w:color="000000" w:sz="4"/>
+              <w:right w:val="single" w:color="000000" w:sz="4"/>
+            </w:tcBorders>
+            <w:tcMar>
+              <w:top w:type="dxa" w:w="60"/>
+              <w:left w:type="dxa" w:w="100"/>
+              <w:bottom w:type="dxa" w:w="60"/>
+              <w:right w:type="dxa" w:w="100"/>
+            </w:tcMar>
+          </w:tcPr>
+          <w:p>
+            <w:r>
+              <w:rPr>
+                <w:rFonts w:ascii="Times New Roman" w:cs="Times New Roman" w:eastAsia="Times New Roman" w:hAnsi="Times New Roman"/>
+                <w:b w:val="false"/>
+                <w:bCs w:val="false"/>
+                <w:sz w:val="22"/>
+                <w:szCs w:val="22"/>
+              </w:rPr>
+              <w:t xml:space="preserve">Enter Astana dates, traveler count, interests and an estimated budget; invalid input is rejected.</w:t>
+            </w:r>
+          </w:p>
+        </w:tc>
+        <w:tc>
+          <w:tcPr>
+            <w:tcW w:type="dxa" w:w="1600"/>
+            <w:tcBorders>
+              <w:top w:val="single" w:color="000000" w:sz="4"/>
+              <w:left w:val="single" w:color="000000" w:sz="4"/>
+              <w:bottom w:val="single" w:color="000000" w:sz="4"/>
+              <w:right w:val="single" w:color="000000" w:sz="4"/>
+            </w:tcBorders>
+            <w:tcMar>
+              <w:top w:type="dxa" w:w="60"/>
+              <w:left w:type="dxa" w:w="100"/>
+              <w:bottom w:type="dxa" w:w="60"/>
+              <w:right w:type="dxa" w:w="100"/>
+            </w:tcMar>
+          </w:tcPr>
+          <w:p>
+            <w:r>
+              <w:rPr>
+                <w:rFonts w:ascii="Times New Roman" w:cs="Times New Roman" w:eastAsia="Times New Roman" w:hAnsi="Times New Roman"/>
+                <w:b w:val="false"/>
+                <w:bCs w:val="false"/>
+                <w:sz w:val="22"/>
+                <w:szCs w:val="22"/>
+              </w:rPr>
+              <w:t xml:space="preserve">FR-01/02</w:t>
+            </w:r>
+          </w:p>
+        </w:tc>
+      </w:tr>
+      <w:tr>
+        <w:trPr>
+          <w:tblHeader w:val="false"/>
+        </w:trPr>
+        <w:tc>
+          <w:tcPr>
+            <w:tcW w:type="dxa" w:w="2200"/>
+            <w:tcBorders>
+              <w:top w:val="single" w:color="000000" w:sz="4"/>
+              <w:left w:val="single" w:color="000000" w:sz="4"/>
+              <w:bottom w:val="single" w:color="000000" w:sz="4"/>
+              <w:right w:val="single" w:color="000000" w:sz="4"/>
+            </w:tcBorders>
+            <w:tcMar>
+              <w:top w:type="dxa" w:w="60"/>
+              <w:left w:type="dxa" w:w="100"/>
+              <w:bottom w:type="dxa" w:w="60"/>
+              <w:right w:type="dxa" w:w="100"/>
+            </w:tcMar>
+          </w:tcPr>
+          <w:p>
+            <w:r>
+              <w:rPr>
+                <w:rFonts w:ascii="Times New Roman" w:cs="Times New Roman" w:eastAsia="Times New Roman" w:hAnsi="Times New Roman"/>
+                <w:b w:val="false"/>
+                <w:bCs w:val="false"/>
+                <w:sz w:val="22"/>
+                <w:szCs w:val="22"/>
+              </w:rPr>
+              <w:t xml:space="preserve">M2 Generate a route</w:t>
+            </w:r>
+          </w:p>
+        </w:tc>
+        <w:tc>
+          <w:tcPr>
+            <w:tcW w:type="dxa" w:w="5226"/>
+            <w:tcBorders>
+              <w:top w:val="single" w:color="000000" w:sz="4"/>
+              <w:left w:val="single" w:color="000000" w:sz="4"/>
+              <w:bottom w:val="single" w:color="000000" w:sz="4"/>
+              <w:right w:val="single" w:color="000000" w:sz="4"/>
+            </w:tcBorders>
+            <w:tcMar>
+              <w:top w:type="dxa" w:w="60"/>
+              <w:left w:type="dxa" w:w="100"/>
+              <w:bottom w:type="dxa" w:w="60"/>
+              <w:right w:type="dxa" w:w="100"/>
+            </w:tcMar>
+          </w:tcPr>
+          <w:p>
+            <w:r>
+              <w:rPr>
+                <w:rFonts w:ascii="Times New Roman" w:cs="Times New Roman" w:eastAsia="Times New Roman" w:hAnsi="Times New Roman"/>
+                <w:b w:val="false"/>
+                <w:bCs w:val="false"/>
+                <w:sz w:val="22"/>
+                <w:szCs w:val="22"/>
+              </w:rPr>
+              <w:t xml:space="preserve">Receive a grounded itinerary draft from checked catalog places, inspect it and explicitly confirm a valid plan.</w:t>
+            </w:r>
+          </w:p>
+        </w:tc>
+        <w:tc>
+          <w:tcPr>
+            <w:tcW w:type="dxa" w:w="1600"/>
+            <w:tcBorders>
+              <w:top w:val="single" w:color="000000" w:sz="4"/>
+              <w:left w:val="single" w:color="000000" w:sz="4"/>
+              <w:bottom w:val="single" w:color="000000" w:sz="4"/>
+              <w:right w:val="single" w:color="000000" w:sz="4"/>
+            </w:tcBorders>
+            <w:tcMar>
+              <w:top w:type="dxa" w:w="60"/>
+              <w:left w:type="dxa" w:w="100"/>
+              <w:bottom w:type="dxa" w:w="60"/>
+              <w:right w:type="dxa" w:w="100"/>
+            </w:tcMar>
+          </w:tcPr>
+          <w:p>
+            <w:r>
+              <w:rPr>
+                <w:rFonts w:ascii="Times New Roman" w:cs="Times New Roman" w:eastAsia="Times New Roman" w:hAnsi="Times New Roman"/>
+                <w:b w:val="false"/>
+                <w:bCs w:val="false"/>
+                <w:sz w:val="22"/>
+                <w:szCs w:val="22"/>
+              </w:rPr>
+              <w:t xml:space="preserve">FR-03/04</w:t>
+            </w:r>
+          </w:p>
+        </w:tc>
+      </w:tr>
+      <w:tr>
+        <w:trPr>
+          <w:tblHeader w:val="false"/>
+        </w:trPr>
+        <w:tc>
+          <w:tcPr>
+            <w:tcW w:type="dxa" w:w="2200"/>
+            <w:tcBorders>
+              <w:top w:val="single" w:color="000000" w:sz="4"/>
+              <w:left w:val="single" w:color="000000" w:sz="4"/>
+              <w:bottom w:val="single" w:color="000000" w:sz="4"/>
+              <w:right w:val="single" w:color="000000" w:sz="4"/>
+            </w:tcBorders>
+            <w:tcMar>
+              <w:top w:type="dxa" w:w="60"/>
+              <w:left w:type="dxa" w:w="100"/>
+              <w:bottom w:type="dxa" w:w="60"/>
+              <w:right w:type="dxa" w:w="100"/>
+            </w:tcMar>
+          </w:tcPr>
+          <w:p>
+            <w:r>
+              <w:rPr>
+                <w:rFonts w:ascii="Times New Roman" w:cs="Times New Roman" w:eastAsia="Times New Roman" w:hAnsi="Times New Roman"/>
+                <w:b w:val="false"/>
+                <w:bCs w:val="false"/>
+                <w:sz w:val="22"/>
+                <w:szCs w:val="22"/>
+              </w:rPr>
+              <w:t xml:space="preserve">M3 Budget the plan</w:t>
+            </w:r>
+          </w:p>
+        </w:tc>
+        <w:tc>
+          <w:tcPr>
+            <w:tcW w:type="dxa" w:w="5226"/>
+            <w:tcBorders>
+              <w:top w:val="single" w:color="000000" w:sz="4"/>
+              <w:left w:val="single" w:color="000000" w:sz="4"/>
+              <w:bottom w:val="single" w:color="000000" w:sz="4"/>
+              <w:right w:val="single" w:color="000000" w:sz="4"/>
+            </w:tcBorders>
+            <w:tcMar>
+              <w:top w:type="dxa" w:w="60"/>
+              <w:left w:type="dxa" w:w="100"/>
+              <w:bottom w:type="dxa" w:w="60"/>
+              <w:right w:type="dxa" w:w="100"/>
+            </w:tcMar>
+          </w:tcPr>
+          <w:p>
+            <w:r>
+              <w:rPr>
+                <w:rFonts w:ascii="Times New Roman" w:cs="Times New Roman" w:eastAsia="Times New Roman" w:hAnsi="Times New Roman"/>
+                <w:b w:val="false"/>
+                <w:bCs w:val="false"/>
+                <w:sz w:val="22"/>
+                <w:szCs w:val="22"/>
+              </w:rPr>
+              <w:t xml:space="preserve">See daily, category and whole-trip estimates and the remaining budget; edits trigger recalculation.</w:t>
+            </w:r>
+          </w:p>
+        </w:tc>
+        <w:tc>
+          <w:tcPr>
+            <w:tcW w:type="dxa" w:w="1600"/>
+            <w:tcBorders>
+              <w:top w:val="single" w:color="000000" w:sz="4"/>
+              <w:left w:val="single" w:color="000000" w:sz="4"/>
+              <w:bottom w:val="single" w:color="000000" w:sz="4"/>
+              <w:right w:val="single" w:color="000000" w:sz="4"/>
+            </w:tcBorders>
+            <w:tcMar>
+              <w:top w:type="dxa" w:w="60"/>
+              <w:left w:type="dxa" w:w="100"/>
+              <w:bottom w:type="dxa" w:w="60"/>
+              <w:right w:type="dxa" w:w="100"/>
+            </w:tcMar>
+          </w:tcPr>
+          <w:p>
+            <w:r>
+              <w:rPr>
+                <w:rFonts w:ascii="Times New Roman" w:cs="Times New Roman" w:eastAsia="Times New Roman" w:hAnsi="Times New Roman"/>
+                <w:b w:val="false"/>
+                <w:bCs w:val="false"/>
+                <w:sz w:val="22"/>
+                <w:szCs w:val="22"/>
+              </w:rPr>
+              <w:t xml:space="preserve">FR-06</w:t>
+            </w:r>
+          </w:p>
+        </w:tc>
+      </w:tr>
+      <w:tr>
+        <w:trPr>
+          <w:tblHeader w:val="false"/>
+        </w:trPr>
+        <w:tc>
+          <w:tcPr>
+            <w:tcW w:type="dxa" w:w="2200"/>
+            <w:tcBorders>
+              <w:top w:val="single" w:color="000000" w:sz="4"/>
+              <w:left w:val="single" w:color="000000" w:sz="4"/>
+              <w:bottom w:val="single" w:color="000000" w:sz="4"/>
+              <w:right w:val="single" w:color="000000" w:sz="4"/>
+            </w:tcBorders>
+            <w:tcMar>
+              <w:top w:type="dxa" w:w="60"/>
+              <w:left w:type="dxa" w:w="100"/>
+              <w:bottom w:type="dxa" w:w="60"/>
+              <w:right w:type="dxa" w:w="100"/>
+            </w:tcMar>
+          </w:tcPr>
+          <w:p>
+            <w:r>
+              <w:rPr>
+                <w:rFonts w:ascii="Times New Roman" w:cs="Times New Roman" w:eastAsia="Times New Roman" w:hAnsi="Times New Roman"/>
+                <w:b w:val="false"/>
+                <w:bCs w:val="false"/>
+                <w:sz w:val="22"/>
+                <w:szCs w:val="22"/>
+              </w:rPr>
+              <w:t xml:space="preserve">M4 View the map</w:t>
+            </w:r>
+          </w:p>
+        </w:tc>
+        <w:tc>
+          <w:tcPr>
+            <w:tcW w:type="dxa" w:w="5226"/>
+            <w:tcBorders>
+              <w:top w:val="single" w:color="000000" w:sz="4"/>
+              <w:left w:val="single" w:color="000000" w:sz="4"/>
+              <w:bottom w:val="single" w:color="000000" w:sz="4"/>
+              <w:right w:val="single" w:color="000000" w:sz="4"/>
+            </w:tcBorders>
+            <w:tcMar>
+              <w:top w:type="dxa" w:w="60"/>
+              <w:left w:type="dxa" w:w="100"/>
+              <w:bottom w:type="dxa" w:w="60"/>
+              <w:right w:type="dxa" w:w="100"/>
+            </w:tcMar>
+          </w:tcPr>
+          <w:p>
+            <w:r>
+              <w:rPr>
+                <w:rFonts w:ascii="Times New Roman" w:cs="Times New Roman" w:eastAsia="Times New Roman" w:hAnsi="Times New Roman"/>
+                <w:b w:val="false"/>
+                <w:bCs w:val="false"/>
+                <w:sz w:val="22"/>
+                <w:szCs w:val="22"/>
+              </w:rPr>
+              <w:t xml:space="preserve">See the same selected day and ordered catalog places on the map; provider failures remain visible.</w:t>
+            </w:r>
+          </w:p>
+        </w:tc>
+        <w:tc>
+          <w:tcPr>
+            <w:tcW w:type="dxa" w:w="1600"/>
+            <w:tcBorders>
+              <w:top w:val="single" w:color="000000" w:sz="4"/>
+              <w:left w:val="single" w:color="000000" w:sz="4"/>
+              <w:bottom w:val="single" w:color="000000" w:sz="4"/>
+              <w:right w:val="single" w:color="000000" w:sz="4"/>
+            </w:tcBorders>
+            <w:tcMar>
+              <w:top w:type="dxa" w:w="60"/>
+              <w:left w:type="dxa" w:w="100"/>
+              <w:bottom w:type="dxa" w:w="60"/>
+              <w:right w:type="dxa" w:w="100"/>
+            </w:tcMar>
+          </w:tcPr>
+          <w:p>
+            <w:r>
+              <w:rPr>
+                <w:rFonts w:ascii="Times New Roman" w:cs="Times New Roman" w:eastAsia="Times New Roman" w:hAnsi="Times New Roman"/>
+                <w:b w:val="false"/>
+                <w:bCs w:val="false"/>
+                <w:sz w:val="22"/>
+                <w:szCs w:val="22"/>
+              </w:rPr>
+              <w:t xml:space="preserve">FR-07</w:t>
+            </w:r>
+          </w:p>
+        </w:tc>
+      </w:tr>
+      <w:tr>
+        <w:trPr>
+          <w:tblHeader w:val="false"/>
+        </w:trPr>
+        <w:tc>
+          <w:tcPr>
+            <w:tcW w:type="dxa" w:w="2200"/>
+            <w:tcBorders>
+              <w:top w:val="single" w:color="000000" w:sz="4"/>
+              <w:left w:val="single" w:color="000000" w:sz="4"/>
+              <w:bottom w:val="single" w:color="000000" w:sz="4"/>
+              <w:right w:val="single" w:color="000000" w:sz="4"/>
+            </w:tcBorders>
+            <w:tcMar>
+              <w:top w:type="dxa" w:w="60"/>
+              <w:left w:type="dxa" w:w="100"/>
+              <w:bottom w:type="dxa" w:w="60"/>
+              <w:right w:type="dxa" w:w="100"/>
+            </w:tcMar>
+          </w:tcPr>
+          <w:p>
+            <w:r>
+              <w:rPr>
+                <w:rFonts w:ascii="Times New Roman" w:cs="Times New Roman" w:eastAsia="Times New Roman" w:hAnsi="Times New Roman"/>
+                <w:b w:val="false"/>
+                <w:bCs w:val="false"/>
+                <w:sz w:val="22"/>
+                <w:szCs w:val="22"/>
+              </w:rPr>
+              <w:t xml:space="preserve">M5 Plan together</w:t>
+            </w:r>
+          </w:p>
+        </w:tc>
+        <w:tc>
+          <w:tcPr>
+            <w:tcW w:type="dxa" w:w="5226"/>
+            <w:tcBorders>
+              <w:top w:val="single" w:color="000000" w:sz="4"/>
+              <w:left w:val="single" w:color="000000" w:sz="4"/>
+              <w:bottom w:val="single" w:color="000000" w:sz="4"/>
+              <w:right w:val="single" w:color="000000" w:sz="4"/>
+            </w:tcBorders>
+            <w:tcMar>
+              <w:top w:type="dxa" w:w="60"/>
+              <w:left w:type="dxa" w:w="100"/>
+              <w:bottom w:type="dxa" w:w="60"/>
+              <w:right w:type="dxa" w:w="100"/>
+            </w:tcMar>
+          </w:tcPr>
+          <w:p>
+            <w:r>
+              <w:rPr>
+                <w:rFonts w:ascii="Times New Roman" w:cs="Times New Roman" w:eastAsia="Times New Roman" w:hAnsi="Times New Roman"/>
+                <w:b w:val="false"/>
+                <w:bCs w:val="false"/>
+                <w:sz w:val="22"/>
+                <w:szCs w:val="22"/>
+              </w:rPr>
+              <w:t xml:space="preserve">Invite a participant, edit the shared plan and vote on itinerary items; stale writes do not overwrite changes.</w:t>
+            </w:r>
+          </w:p>
+        </w:tc>
+        <w:tc>
+          <w:tcPr>
+            <w:tcW w:type="dxa" w:w="1600"/>
+            <w:tcBorders>
+              <w:top w:val="single" w:color="000000" w:sz="4"/>
+              <w:left w:val="single" w:color="000000" w:sz="4"/>
+              <w:bottom w:val="single" w:color="000000" w:sz="4"/>
+              <w:right w:val="single" w:color="000000" w:sz="4"/>
+            </w:tcBorders>
+            <w:tcMar>
+              <w:top w:type="dxa" w:w="60"/>
+              <w:left w:type="dxa" w:w="100"/>
+              <w:bottom w:type="dxa" w:w="60"/>
+              <w:right w:type="dxa" w:w="100"/>
+            </w:tcMar>
+          </w:tcPr>
+          <w:p>
+            <w:r>
+              <w:rPr>
+                <w:rFonts w:ascii="Times New Roman" w:cs="Times New Roman" w:eastAsia="Times New Roman" w:hAnsi="Times New Roman"/>
+                <w:b w:val="false"/>
+                <w:bCs w:val="false"/>
+                <w:sz w:val="22"/>
+                <w:szCs w:val="22"/>
+              </w:rPr>
+              <w:t xml:space="preserve">FR-05/08/09</w:t>
+            </w:r>
+          </w:p>
+        </w:tc>
+      </w:tr>
+    </w:tbl>
+    <w:p/>
+    <w:p>
+      <w:pPr>
+        <w:spacing w:after="120" w:line="300"/>
+        <w:jc w:val="both"/>
+      </w:pPr>
+      <w:r>
+        <w:rPr>
+          <w:rFonts w:ascii="Times New Roman" w:cs="Times New Roman" w:eastAsia="Times New Roman" w:hAnsi="Times New Roman"/>
+          <w:sz w:val="24"/>
+          <w:szCs w:val="24"/>
+        </w:rPr>
+        <w:t xml:space="preserve">Authentication, a curated place catalog, access checks, validation and persistence support these five outcomes; they are not separate headline features.</w:t>
+      </w:r>
+    </w:p>
+    <w:p>
+      <w:pPr>
+        <w:pStyle w:val="Heading2"/>
+        <w:spacing w:after="100" w:before="180"/>
+      </w:pPr>
+      <w:r>
+        <w:rPr>
+          <w:rFonts w:ascii="Times New Roman" w:cs="Times New Roman" w:eastAsia="Times New Roman" w:hAnsi="Times New Roman"/>
+          <w:b/>
+          <w:bCs/>
+          <w:color w:val="000000"/>
+          <w:sz w:val="24"/>
+          <w:szCs w:val="24"/>
+        </w:rPr>
+        <w:t xml:space="preserve">7.2 Deferred Features</w:t>
+      </w:r>
+    </w:p>
+    <w:p>
+      <w:pPr>
+        <w:spacing w:after="120" w:line="300"/>
+        <w:jc w:val="both"/>
+      </w:pPr>
+      <w:r>
+        <w:rPr>
+          <w:rFonts w:ascii="Times New Roman" w:cs="Times New Roman" w:eastAsia="Times New Roman" w:hAnsi="Times New Roman"/>
+          <w:sz w:val="24"/>
+          <w:szCs w:val="24"/>
+        </w:rPr>
+        <w:t xml:space="preserve">The following features from the earlier version are deferred after the supervisor's feedback and are not MVP release requirements: trip chat, item comments, the community feed and moderation, the conversational AI assistant, actual expense splitting and debts, weather and events, offline access and booking links. Their existing designs and wireframes are kept as optional concepts.</w:t>
+      </w:r>
+    </w:p>
+    <w:p>
+      <w:pPr>
+        <w:pStyle w:val="Heading1"/>
+        <w:spacing w:after="120" w:before="240"/>
+      </w:pPr>
+      <w:r>
+        <w:rPr>
+          <w:rFonts w:ascii="Times New Roman" w:cs="Times New Roman" w:eastAsia="Times New Roman" w:hAnsi="Times New Roman"/>
+          <w:b/>
+          <w:bCs/>
+          <w:color w:val="000000"/>
+          <w:sz w:val="28"/>
+          <w:szCs w:val="28"/>
+        </w:rPr>
+        <w:t xml:space="preserve">8. Role of Artificial Intelligence</w:t>
+      </w:r>
+    </w:p>
+    <w:p>
+      <w:pPr>
+        <w:pStyle w:val="Heading2"/>
+        <w:spacing w:after="100" w:before="180"/>
+      </w:pPr>
+      <w:r>
+        <w:rPr>
+          <w:rFonts w:ascii="Times New Roman" w:cs="Times New Roman" w:eastAsia="Times New Roman" w:hAnsi="Times New Roman"/>
+          <w:b/>
+          <w:bCs/>
+          <w:color w:val="000000"/>
+          <w:sz w:val="24"/>
+          <w:szCs w:val="24"/>
+        </w:rPr>
+        <w:t xml:space="preserve">8.1 AI in Route-Draft Generation</w:t>
+      </w:r>
+    </w:p>
+    <w:p>
+      <w:pPr>
+        <w:spacing w:after="120" w:line="300"/>
+        <w:jc w:val="both"/>
+      </w:pPr>
+      <w:r>
+        <w:rPr>
+          <w:rFonts w:ascii="Times New Roman" w:cs="Times New Roman" w:eastAsia="Times New Roman" w:hAnsi="Times New Roman"/>
+          <w:sz w:val="24"/>
+          <w:szCs w:val="24"/>
+        </w:rPr>
+        <w:t xml:space="preserve">Research shows that language models alone often violate hard constraints such as budgets when they plan trips, and that hybrid systems combining a model with structured data and code give better results. Our design therefore limits the model to one task: arranging checked catalog candidates into a typed draft.</w:t>
       </w:r>
     </w:p>
     <w:p>
@@ -2455,7 +3385,7 @@
           <w:sz w:val="24"/>
           <w:szCs w:val="24"/>
         </w:rPr>
-        <w:t xml:space="preserve">Collect a list of interesting places in Astana recommended by locals: places to eat, attractions, parks and places to relax, and less-known local spots.</w:t>
+        <w:t xml:space="preserve">The model receives the trip parameters and a list of candidate catalog IDs with their attributes.</w:t>
       </w:r>
     </w:p>
     <w:p>
@@ -2474,7 +3404,7 @@
           <w:sz w:val="24"/>
           <w:szCs w:val="24"/>
         </w:rPr>
-        <w:t xml:space="preserve">Find out what residents would recommend to first-time visitors, including a must-see list for a short trip of 1 to 3 days.</w:t>
+        <w:t xml:space="preserve">It returns a typed draft with catalog IDs, dates and slots; it never supplies prices or new places.</w:t>
       </w:r>
     </w:p>
     <w:p>
@@ -2493,7 +3423,7 @@
           <w:sz w:val="24"/>
           <w:szCs w:val="24"/>
         </w:rPr>
-        <w:t xml:space="preserve">Learn typical prices (for example, the cost of an average lunch or dinner) to make budget estimates more realistic.</w:t>
+        <w:t xml:space="preserve">Code calculates the budget (the budget core implemented by Zukhra, DIP-42) and validates the draft.</w:t>
       </w:r>
     </w:p>
     <w:p>
@@ -2512,7 +3442,7 @@
           <w:sz w:val="24"/>
           <w:szCs w:val="24"/>
         </w:rPr>
-        <w:t xml:space="preserve">Understand how people currently plan trips, especially group trips, and which problems they face.</w:t>
+        <w:t xml:space="preserve">The user previews the draft and explicitly confirms it; the server revalidates it before an atomic save.</w:t>
       </w:r>
     </w:p>
     <w:p>
@@ -2531,7 +3461,24 @@
           <w:sz w:val="24"/>
           <w:szCs w:val="24"/>
         </w:rPr>
-        <w:t xml:space="preserve">Check whether respondents would use the key features of the application, including the AI assistant.</w:t>
+        <w:t xml:space="preserve">Provider errors leave the confirmed plan unchanged and readable.</w:t>
+      </w:r>
+    </w:p>
+    <w:p>
+      <w:pPr>
+        <w:pStyle w:val="Heading2"/>
+        <w:spacing w:after="100" w:before="180"/>
+      </w:pPr>
+      <w:r>
+        <w:rPr>
+          <w:rFonts w:ascii="Times New Roman" w:cs="Times New Roman" w:eastAsia="Times New Roman" w:hAnsi="Times New Roman"/>
+          <w:b/>
+          <w:bCs/>
+          <w:color w:val="000000"/>
+          <w:sz w:val="24"/>
+          <w:szCs w:val="24"/>
+        </w:rPr>
+        <w:t xml:space="preserve">8.2 Conversational AI Assistant (deferred)</w:t>
       </w:r>
     </w:p>
     <w:p>
@@ -2542,44 +3489,10 @@
       <w:r>
         <w:rPr>
           <w:rFonts w:ascii="Times New Roman" w:cs="Times New Roman" w:eastAsia="Times New Roman" w:hAnsi="Times New Roman"/>
-          <w:b/>
-          <w:bCs/>
-          <w:sz w:val="24"/>
-          <w:szCs w:val="24"/>
-        </w:rPr>
-        <w:t xml:space="preserve">Method: </w:t>
-      </w:r>
-      <w:r>
-        <w:rPr>
-          <w:rFonts w:ascii="Times New Roman" w:cs="Times New Roman" w:eastAsia="Times New Roman" w:hAnsi="Times New Roman"/>
-          <w:sz w:val="24"/>
-          <w:szCs w:val="24"/>
-        </w:rPr>
-        <w:t xml:space="preserve">an online questionnaire (Google Forms) distributed among Astana residents through university groups, social networks and messenger chats, from 13 to 18 October 2026. In addition, the team will hold 3 to 5 short interviews with potential users (people who regularly travel with friends or family) to discuss their planning experience in more detail.</w:t>
-      </w:r>
-    </w:p>
-    <w:p>
-      <w:pPr>
-        <w:spacing w:after="120" w:line="300"/>
-        <w:jc w:val="both"/>
-      </w:pPr>
-      <w:r>
-        <w:rPr>
-          <w:rFonts w:ascii="Times New Roman" w:cs="Times New Roman" w:eastAsia="Times New Roman" w:hAnsi="Times New Roman"/>
-          <w:b/>
-          <w:bCs/>
-          <w:sz w:val="24"/>
-          <w:szCs w:val="24"/>
-        </w:rPr>
-        <w:t xml:space="preserve">How the results will be used: </w:t>
-      </w:r>
-      <w:r>
-        <w:rPr>
-          <w:rFonts w:ascii="Times New Roman" w:cs="Times New Roman" w:eastAsia="Times New Roman" w:hAnsi="Times New Roman"/>
-          <w:sz w:val="24"/>
-          <w:szCs w:val="24"/>
-        </w:rPr>
-        <w:t xml:space="preserve">the recommended places will form the initial verified database of places for Astana; the answers about first-time visitors will be used to build a "First time in Astana" plan template; and the answers about planning habits will be used to confirm or correct the requirements. In the final report, findings confirmed by the survey will be clearly separated from the team's own assumptions.</w:t>
+          <w:sz w:val="24"/>
+          <w:szCs w:val="24"/>
+        </w:rPr>
+        <w:t xml:space="preserve">A chat assistant that answers questions and changes the plan on request (for example, "Make Day 2 cheaper") is deferred. If it is scheduled later, it must reuse the same draft, validation, preview and confirmation steps.</w:t>
       </w:r>
     </w:p>
     <w:p>
@@ -2596,1703 +3509,7 @@
           <w:sz w:val="28"/>
           <w:szCs w:val="28"/>
         </w:rPr>
-        <w:t xml:space="preserve">6. How the Application Works</w:t>
-      </w:r>
-    </w:p>
-    <w:p>
-      <w:pPr>
-        <w:spacing w:after="120" w:line="300"/>
-        <w:jc w:val="both"/>
-      </w:pPr>
-      <w:r>
-        <w:rPr>
-          <w:rFonts w:ascii="Times New Roman" w:cs="Times New Roman" w:eastAsia="Times New Roman" w:hAnsi="Times New Roman"/>
-          <w:sz w:val="24"/>
-          <w:szCs w:val="24"/>
-        </w:rPr>
-        <w:t xml:space="preserve">The main user scenario is described below using a trip to Astana as an example.</w:t>
-      </w:r>
-    </w:p>
-    <w:p>
-      <w:pPr>
-        <w:pStyle w:val="Heading2"/>
-        <w:spacing w:after="100" w:before="180"/>
-      </w:pPr>
-      <w:r>
-        <w:rPr>
-          <w:rFonts w:ascii="Times New Roman" w:cs="Times New Roman" w:eastAsia="Times New Roman" w:hAnsi="Times New Roman"/>
-          <w:b/>
-          <w:bCs/>
-          <w:color w:val="000000"/>
-          <w:sz w:val="24"/>
-          <w:szCs w:val="24"/>
-        </w:rPr>
-        <w:t xml:space="preserve">6.1 Creating a Trip</w:t>
-      </w:r>
-    </w:p>
-    <w:p>
-      <w:pPr>
-        <w:spacing w:after="120" w:line="300"/>
-        <w:jc w:val="both"/>
-      </w:pPr>
-      <w:r>
-        <w:rPr>
-          <w:rFonts w:ascii="Times New Roman" w:cs="Times New Roman" w:eastAsia="Times New Roman" w:hAnsi="Times New Roman"/>
-          <w:sz w:val="24"/>
-          <w:szCs w:val="24"/>
-        </w:rPr>
-        <w:t xml:space="preserve">The user creates a new trip and fills in the following information:</w:t>
-      </w:r>
-    </w:p>
-    <w:p>
-      <w:pPr>
-        <w:pStyle w:val="ListParagraph"/>
-        <w:numPr>
-          <w:ilvl w:val="0"/>
-          <w:numId w:val="2"/>
-        </w:numPr>
-        <w:spacing w:after="80" w:line="300"/>
-        <w:jc w:val="both"/>
-      </w:pPr>
-      <w:r>
-        <w:rPr>
-          <w:rFonts w:ascii="Times New Roman" w:cs="Times New Roman" w:eastAsia="Times New Roman" w:hAnsi="Times New Roman"/>
-          <w:b/>
-          <w:bCs/>
-          <w:sz w:val="24"/>
-          <w:szCs w:val="24"/>
-        </w:rPr>
-        <w:t xml:space="preserve">Destination:</w:t>
-      </w:r>
-      <w:r>
-        <w:rPr>
-          <w:rFonts w:ascii="Times New Roman" w:cs="Times New Roman" w:eastAsia="Times New Roman" w:hAnsi="Times New Roman"/>
-          <w:sz w:val="24"/>
-          <w:szCs w:val="24"/>
-        </w:rPr>
-        <w:t xml:space="preserve"> for example, Astana.</w:t>
-      </w:r>
-    </w:p>
-    <w:p>
-      <w:pPr>
-        <w:pStyle w:val="ListParagraph"/>
-        <w:numPr>
-          <w:ilvl w:val="0"/>
-          <w:numId w:val="2"/>
-        </w:numPr>
-        <w:spacing w:after="80" w:line="300"/>
-        <w:jc w:val="both"/>
-      </w:pPr>
-      <w:r>
-        <w:rPr>
-          <w:rFonts w:ascii="Times New Roman" w:cs="Times New Roman" w:eastAsia="Times New Roman" w:hAnsi="Times New Roman"/>
-          <w:b/>
-          <w:bCs/>
-          <w:sz w:val="24"/>
-          <w:szCs w:val="24"/>
-        </w:rPr>
-        <w:t xml:space="preserve">Travel dates:</w:t>
-      </w:r>
-      <w:r>
-        <w:rPr>
-          <w:rFonts w:ascii="Times New Roman" w:cs="Times New Roman" w:eastAsia="Times New Roman" w:hAnsi="Times New Roman"/>
-          <w:sz w:val="24"/>
-          <w:szCs w:val="24"/>
-        </w:rPr>
-        <w:t xml:space="preserve"> for example, from the 3rd to the 6th.</w:t>
-      </w:r>
-    </w:p>
-    <w:p>
-      <w:pPr>
-        <w:pStyle w:val="ListParagraph"/>
-        <w:numPr>
-          <w:ilvl w:val="0"/>
-          <w:numId w:val="2"/>
-        </w:numPr>
-        <w:spacing w:after="80" w:line="300"/>
-        <w:jc w:val="both"/>
-      </w:pPr>
-      <w:r>
-        <w:rPr>
-          <w:rFonts w:ascii="Times New Roman" w:cs="Times New Roman" w:eastAsia="Times New Roman" w:hAnsi="Times New Roman"/>
-          <w:b/>
-          <w:bCs/>
-          <w:sz w:val="24"/>
-          <w:szCs w:val="24"/>
-        </w:rPr>
-        <w:t xml:space="preserve">Number of travelers:</w:t>
-      </w:r>
-      <w:r>
-        <w:rPr>
-          <w:rFonts w:ascii="Times New Roman" w:cs="Times New Roman" w:eastAsia="Times New Roman" w:hAnsi="Times New Roman"/>
-          <w:sz w:val="24"/>
-          <w:szCs w:val="24"/>
-        </w:rPr>
-        <w:t xml:space="preserve"> for example, 4 people.</w:t>
-      </w:r>
-    </w:p>
-    <w:p>
-      <w:pPr>
-        <w:pStyle w:val="ListParagraph"/>
-        <w:numPr>
-          <w:ilvl w:val="0"/>
-          <w:numId w:val="2"/>
-        </w:numPr>
-        <w:spacing w:after="80" w:line="300"/>
-        <w:jc w:val="both"/>
-      </w:pPr>
-      <w:r>
-        <w:rPr>
-          <w:rFonts w:ascii="Times New Roman" w:cs="Times New Roman" w:eastAsia="Times New Roman" w:hAnsi="Times New Roman"/>
-          <w:b/>
-          <w:bCs/>
-          <w:sz w:val="24"/>
-          <w:szCs w:val="24"/>
-        </w:rPr>
-        <w:t xml:space="preserve">Total budget:</w:t>
-      </w:r>
-      <w:r>
-        <w:rPr>
-          <w:rFonts w:ascii="Times New Roman" w:cs="Times New Roman" w:eastAsia="Times New Roman" w:hAnsi="Times New Roman"/>
-          <w:sz w:val="24"/>
-          <w:szCs w:val="24"/>
-        </w:rPr>
-        <w:t xml:space="preserve"> the amount the group is ready to spend.</w:t>
-      </w:r>
-    </w:p>
-    <w:p>
-      <w:pPr>
-        <w:pStyle w:val="ListParagraph"/>
-        <w:numPr>
-          <w:ilvl w:val="0"/>
-          <w:numId w:val="2"/>
-        </w:numPr>
-        <w:spacing w:after="80" w:line="300"/>
-        <w:jc w:val="both"/>
-      </w:pPr>
-      <w:r>
-        <w:rPr>
-          <w:rFonts w:ascii="Times New Roman" w:cs="Times New Roman" w:eastAsia="Times New Roman" w:hAnsi="Times New Roman"/>
-          <w:b/>
-          <w:bCs/>
-          <w:sz w:val="24"/>
-          <w:szCs w:val="24"/>
-        </w:rPr>
-        <w:t xml:space="preserve">Trip type:</w:t>
-      </w:r>
-      <w:r>
-        <w:rPr>
-          <w:rFonts w:ascii="Times New Roman" w:cs="Times New Roman" w:eastAsia="Times New Roman" w:hAnsi="Times New Roman"/>
-          <w:sz w:val="24"/>
-          <w:szCs w:val="24"/>
-        </w:rPr>
-        <w:t xml:space="preserve"> with children, couple, friends or business.</w:t>
-      </w:r>
-    </w:p>
-    <w:p>
-      <w:pPr>
-        <w:pStyle w:val="ListParagraph"/>
-        <w:numPr>
-          <w:ilvl w:val="0"/>
-          <w:numId w:val="2"/>
-        </w:numPr>
-        <w:spacing w:after="80" w:line="300"/>
-        <w:jc w:val="both"/>
-      </w:pPr>
-      <w:r>
-        <w:rPr>
-          <w:rFonts w:ascii="Times New Roman" w:cs="Times New Roman" w:eastAsia="Times New Roman" w:hAnsi="Times New Roman"/>
-          <w:b/>
-          <w:bCs/>
-          <w:sz w:val="24"/>
-          <w:szCs w:val="24"/>
-        </w:rPr>
-        <w:t xml:space="preserve">Interests:</w:t>
-      </w:r>
-      <w:r>
-        <w:rPr>
-          <w:rFonts w:ascii="Times New Roman" w:cs="Times New Roman" w:eastAsia="Times New Roman" w:hAnsi="Times New Roman"/>
-          <w:sz w:val="24"/>
-          <w:szCs w:val="24"/>
-        </w:rPr>
-        <w:t xml:space="preserve"> food, culture, nature, nightlife, shopping (several can be selected).</w:t>
-      </w:r>
-    </w:p>
-    <w:p>
-      <w:pPr>
-        <w:pStyle w:val="ListParagraph"/>
-        <w:numPr>
-          <w:ilvl w:val="0"/>
-          <w:numId w:val="2"/>
-        </w:numPr>
-        <w:spacing w:after="80" w:line="300"/>
-        <w:jc w:val="both"/>
-      </w:pPr>
-      <w:r>
-        <w:rPr>
-          <w:rFonts w:ascii="Times New Roman" w:cs="Times New Roman" w:eastAsia="Times New Roman" w:hAnsi="Times New Roman"/>
-          <w:b/>
-          <w:bCs/>
-          <w:sz w:val="24"/>
-          <w:szCs w:val="24"/>
-        </w:rPr>
-        <w:t xml:space="preserve">Collaboration settings:</w:t>
-      </w:r>
-      <w:r>
-        <w:rPr>
-          <w:rFonts w:ascii="Times New Roman" w:cs="Times New Roman" w:eastAsia="Times New Roman" w:hAnsi="Times New Roman"/>
-          <w:sz w:val="24"/>
-          <w:szCs w:val="24"/>
-        </w:rPr>
-        <w:t xml:space="preserve"> invite friends now or later; enable or disable expense splitting.</w:t>
-      </w:r>
-    </w:p>
-    <w:p>
-      <w:pPr>
-        <w:pStyle w:val="Heading2"/>
-        <w:spacing w:after="100" w:before="180"/>
-      </w:pPr>
-      <w:r>
-        <w:rPr>
-          <w:rFonts w:ascii="Times New Roman" w:cs="Times New Roman" w:eastAsia="Times New Roman" w:hAnsi="Times New Roman"/>
-          <w:b/>
-          <w:bCs/>
-          <w:color w:val="000000"/>
-          <w:sz w:val="24"/>
-          <w:szCs w:val="24"/>
-        </w:rPr>
-        <w:t xml:space="preserve">6.2 Generating the Plan</w:t>
-      </w:r>
-    </w:p>
-    <w:p>
-      <w:pPr>
-        <w:spacing w:after="120" w:line="300"/>
-        <w:jc w:val="both"/>
-      </w:pPr>
-      <w:r>
-        <w:rPr>
-          <w:rFonts w:ascii="Times New Roman" w:cs="Times New Roman" w:eastAsia="Times New Roman" w:hAnsi="Times New Roman"/>
-          <w:sz w:val="24"/>
-          <w:szCs w:val="24"/>
-        </w:rPr>
-        <w:t xml:space="preserve">After the information is entered, the application generates a trip plan and shows it as a list of days and as routes on a map. For each day, the plan contains:</w:t>
-      </w:r>
-    </w:p>
-    <w:p>
-      <w:pPr>
-        <w:pStyle w:val="ListParagraph"/>
-        <w:numPr>
-          <w:ilvl w:val="0"/>
-          <w:numId w:val="2"/>
-        </w:numPr>
-        <w:spacing w:after="80" w:line="300"/>
-        <w:jc w:val="both"/>
-      </w:pPr>
-      <w:r>
-        <w:rPr>
-          <w:rFonts w:ascii="Times New Roman" w:cs="Times New Roman" w:eastAsia="Times New Roman" w:hAnsi="Times New Roman"/>
-          <w:b/>
-          <w:bCs/>
-          <w:sz w:val="24"/>
-          <w:szCs w:val="24"/>
-        </w:rPr>
-        <w:t xml:space="preserve">Places to eat:</w:t>
-      </w:r>
-      <w:r>
-        <w:rPr>
-          <w:rFonts w:ascii="Times New Roman" w:cs="Times New Roman" w:eastAsia="Times New Roman" w:hAnsi="Times New Roman"/>
-          <w:sz w:val="24"/>
-          <w:szCs w:val="24"/>
-        </w:rPr>
-        <w:t xml:space="preserve"> several restaurant or cafe options for breakfast, lunch and dinner that fit the daily budget.</w:t>
-      </w:r>
-    </w:p>
-    <w:p>
-      <w:pPr>
-        <w:pStyle w:val="ListParagraph"/>
-        <w:numPr>
-          <w:ilvl w:val="0"/>
-          <w:numId w:val="2"/>
-        </w:numPr>
-        <w:spacing w:after="80" w:line="300"/>
-        <w:jc w:val="both"/>
-      </w:pPr>
-      <w:r>
-        <w:rPr>
-          <w:rFonts w:ascii="Times New Roman" w:cs="Times New Roman" w:eastAsia="Times New Roman" w:hAnsi="Times New Roman"/>
-          <w:b/>
-          <w:bCs/>
-          <w:sz w:val="24"/>
-          <w:szCs w:val="24"/>
-        </w:rPr>
-        <w:t xml:space="preserve">Attractions:</w:t>
-      </w:r>
-      <w:r>
-        <w:rPr>
-          <w:rFonts w:ascii="Times New Roman" w:cs="Times New Roman" w:eastAsia="Times New Roman" w:hAnsi="Times New Roman"/>
-          <w:sz w:val="24"/>
-          <w:szCs w:val="24"/>
-        </w:rPr>
-        <w:t xml:space="preserve"> sights and places worth visiting, ordered so that the route between them is convenient.</w:t>
-      </w:r>
-    </w:p>
-    <w:p>
-      <w:pPr>
-        <w:pStyle w:val="ListParagraph"/>
-        <w:numPr>
-          <w:ilvl w:val="0"/>
-          <w:numId w:val="2"/>
-        </w:numPr>
-        <w:spacing w:after="80" w:line="300"/>
-        <w:jc w:val="both"/>
-      </w:pPr>
-      <w:r>
-        <w:rPr>
-          <w:rFonts w:ascii="Times New Roman" w:cs="Times New Roman" w:eastAsia="Times New Roman" w:hAnsi="Times New Roman"/>
-          <w:b/>
-          <w:bCs/>
-          <w:sz w:val="24"/>
-          <w:szCs w:val="24"/>
-        </w:rPr>
-        <w:t xml:space="preserve">Events:</w:t>
-      </w:r>
-      <w:r>
-        <w:rPr>
-          <w:rFonts w:ascii="Times New Roman" w:cs="Times New Roman" w:eastAsia="Times New Roman" w:hAnsi="Times New Roman"/>
-          <w:sz w:val="24"/>
-          <w:szCs w:val="24"/>
-        </w:rPr>
-        <w:t xml:space="preserve"> festivals, concerts, exhibitions or holidays that take place on that exact day.</w:t>
-      </w:r>
-    </w:p>
-    <w:p>
-      <w:pPr>
-        <w:pStyle w:val="ListParagraph"/>
-        <w:numPr>
-          <w:ilvl w:val="0"/>
-          <w:numId w:val="2"/>
-        </w:numPr>
-        <w:spacing w:after="80" w:line="300"/>
-        <w:jc w:val="both"/>
-      </w:pPr>
-      <w:r>
-        <w:rPr>
-          <w:rFonts w:ascii="Times New Roman" w:cs="Times New Roman" w:eastAsia="Times New Roman" w:hAnsi="Times New Roman"/>
-          <w:b/>
-          <w:bCs/>
-          <w:sz w:val="24"/>
-          <w:szCs w:val="24"/>
-        </w:rPr>
-        <w:t xml:space="preserve">Popular places to relax:</w:t>
-      </w:r>
-      <w:r>
-        <w:rPr>
-          <w:rFonts w:ascii="Times New Roman" w:cs="Times New Roman" w:eastAsia="Times New Roman" w:hAnsi="Times New Roman"/>
-          <w:sz w:val="24"/>
-          <w:szCs w:val="24"/>
-        </w:rPr>
-        <w:t xml:space="preserve"> parks, promenades and other locations that are highly rated by visitors.</w:t>
-      </w:r>
-    </w:p>
-    <w:p>
-      <w:pPr>
-        <w:pStyle w:val="ListParagraph"/>
-        <w:numPr>
-          <w:ilvl w:val="0"/>
-          <w:numId w:val="2"/>
-        </w:numPr>
-        <w:spacing w:after="80" w:line="300"/>
-        <w:jc w:val="both"/>
-      </w:pPr>
-      <w:r>
-        <w:rPr>
-          <w:rFonts w:ascii="Times New Roman" w:cs="Times New Roman" w:eastAsia="Times New Roman" w:hAnsi="Times New Roman"/>
-          <w:b/>
-          <w:bCs/>
-          <w:sz w:val="24"/>
-          <w:szCs w:val="24"/>
-        </w:rPr>
-        <w:t xml:space="preserve">Estimated daily cost:</w:t>
-      </w:r>
-      <w:r>
-        <w:rPr>
-          <w:rFonts w:ascii="Times New Roman" w:cs="Times New Roman" w:eastAsia="Times New Roman" w:hAnsi="Times New Roman"/>
-          <w:sz w:val="24"/>
-          <w:szCs w:val="24"/>
-        </w:rPr>
-        <w:t xml:space="preserve"> the part of the total budget planned for that day.</w:t>
-      </w:r>
-    </w:p>
-    <w:p>
-      <w:pPr>
-        <w:spacing w:after="120" w:line="300"/>
-        <w:jc w:val="both"/>
-      </w:pPr>
-      <w:r>
-        <w:rPr>
-          <w:rFonts w:ascii="Times New Roman" w:cs="Times New Roman" w:eastAsia="Times New Roman" w:hAnsi="Times New Roman"/>
-          <w:sz w:val="24"/>
-          <w:szCs w:val="24"/>
-        </w:rPr>
-        <w:t xml:space="preserve">Separately, the application suggests several accommodation options (hotels, hostels, apartments) for the whole stay, with approximate prices and links for booking.</w:t>
-      </w:r>
-    </w:p>
-    <w:p>
-      <w:pPr>
-        <w:pStyle w:val="Heading2"/>
-        <w:spacing w:after="100" w:before="180"/>
-      </w:pPr>
-      <w:r>
-        <w:rPr>
-          <w:rFonts w:ascii="Times New Roman" w:cs="Times New Roman" w:eastAsia="Times New Roman" w:hAnsi="Times New Roman"/>
-          <w:b/>
-          <w:bCs/>
-          <w:color w:val="000000"/>
-          <w:sz w:val="24"/>
-          <w:szCs w:val="24"/>
-        </w:rPr>
-        <w:t xml:space="preserve">6.3 Example</w:t>
-      </w:r>
-    </w:p>
-    <w:p>
-      <w:pPr>
-        <w:spacing w:after="120" w:line="300"/>
-        <w:jc w:val="both"/>
-      </w:pPr>
-      <w:r>
-        <w:rPr>
-          <w:rFonts w:ascii="Times New Roman" w:cs="Times New Roman" w:eastAsia="Times New Roman" w:hAnsi="Times New Roman"/>
-          <w:sz w:val="24"/>
-          <w:szCs w:val="24"/>
-        </w:rPr>
-        <w:t xml:space="preserve">A group of four friends plans a trip to Astana from the 3rd to the 6th. The application suggests three hotel options within their budget. On Day 1 it recommends lunch at a restaurant with national cuisine, a visit to Baiterek and an evening walk along the Ishim embankment. On Day 2 it notices that a city festival takes place that day and includes it in the plan. On Day 3 the weather forecast shows rain, so the application suggests indoor places such as Khan Shatyr and museums. Each day shows its planned cost, and the total stays within the budget.</w:t>
-      </w:r>
-    </w:p>
-    <w:p>
-      <w:pPr>
-        <w:pStyle w:val="Heading2"/>
-        <w:spacing w:after="100" w:before="180"/>
-      </w:pPr>
-      <w:r>
-        <w:rPr>
-          <w:rFonts w:ascii="Times New Roman" w:cs="Times New Roman" w:eastAsia="Times New Roman" w:hAnsi="Times New Roman"/>
-          <w:b/>
-          <w:bCs/>
-          <w:color w:val="000000"/>
-          <w:sz w:val="24"/>
-          <w:szCs w:val="24"/>
-        </w:rPr>
-        <w:t xml:space="preserve">6.4 Planning Together</w:t>
-      </w:r>
-    </w:p>
-    <w:p>
-      <w:pPr>
-        <w:spacing w:after="120" w:line="300"/>
-        <w:jc w:val="both"/>
-      </w:pPr>
-      <w:r>
-        <w:rPr>
-          <w:rFonts w:ascii="Times New Roman" w:cs="Times New Roman" w:eastAsia="Times New Roman" w:hAnsi="Times New Roman"/>
-          <w:sz w:val="24"/>
-          <w:szCs w:val="24"/>
-        </w:rPr>
-        <w:t xml:space="preserve">The trip creator shares an invitation link or code. Friends join the trip and see the same plan. Every participant can like or dislike suggested hotels, restaurants and places, and the most popular options are kept in the final plan. Participants can comment on any item of the plan, for example to suggest a different time or ask a question. If expense splitting is enabled, everyone can record what they paid, and the application calculates who owes whom. For general discussion that is not related to a specific item, each trip has its own group chat, so the group does not need a separate messenger.</w:t>
-      </w:r>
-    </w:p>
-    <w:p>
-      <w:pPr>
-        <w:pStyle w:val="Heading2"/>
-        <w:spacing w:after="100" w:before="180"/>
-      </w:pPr>
-      <w:r>
-        <w:rPr>
-          <w:rFonts w:ascii="Times New Roman" w:cs="Times New Roman" w:eastAsia="Times New Roman" w:hAnsi="Times New Roman"/>
-          <w:b/>
-          <w:bCs/>
-          <w:color w:val="000000"/>
-          <w:sz w:val="24"/>
-          <w:szCs w:val="24"/>
-        </w:rPr>
-        <w:t xml:space="preserve">6.5 Community Feed</w:t>
-      </w:r>
-    </w:p>
-    <w:p>
-      <w:pPr>
-        <w:spacing w:after="120" w:line="300"/>
-        <w:jc w:val="both"/>
-      </w:pPr>
-      <w:r>
-        <w:rPr>
-          <w:rFonts w:ascii="Times New Roman" w:cs="Times New Roman" w:eastAsia="Times New Roman" w:hAnsi="Times New Roman"/>
-          <w:sz w:val="24"/>
-          <w:szCs w:val="24"/>
-        </w:rPr>
-        <w:t xml:space="preserve">Besides private trip planning, the application has a public community feed. Any user can publish a post about a place or an event they visited: photos, a short review, the approximate cost and the best time to visit. Posts are linked to places on the map, so when the application suggests a restaurant or an attraction, the user can also see what other travelers wrote about it. Users can like posts, save them and add the place from a post directly to their own trip plan. To keep the feed useful and safe, users can report inappropriate posts, and reported posts are reviewed before they are shown again.</w:t>
-      </w:r>
-    </w:p>
-    <w:p>
-      <w:pPr>
-        <w:pStyle w:val="Heading1"/>
-        <w:spacing w:after="120" w:before="240"/>
-      </w:pPr>
-      <w:r>
-        <w:rPr>
-          <w:rFonts w:ascii="Times New Roman" w:cs="Times New Roman" w:eastAsia="Times New Roman" w:hAnsi="Times New Roman"/>
-          <w:b/>
-          <w:bCs/>
-          <w:color w:val="000000"/>
-          <w:sz w:val="28"/>
-          <w:szCs w:val="28"/>
-        </w:rPr>
-        <w:t xml:space="preserve">7. Key Features</w:t>
-      </w:r>
-    </w:p>
-    <w:p>
-      <w:pPr>
-        <w:pStyle w:val="Heading2"/>
-        <w:spacing w:after="100" w:before="180"/>
-      </w:pPr>
-      <w:r>
-        <w:rPr>
-          <w:rFonts w:ascii="Times New Roman" w:cs="Times New Roman" w:eastAsia="Times New Roman" w:hAnsi="Times New Roman"/>
-          <w:b/>
-          <w:bCs/>
-          <w:color w:val="000000"/>
-          <w:sz w:val="24"/>
-          <w:szCs w:val="24"/>
-        </w:rPr>
-        <w:t xml:space="preserve">7.1 Core Planning Features</w:t>
-      </w:r>
-    </w:p>
-    <w:p>
-      <w:pPr>
-        <w:pStyle w:val="ListParagraph"/>
-        <w:numPr>
-          <w:ilvl w:val="0"/>
-          <w:numId w:val="2"/>
-        </w:numPr>
-        <w:spacing w:after="80" w:line="300"/>
-        <w:jc w:val="both"/>
-      </w:pPr>
-      <w:r>
-        <w:rPr>
-          <w:rFonts w:ascii="Times New Roman" w:cs="Times New Roman" w:eastAsia="Times New Roman" w:hAnsi="Times New Roman"/>
-          <w:b/>
-          <w:bCs/>
-          <w:sz w:val="24"/>
-          <w:szCs w:val="24"/>
-        </w:rPr>
-        <w:t xml:space="preserve">Trip creation:</w:t>
-      </w:r>
-      <w:r>
-        <w:rPr>
-          <w:rFonts w:ascii="Times New Roman" w:cs="Times New Roman" w:eastAsia="Times New Roman" w:hAnsi="Times New Roman"/>
-          <w:sz w:val="24"/>
-          <w:szCs w:val="24"/>
-        </w:rPr>
-        <w:t xml:space="preserve"> destination, dates, number of people, budget, trip type and interests.</w:t>
-      </w:r>
-    </w:p>
-    <w:p>
-      <w:pPr>
-        <w:pStyle w:val="ListParagraph"/>
-        <w:numPr>
-          <w:ilvl w:val="0"/>
-          <w:numId w:val="2"/>
-        </w:numPr>
-        <w:spacing w:after="80" w:line="300"/>
-        <w:jc w:val="both"/>
-      </w:pPr>
-      <w:r>
-        <w:rPr>
-          <w:rFonts w:ascii="Times New Roman" w:cs="Times New Roman" w:eastAsia="Times New Roman" w:hAnsi="Times New Roman"/>
-          <w:b/>
-          <w:bCs/>
-          <w:sz w:val="24"/>
-          <w:szCs w:val="24"/>
-        </w:rPr>
-        <w:t xml:space="preserve">AI-generated day-by-day itinerary:</w:t>
-      </w:r>
-      <w:r>
-        <w:rPr>
-          <w:rFonts w:ascii="Times New Roman" w:cs="Times New Roman" w:eastAsia="Times New Roman" w:hAnsi="Times New Roman"/>
-          <w:sz w:val="24"/>
-          <w:szCs w:val="24"/>
-        </w:rPr>
-        <w:t xml:space="preserve"> food, attractions, events and relaxation places for each day.</w:t>
-      </w:r>
-    </w:p>
-    <w:p>
-      <w:pPr>
-        <w:pStyle w:val="ListParagraph"/>
-        <w:numPr>
-          <w:ilvl w:val="0"/>
-          <w:numId w:val="2"/>
-        </w:numPr>
-        <w:spacing w:after="80" w:line="300"/>
-        <w:jc w:val="both"/>
-      </w:pPr>
-      <w:r>
-        <w:rPr>
-          <w:rFonts w:ascii="Times New Roman" w:cs="Times New Roman" w:eastAsia="Times New Roman" w:hAnsi="Times New Roman"/>
-          <w:b/>
-          <w:bCs/>
-          <w:sz w:val="24"/>
-          <w:szCs w:val="24"/>
-        </w:rPr>
-        <w:t xml:space="preserve">Accommodation suggestions:</w:t>
-      </w:r>
-      <w:r>
-        <w:rPr>
-          <w:rFonts w:ascii="Times New Roman" w:cs="Times New Roman" w:eastAsia="Times New Roman" w:hAnsi="Times New Roman"/>
-          <w:sz w:val="24"/>
-          <w:szCs w:val="24"/>
-        </w:rPr>
-        <w:t xml:space="preserve"> several options matching the budget and the number of travelers.</w:t>
-      </w:r>
-    </w:p>
-    <w:p>
-      <w:pPr>
-        <w:pStyle w:val="ListParagraph"/>
-        <w:numPr>
-          <w:ilvl w:val="0"/>
-          <w:numId w:val="2"/>
-        </w:numPr>
-        <w:spacing w:after="80" w:line="300"/>
-        <w:jc w:val="both"/>
-      </w:pPr>
-      <w:r>
-        <w:rPr>
-          <w:rFonts w:ascii="Times New Roman" w:cs="Times New Roman" w:eastAsia="Times New Roman" w:hAnsi="Times New Roman"/>
-          <w:b/>
-          <w:bCs/>
-          <w:sz w:val="24"/>
-          <w:szCs w:val="24"/>
-        </w:rPr>
-        <w:t xml:space="preserve">Budget distribution:</w:t>
-      </w:r>
-      <w:r>
-        <w:rPr>
-          <w:rFonts w:ascii="Times New Roman" w:cs="Times New Roman" w:eastAsia="Times New Roman" w:hAnsi="Times New Roman"/>
-          <w:sz w:val="24"/>
-          <w:szCs w:val="24"/>
-        </w:rPr>
-        <w:t xml:space="preserve"> the total budget is divided across accommodation and each day of the trip, with an estimated cost for every item.</w:t>
-      </w:r>
-    </w:p>
-    <w:p>
-      <w:pPr>
-        <w:pStyle w:val="ListParagraph"/>
-        <w:numPr>
-          <w:ilvl w:val="0"/>
-          <w:numId w:val="2"/>
-        </w:numPr>
-        <w:spacing w:after="80" w:line="300"/>
-        <w:jc w:val="both"/>
-      </w:pPr>
-      <w:r>
-        <w:rPr>
-          <w:rFonts w:ascii="Times New Roman" w:cs="Times New Roman" w:eastAsia="Times New Roman" w:hAnsi="Times New Roman"/>
-          <w:b/>
-          <w:bCs/>
-          <w:sz w:val="24"/>
-          <w:szCs w:val="24"/>
-        </w:rPr>
-        <w:t xml:space="preserve">Interactive map:</w:t>
-      </w:r>
-      <w:r>
-        <w:rPr>
-          <w:rFonts w:ascii="Times New Roman" w:cs="Times New Roman" w:eastAsia="Times New Roman" w:hAnsi="Times New Roman"/>
-          <w:sz w:val="24"/>
-          <w:szCs w:val="24"/>
-        </w:rPr>
-        <w:t xml:space="preserve"> all places of each day are shown on the map with a route and approximate travel time between them.</w:t>
-      </w:r>
-    </w:p>
-    <w:p>
-      <w:pPr>
-        <w:pStyle w:val="ListParagraph"/>
-        <w:numPr>
-          <w:ilvl w:val="0"/>
-          <w:numId w:val="2"/>
-        </w:numPr>
-        <w:spacing w:after="80" w:line="300"/>
-        <w:jc w:val="both"/>
-      </w:pPr>
-      <w:r>
-        <w:rPr>
-          <w:rFonts w:ascii="Times New Roman" w:cs="Times New Roman" w:eastAsia="Times New Roman" w:hAnsi="Times New Roman"/>
-          <w:b/>
-          <w:bCs/>
-          <w:sz w:val="24"/>
-          <w:szCs w:val="24"/>
-        </w:rPr>
-        <w:t xml:space="preserve">Plan editing:</w:t>
-      </w:r>
-      <w:r>
-        <w:rPr>
-          <w:rFonts w:ascii="Times New Roman" w:cs="Times New Roman" w:eastAsia="Times New Roman" w:hAnsi="Times New Roman"/>
-          <w:sz w:val="24"/>
-          <w:szCs w:val="24"/>
-        </w:rPr>
-        <w:t xml:space="preserve"> the user can replace, add or remove any item, and the budget is recalculated automatically.</w:t>
-      </w:r>
-    </w:p>
-    <w:p>
-      <w:pPr>
-        <w:pStyle w:val="Heading2"/>
-        <w:spacing w:after="100" w:before="180"/>
-      </w:pPr>
-      <w:r>
-        <w:rPr>
-          <w:rFonts w:ascii="Times New Roman" w:cs="Times New Roman" w:eastAsia="Times New Roman" w:hAnsi="Times New Roman"/>
-          <w:b/>
-          <w:bCs/>
-          <w:color w:val="000000"/>
-          <w:sz w:val="24"/>
-          <w:szCs w:val="24"/>
-        </w:rPr>
-        <w:t xml:space="preserve">7.2 Collaboration Features</w:t>
-      </w:r>
-    </w:p>
-    <w:p>
-      <w:pPr>
-        <w:pStyle w:val="ListParagraph"/>
-        <w:numPr>
-          <w:ilvl w:val="0"/>
-          <w:numId w:val="2"/>
-        </w:numPr>
-        <w:spacing w:after="80" w:line="300"/>
-        <w:jc w:val="both"/>
-      </w:pPr>
-      <w:r>
-        <w:rPr>
-          <w:rFonts w:ascii="Times New Roman" w:cs="Times New Roman" w:eastAsia="Times New Roman" w:hAnsi="Times New Roman"/>
-          <w:b/>
-          <w:bCs/>
-          <w:sz w:val="24"/>
-          <w:szCs w:val="24"/>
-        </w:rPr>
-        <w:t xml:space="preserve">Invitations:</w:t>
-      </w:r>
-      <w:r>
-        <w:rPr>
-          <w:rFonts w:ascii="Times New Roman" w:cs="Times New Roman" w:eastAsia="Times New Roman" w:hAnsi="Times New Roman"/>
-          <w:sz w:val="24"/>
-          <w:szCs w:val="24"/>
-        </w:rPr>
-        <w:t xml:space="preserve"> friends join a trip by link or code and see one shared plan.</w:t>
-      </w:r>
-    </w:p>
-    <w:p>
-      <w:pPr>
-        <w:pStyle w:val="ListParagraph"/>
-        <w:numPr>
-          <w:ilvl w:val="0"/>
-          <w:numId w:val="2"/>
-        </w:numPr>
-        <w:spacing w:after="80" w:line="300"/>
-        <w:jc w:val="both"/>
-      </w:pPr>
-      <w:r>
-        <w:rPr>
-          <w:rFonts w:ascii="Times New Roman" w:cs="Times New Roman" w:eastAsia="Times New Roman" w:hAnsi="Times New Roman"/>
-          <w:b/>
-          <w:bCs/>
-          <w:sz w:val="24"/>
-          <w:szCs w:val="24"/>
-        </w:rPr>
-        <w:t xml:space="preserve">Voting:</w:t>
-      </w:r>
-      <w:r>
-        <w:rPr>
-          <w:rFonts w:ascii="Times New Roman" w:cs="Times New Roman" w:eastAsia="Times New Roman" w:hAnsi="Times New Roman"/>
-          <w:sz w:val="24"/>
-          <w:szCs w:val="24"/>
-        </w:rPr>
-        <w:t xml:space="preserve"> participants like or dislike hotels, restaurants and places; the most popular options are included in the plan.</w:t>
-      </w:r>
-    </w:p>
-    <w:p>
-      <w:pPr>
-        <w:pStyle w:val="ListParagraph"/>
-        <w:numPr>
-          <w:ilvl w:val="0"/>
-          <w:numId w:val="2"/>
-        </w:numPr>
-        <w:spacing w:after="80" w:line="300"/>
-        <w:jc w:val="both"/>
-      </w:pPr>
-      <w:r>
-        <w:rPr>
-          <w:rFonts w:ascii="Times New Roman" w:cs="Times New Roman" w:eastAsia="Times New Roman" w:hAnsi="Times New Roman"/>
-          <w:b/>
-          <w:bCs/>
-          <w:sz w:val="24"/>
-          <w:szCs w:val="24"/>
-        </w:rPr>
-        <w:t xml:space="preserve">Comments:</w:t>
-      </w:r>
-      <w:r>
-        <w:rPr>
-          <w:rFonts w:ascii="Times New Roman" w:cs="Times New Roman" w:eastAsia="Times New Roman" w:hAnsi="Times New Roman"/>
-          <w:sz w:val="24"/>
-          <w:szCs w:val="24"/>
-        </w:rPr>
-        <w:t xml:space="preserve"> discussion directly under each item of the plan.</w:t>
-      </w:r>
-    </w:p>
-    <w:p>
-      <w:pPr>
-        <w:pStyle w:val="ListParagraph"/>
-        <w:numPr>
-          <w:ilvl w:val="0"/>
-          <w:numId w:val="2"/>
-        </w:numPr>
-        <w:spacing w:after="80" w:line="300"/>
-        <w:jc w:val="both"/>
-      </w:pPr>
-      <w:r>
-        <w:rPr>
-          <w:rFonts w:ascii="Times New Roman" w:cs="Times New Roman" w:eastAsia="Times New Roman" w:hAnsi="Times New Roman"/>
-          <w:b/>
-          <w:bCs/>
-          <w:sz w:val="24"/>
-          <w:szCs w:val="24"/>
-        </w:rPr>
-        <w:t xml:space="preserve">Trip chat:</w:t>
-      </w:r>
-      <w:r>
-        <w:rPr>
-          <w:rFonts w:ascii="Times New Roman" w:cs="Times New Roman" w:eastAsia="Times New Roman" w:hAnsi="Times New Roman"/>
-          <w:sz w:val="24"/>
-          <w:szCs w:val="24"/>
-        </w:rPr>
-        <w:t xml:space="preserve"> a group chat for all participants of a trip, available inside the application.</w:t>
-      </w:r>
-    </w:p>
-    <w:p>
-      <w:pPr>
-        <w:pStyle w:val="ListParagraph"/>
-        <w:numPr>
-          <w:ilvl w:val="0"/>
-          <w:numId w:val="2"/>
-        </w:numPr>
-        <w:spacing w:after="80" w:line="300"/>
-        <w:jc w:val="both"/>
-      </w:pPr>
-      <w:r>
-        <w:rPr>
-          <w:rFonts w:ascii="Times New Roman" w:cs="Times New Roman" w:eastAsia="Times New Roman" w:hAnsi="Times New Roman"/>
-          <w:b/>
-          <w:bCs/>
-          <w:sz w:val="24"/>
-          <w:szCs w:val="24"/>
-        </w:rPr>
-        <w:t xml:space="preserve">Expense splitting (optional):</w:t>
-      </w:r>
-      <w:r>
-        <w:rPr>
-          <w:rFonts w:ascii="Times New Roman" w:cs="Times New Roman" w:eastAsia="Times New Roman" w:hAnsi="Times New Roman"/>
-          <w:sz w:val="24"/>
-          <w:szCs w:val="24"/>
-        </w:rPr>
-        <w:t xml:space="preserve"> can be turned on or off; records who paid for what and calculates balances between participants.</w:t>
-      </w:r>
-    </w:p>
-    <w:p>
-      <w:pPr>
-        <w:pStyle w:val="Heading2"/>
-        <w:spacing w:after="100" w:before="180"/>
-      </w:pPr>
-      <w:r>
-        <w:rPr>
-          <w:rFonts w:ascii="Times New Roman" w:cs="Times New Roman" w:eastAsia="Times New Roman" w:hAnsi="Times New Roman"/>
-          <w:b/>
-          <w:bCs/>
-          <w:color w:val="000000"/>
-          <w:sz w:val="24"/>
-          <w:szCs w:val="24"/>
-        </w:rPr>
-        <w:t xml:space="preserve">7.3 Community Features</w:t>
-      </w:r>
-    </w:p>
-    <w:p>
-      <w:pPr>
-        <w:pStyle w:val="ListParagraph"/>
-        <w:numPr>
-          <w:ilvl w:val="0"/>
-          <w:numId w:val="2"/>
-        </w:numPr>
-        <w:spacing w:after="80" w:line="300"/>
-        <w:jc w:val="both"/>
-      </w:pPr>
-      <w:r>
-        <w:rPr>
-          <w:rFonts w:ascii="Times New Roman" w:cs="Times New Roman" w:eastAsia="Times New Roman" w:hAnsi="Times New Roman"/>
-          <w:b/>
-          <w:bCs/>
-          <w:sz w:val="24"/>
-          <w:szCs w:val="24"/>
-        </w:rPr>
-        <w:t xml:space="preserve">Public feed:</w:t>
-      </w:r>
-      <w:r>
-        <w:rPr>
-          <w:rFonts w:ascii="Times New Roman" w:cs="Times New Roman" w:eastAsia="Times New Roman" w:hAnsi="Times New Roman"/>
-          <w:sz w:val="24"/>
-          <w:szCs w:val="24"/>
-        </w:rPr>
-        <w:t xml:space="preserve"> users publish posts with photos, short reviews, approximate costs and the best time to visit a place.</w:t>
-      </w:r>
-    </w:p>
-    <w:p>
-      <w:pPr>
-        <w:pStyle w:val="ListParagraph"/>
-        <w:numPr>
-          <w:ilvl w:val="0"/>
-          <w:numId w:val="2"/>
-        </w:numPr>
-        <w:spacing w:after="80" w:line="300"/>
-        <w:jc w:val="both"/>
-      </w:pPr>
-      <w:r>
-        <w:rPr>
-          <w:rFonts w:ascii="Times New Roman" w:cs="Times New Roman" w:eastAsia="Times New Roman" w:hAnsi="Times New Roman"/>
-          <w:b/>
-          <w:bCs/>
-          <w:sz w:val="24"/>
-          <w:szCs w:val="24"/>
-        </w:rPr>
-        <w:t xml:space="preserve">Posts linked to places:</w:t>
-      </w:r>
-      <w:r>
-        <w:rPr>
-          <w:rFonts w:ascii="Times New Roman" w:cs="Times New Roman" w:eastAsia="Times New Roman" w:hAnsi="Times New Roman"/>
-          <w:sz w:val="24"/>
-          <w:szCs w:val="24"/>
-        </w:rPr>
-        <w:t xml:space="preserve"> posts are attached to places on the map and shown next to the application's recommendations.</w:t>
-      </w:r>
-    </w:p>
-    <w:p>
-      <w:pPr>
-        <w:pStyle w:val="ListParagraph"/>
-        <w:numPr>
-          <w:ilvl w:val="0"/>
-          <w:numId w:val="2"/>
-        </w:numPr>
-        <w:spacing w:after="80" w:line="300"/>
-        <w:jc w:val="both"/>
-      </w:pPr>
-      <w:r>
-        <w:rPr>
-          <w:rFonts w:ascii="Times New Roman" w:cs="Times New Roman" w:eastAsia="Times New Roman" w:hAnsi="Times New Roman"/>
-          <w:b/>
-          <w:bCs/>
-          <w:sz w:val="24"/>
-          <w:szCs w:val="24"/>
-        </w:rPr>
-        <w:t xml:space="preserve">Add to plan:</w:t>
-      </w:r>
-      <w:r>
-        <w:rPr>
-          <w:rFonts w:ascii="Times New Roman" w:cs="Times New Roman" w:eastAsia="Times New Roman" w:hAnsi="Times New Roman"/>
-          <w:sz w:val="24"/>
-          <w:szCs w:val="24"/>
-        </w:rPr>
-        <w:t xml:space="preserve"> a place from a post can be added to the user's own trip in one tap.</w:t>
-      </w:r>
-    </w:p>
-    <w:p>
-      <w:pPr>
-        <w:pStyle w:val="ListParagraph"/>
-        <w:numPr>
-          <w:ilvl w:val="0"/>
-          <w:numId w:val="2"/>
-        </w:numPr>
-        <w:spacing w:after="80" w:line="300"/>
-        <w:jc w:val="both"/>
-      </w:pPr>
-      <w:r>
-        <w:rPr>
-          <w:rFonts w:ascii="Times New Roman" w:cs="Times New Roman" w:eastAsia="Times New Roman" w:hAnsi="Times New Roman"/>
-          <w:b/>
-          <w:bCs/>
-          <w:sz w:val="24"/>
-          <w:szCs w:val="24"/>
-        </w:rPr>
-        <w:t xml:space="preserve">Moderation:</w:t>
-      </w:r>
-      <w:r>
-        <w:rPr>
-          <w:rFonts w:ascii="Times New Roman" w:cs="Times New Roman" w:eastAsia="Times New Roman" w:hAnsi="Times New Roman"/>
-          <w:sz w:val="24"/>
-          <w:szCs w:val="24"/>
-        </w:rPr>
-        <w:t xml:space="preserve"> inappropriate posts can be reported and are reviewed.</w:t>
-      </w:r>
-    </w:p>
-    <w:p>
-      <w:pPr>
-        <w:pStyle w:val="Heading2"/>
-        <w:spacing w:after="100" w:before="180"/>
-      </w:pPr>
-      <w:r>
-        <w:rPr>
-          <w:rFonts w:ascii="Times New Roman" w:cs="Times New Roman" w:eastAsia="Times New Roman" w:hAnsi="Times New Roman"/>
-          <w:b/>
-          <w:bCs/>
-          <w:color w:val="000000"/>
-          <w:sz w:val="24"/>
-          <w:szCs w:val="24"/>
-        </w:rPr>
-        <w:t xml:space="preserve">7.4 Smart and Additional Features</w:t>
-      </w:r>
-    </w:p>
-    <w:p>
-      <w:pPr>
-        <w:pStyle w:val="ListParagraph"/>
-        <w:numPr>
-          <w:ilvl w:val="0"/>
-          <w:numId w:val="2"/>
-        </w:numPr>
-        <w:spacing w:after="80" w:line="300"/>
-        <w:jc w:val="both"/>
-      </w:pPr>
-      <w:r>
-        <w:rPr>
-          <w:rFonts w:ascii="Times New Roman" w:cs="Times New Roman" w:eastAsia="Times New Roman" w:hAnsi="Times New Roman"/>
-          <w:b/>
-          <w:bCs/>
-          <w:sz w:val="24"/>
-          <w:szCs w:val="24"/>
-        </w:rPr>
-        <w:t xml:space="preserve">Personalization by interests:</w:t>
-      </w:r>
-      <w:r>
-        <w:rPr>
-          <w:rFonts w:ascii="Times New Roman" w:cs="Times New Roman" w:eastAsia="Times New Roman" w:hAnsi="Times New Roman"/>
-          <w:sz w:val="24"/>
-          <w:szCs w:val="24"/>
-        </w:rPr>
-        <w:t xml:space="preserve"> the plan adapts to the selected interests (food, culture, nature, nightlife, shopping).</w:t>
-      </w:r>
-    </w:p>
-    <w:p>
-      <w:pPr>
-        <w:pStyle w:val="ListParagraph"/>
-        <w:numPr>
-          <w:ilvl w:val="0"/>
-          <w:numId w:val="2"/>
-        </w:numPr>
-        <w:spacing w:after="80" w:line="300"/>
-        <w:jc w:val="both"/>
-      </w:pPr>
-      <w:r>
-        <w:rPr>
-          <w:rFonts w:ascii="Times New Roman" w:cs="Times New Roman" w:eastAsia="Times New Roman" w:hAnsi="Times New Roman"/>
-          <w:b/>
-          <w:bCs/>
-          <w:sz w:val="24"/>
-          <w:szCs w:val="24"/>
-        </w:rPr>
-        <w:t xml:space="preserve">Trip type adaptation:</w:t>
-      </w:r>
-      <w:r>
-        <w:rPr>
-          <w:rFonts w:ascii="Times New Roman" w:cs="Times New Roman" w:eastAsia="Times New Roman" w:hAnsi="Times New Roman"/>
-          <w:sz w:val="24"/>
-          <w:szCs w:val="24"/>
-        </w:rPr>
-        <w:t xml:space="preserve"> for example, child-friendly places for families or a compact schedule for business travelers.</w:t>
-      </w:r>
-    </w:p>
-    <w:p>
-      <w:pPr>
-        <w:pStyle w:val="ListParagraph"/>
-        <w:numPr>
-          <w:ilvl w:val="0"/>
-          <w:numId w:val="2"/>
-        </w:numPr>
-        <w:spacing w:after="80" w:line="300"/>
-        <w:jc w:val="both"/>
-      </w:pPr>
-      <w:r>
-        <w:rPr>
-          <w:rFonts w:ascii="Times New Roman" w:cs="Times New Roman" w:eastAsia="Times New Roman" w:hAnsi="Times New Roman"/>
-          <w:b/>
-          <w:bCs/>
-          <w:sz w:val="24"/>
-          <w:szCs w:val="24"/>
-        </w:rPr>
-        <w:t xml:space="preserve">Weather awareness:</w:t>
-      </w:r>
-      <w:r>
-        <w:rPr>
-          <w:rFonts w:ascii="Times New Roman" w:cs="Times New Roman" w:eastAsia="Times New Roman" w:hAnsi="Times New Roman"/>
-          <w:sz w:val="24"/>
-          <w:szCs w:val="24"/>
-        </w:rPr>
-        <w:t xml:space="preserve"> on rainy or very cold days, indoor places are suggested instead of outdoor ones.</w:t>
-      </w:r>
-    </w:p>
-    <w:p>
-      <w:pPr>
-        <w:pStyle w:val="ListParagraph"/>
-        <w:numPr>
-          <w:ilvl w:val="0"/>
-          <w:numId w:val="2"/>
-        </w:numPr>
-        <w:spacing w:after="80" w:line="300"/>
-        <w:jc w:val="both"/>
-      </w:pPr>
-      <w:r>
-        <w:rPr>
-          <w:rFonts w:ascii="Times New Roman" w:cs="Times New Roman" w:eastAsia="Times New Roman" w:hAnsi="Times New Roman"/>
-          <w:b/>
-          <w:bCs/>
-          <w:sz w:val="24"/>
-          <w:szCs w:val="24"/>
-        </w:rPr>
-        <w:t xml:space="preserve">Local events:</w:t>
-      </w:r>
-      <w:r>
-        <w:rPr>
-          <w:rFonts w:ascii="Times New Roman" w:cs="Times New Roman" w:eastAsia="Times New Roman" w:hAnsi="Times New Roman"/>
-          <w:sz w:val="24"/>
-          <w:szCs w:val="24"/>
-        </w:rPr>
-        <w:t xml:space="preserve"> festivals, holidays, concerts and exhibitions on the specific travel dates are included in the plan.</w:t>
-      </w:r>
-    </w:p>
-    <w:p>
-      <w:pPr>
-        <w:pStyle w:val="ListParagraph"/>
-        <w:numPr>
-          <w:ilvl w:val="0"/>
-          <w:numId w:val="2"/>
-        </w:numPr>
-        <w:spacing w:after="80" w:line="300"/>
-        <w:jc w:val="both"/>
-      </w:pPr>
-      <w:r>
-        <w:rPr>
-          <w:rFonts w:ascii="Times New Roman" w:cs="Times New Roman" w:eastAsia="Times New Roman" w:hAnsi="Times New Roman"/>
-          <w:b/>
-          <w:bCs/>
-          <w:sz w:val="24"/>
-          <w:szCs w:val="24"/>
-        </w:rPr>
-        <w:t xml:space="preserve">AI travel assistant:</w:t>
-      </w:r>
-      <w:r>
-        <w:rPr>
-          <w:rFonts w:ascii="Times New Roman" w:cs="Times New Roman" w:eastAsia="Times New Roman" w:hAnsi="Times New Roman"/>
-          <w:sz w:val="24"/>
-          <w:szCs w:val="24"/>
-        </w:rPr>
-        <w:t xml:space="preserve"> a chat inside each trip that answers questions about the plan and changes it on request (see Section 8.2).</w:t>
-      </w:r>
-    </w:p>
-    <w:p>
-      <w:pPr>
-        <w:pStyle w:val="ListParagraph"/>
-        <w:numPr>
-          <w:ilvl w:val="0"/>
-          <w:numId w:val="2"/>
-        </w:numPr>
-        <w:spacing w:after="80" w:line="300"/>
-        <w:jc w:val="both"/>
-      </w:pPr>
-      <w:r>
-        <w:rPr>
-          <w:rFonts w:ascii="Times New Roman" w:cs="Times New Roman" w:eastAsia="Times New Roman" w:hAnsi="Times New Roman"/>
-          <w:b/>
-          <w:bCs/>
-          <w:sz w:val="24"/>
-          <w:szCs w:val="24"/>
-        </w:rPr>
-        <w:t xml:space="preserve">Booking links:</w:t>
-      </w:r>
-      <w:r>
-        <w:rPr>
-          <w:rFonts w:ascii="Times New Roman" w:cs="Times New Roman" w:eastAsia="Times New Roman" w:hAnsi="Times New Roman"/>
-          <w:sz w:val="24"/>
-          <w:szCs w:val="24"/>
-        </w:rPr>
-        <w:t xml:space="preserve"> quick links to booking platforms and map services (for example, Booking.com and 2GIS).</w:t>
-      </w:r>
-    </w:p>
-    <w:p>
-      <w:pPr>
-        <w:pStyle w:val="ListParagraph"/>
-        <w:numPr>
-          <w:ilvl w:val="0"/>
-          <w:numId w:val="2"/>
-        </w:numPr>
-        <w:spacing w:after="80" w:line="300"/>
-        <w:jc w:val="both"/>
-      </w:pPr>
-      <w:r>
-        <w:rPr>
-          <w:rFonts w:ascii="Times New Roman" w:cs="Times New Roman" w:eastAsia="Times New Roman" w:hAnsi="Times New Roman"/>
-          <w:b/>
-          <w:bCs/>
-          <w:sz w:val="24"/>
-          <w:szCs w:val="24"/>
-        </w:rPr>
-        <w:t xml:space="preserve">Offline access:</w:t>
-      </w:r>
-      <w:r>
-        <w:rPr>
-          <w:rFonts w:ascii="Times New Roman" w:cs="Times New Roman" w:eastAsia="Times New Roman" w:hAnsi="Times New Roman"/>
-          <w:sz w:val="24"/>
-          <w:szCs w:val="24"/>
-        </w:rPr>
-        <w:t xml:space="preserve"> the plan and the map remain available without an internet connection.</w:t>
-      </w:r>
-    </w:p>
-    <w:p>
-      <w:pPr>
-        <w:pStyle w:val="Heading1"/>
-        <w:spacing w:after="120" w:before="240"/>
-      </w:pPr>
-      <w:r>
-        <w:rPr>
-          <w:rFonts w:ascii="Times New Roman" w:cs="Times New Roman" w:eastAsia="Times New Roman" w:hAnsi="Times New Roman"/>
-          <w:b/>
-          <w:bCs/>
-          <w:color w:val="000000"/>
-          <w:sz w:val="28"/>
-          <w:szCs w:val="28"/>
-        </w:rPr>
-        <w:t xml:space="preserve">8. Role of Artificial Intelligence</w:t>
-      </w:r>
-    </w:p>
-    <w:p>
-      <w:pPr>
-        <w:pStyle w:val="Heading2"/>
-        <w:spacing w:after="100" w:before="180"/>
-      </w:pPr>
-      <w:r>
-        <w:rPr>
-          <w:rFonts w:ascii="Times New Roman" w:cs="Times New Roman" w:eastAsia="Times New Roman" w:hAnsi="Times New Roman"/>
-          <w:b/>
-          <w:bCs/>
-          <w:color w:val="000000"/>
-          <w:sz w:val="24"/>
-          <w:szCs w:val="24"/>
-        </w:rPr>
-        <w:t xml:space="preserve">8.1 AI in Plan Generation</w:t>
-      </w:r>
-    </w:p>
-    <w:p>
-      <w:pPr>
-        <w:spacing w:after="120" w:line="300"/>
-        <w:jc w:val="both"/>
-      </w:pPr>
-      <w:r>
-        <w:rPr>
-          <w:rFonts w:ascii="Times New Roman" w:cs="Times New Roman" w:eastAsia="Times New Roman" w:hAnsi="Times New Roman"/>
-          <w:sz w:val="24"/>
-          <w:szCs w:val="24"/>
-        </w:rPr>
-        <w:t xml:space="preserve">Artificial intelligence is a central part of the application, because manually written rules cannot handle the large number of possible combinations of cities, budgets, interests and group preferences. AI is used in the following tasks:</w:t>
-      </w:r>
-    </w:p>
-    <w:p>
-      <w:pPr>
-        <w:pStyle w:val="ListParagraph"/>
-        <w:numPr>
-          <w:ilvl w:val="0"/>
-          <w:numId w:val="2"/>
-        </w:numPr>
-        <w:spacing w:after="80" w:line="300"/>
-        <w:jc w:val="both"/>
-      </w:pPr>
-      <w:r>
-        <w:rPr>
-          <w:rFonts w:ascii="Times New Roman" w:cs="Times New Roman" w:eastAsia="Times New Roman" w:hAnsi="Times New Roman"/>
-          <w:b/>
-          <w:bCs/>
-          <w:sz w:val="24"/>
-          <w:szCs w:val="24"/>
-        </w:rPr>
-        <w:t xml:space="preserve">Plan generation:</w:t>
-      </w:r>
-      <w:r>
-        <w:rPr>
-          <w:rFonts w:ascii="Times New Roman" w:cs="Times New Roman" w:eastAsia="Times New Roman" w:hAnsi="Times New Roman"/>
-          <w:sz w:val="24"/>
-          <w:szCs w:val="24"/>
-        </w:rPr>
-        <w:t xml:space="preserve"> building a day-by-day itinerary from the user's input and the database of places.</w:t>
-      </w:r>
-    </w:p>
-    <w:p>
-      <w:pPr>
-        <w:pStyle w:val="ListParagraph"/>
-        <w:numPr>
-          <w:ilvl w:val="0"/>
-          <w:numId w:val="2"/>
-        </w:numPr>
-        <w:spacing w:after="80" w:line="300"/>
-        <w:jc w:val="both"/>
-      </w:pPr>
-      <w:r>
-        <w:rPr>
-          <w:rFonts w:ascii="Times New Roman" w:cs="Times New Roman" w:eastAsia="Times New Roman" w:hAnsi="Times New Roman"/>
-          <w:b/>
-          <w:bCs/>
-          <w:sz w:val="24"/>
-          <w:szCs w:val="24"/>
-        </w:rPr>
-        <w:t xml:space="preserve">Budget-aware selection:</w:t>
-      </w:r>
-      <w:r>
-        <w:rPr>
-          <w:rFonts w:ascii="Times New Roman" w:cs="Times New Roman" w:eastAsia="Times New Roman" w:hAnsi="Times New Roman"/>
-          <w:sz w:val="24"/>
-          <w:szCs w:val="24"/>
-        </w:rPr>
-        <w:t xml:space="preserve"> choosing places and hotels so that the total cost stays within the budget.</w:t>
-      </w:r>
-    </w:p>
-    <w:p>
-      <w:pPr>
-        <w:pStyle w:val="ListParagraph"/>
-        <w:numPr>
-          <w:ilvl w:val="0"/>
-          <w:numId w:val="2"/>
-        </w:numPr>
-        <w:spacing w:after="80" w:line="300"/>
-        <w:jc w:val="both"/>
-      </w:pPr>
-      <w:r>
-        <w:rPr>
-          <w:rFonts w:ascii="Times New Roman" w:cs="Times New Roman" w:eastAsia="Times New Roman" w:hAnsi="Times New Roman"/>
-          <w:b/>
-          <w:bCs/>
-          <w:sz w:val="24"/>
-          <w:szCs w:val="24"/>
-        </w:rPr>
-        <w:t xml:space="preserve">Personalization:</w:t>
-      </w:r>
-      <w:r>
-        <w:rPr>
-          <w:rFonts w:ascii="Times New Roman" w:cs="Times New Roman" w:eastAsia="Times New Roman" w:hAnsi="Times New Roman"/>
-          <w:sz w:val="24"/>
-          <w:szCs w:val="24"/>
-        </w:rPr>
-        <w:t xml:space="preserve"> taking into account interests, trip type and the results of group voting.</w:t>
-      </w:r>
-    </w:p>
-    <w:p>
-      <w:pPr>
-        <w:pStyle w:val="ListParagraph"/>
-        <w:numPr>
-          <w:ilvl w:val="0"/>
-          <w:numId w:val="2"/>
-        </w:numPr>
-        <w:spacing w:after="80" w:line="300"/>
-        <w:jc w:val="both"/>
-      </w:pPr>
-      <w:r>
-        <w:rPr>
-          <w:rFonts w:ascii="Times New Roman" w:cs="Times New Roman" w:eastAsia="Times New Roman" w:hAnsi="Times New Roman"/>
-          <w:b/>
-          <w:bCs/>
-          <w:sz w:val="24"/>
-          <w:szCs w:val="24"/>
-        </w:rPr>
-        <w:t xml:space="preserve">Re-planning:</w:t>
-      </w:r>
-      <w:r>
-        <w:rPr>
-          <w:rFonts w:ascii="Times New Roman" w:cs="Times New Roman" w:eastAsia="Times New Roman" w:hAnsi="Times New Roman"/>
-          <w:sz w:val="24"/>
-          <w:szCs w:val="24"/>
-        </w:rPr>
-        <w:t xml:space="preserve"> adjusting the plan when the weather changes, when a place is removed, or when the group votes against an option.</w:t>
-      </w:r>
-    </w:p>
-    <w:p>
-      <w:pPr>
-        <w:pStyle w:val="ListParagraph"/>
-        <w:numPr>
-          <w:ilvl w:val="0"/>
-          <w:numId w:val="2"/>
-        </w:numPr>
-        <w:spacing w:after="80" w:line="300"/>
-        <w:jc w:val="both"/>
-      </w:pPr>
-      <w:r>
-        <w:rPr>
-          <w:rFonts w:ascii="Times New Roman" w:cs="Times New Roman" w:eastAsia="Times New Roman" w:hAnsi="Times New Roman"/>
-          <w:b/>
-          <w:bCs/>
-          <w:sz w:val="24"/>
-          <w:szCs w:val="24"/>
-        </w:rPr>
-        <w:t xml:space="preserve">Natural language requests:</w:t>
-      </w:r>
-      <w:r>
-        <w:rPr>
-          <w:rFonts w:ascii="Times New Roman" w:cs="Times New Roman" w:eastAsia="Times New Roman" w:hAnsi="Times New Roman"/>
-          <w:sz w:val="24"/>
-          <w:szCs w:val="24"/>
-        </w:rPr>
-        <w:t xml:space="preserve"> allowing users to ask for changes in simple words (handled by the AI assistant described below).</w:t>
-      </w:r>
-    </w:p>
-    <w:p>
-      <w:pPr>
-        <w:spacing w:after="120" w:line="300"/>
-        <w:jc w:val="both"/>
-      </w:pPr>
-      <w:r>
-        <w:rPr>
-          <w:rFonts w:ascii="Times New Roman" w:cs="Times New Roman" w:eastAsia="Times New Roman" w:hAnsi="Times New Roman"/>
-          <w:sz w:val="24"/>
-          <w:szCs w:val="24"/>
-        </w:rPr>
-        <w:t xml:space="preserve">To make the plans reliable, AI will work together with structured data about real places (address, price level, working hours, rating), so that it only recommends places that actually exist and are open on the planned day.</w:t>
-      </w:r>
-    </w:p>
-    <w:p>
-      <w:pPr>
-        <w:pStyle w:val="Heading2"/>
-        <w:spacing w:after="100" w:before="180"/>
-      </w:pPr>
-      <w:r>
-        <w:rPr>
-          <w:rFonts w:ascii="Times New Roman" w:cs="Times New Roman" w:eastAsia="Times New Roman" w:hAnsi="Times New Roman"/>
-          <w:b/>
-          <w:bCs/>
-          <w:color w:val="000000"/>
-          <w:sz w:val="24"/>
-          <w:szCs w:val="24"/>
-        </w:rPr>
-        <w:t xml:space="preserve">8.2 AI Travel Assistant</w:t>
-      </w:r>
-    </w:p>
-    <w:p>
-      <w:pPr>
-        <w:spacing w:after="120" w:line="300"/>
-        <w:jc w:val="both"/>
-      </w:pPr>
-      <w:r>
-        <w:rPr>
-          <w:rFonts w:ascii="Times New Roman" w:cs="Times New Roman" w:eastAsia="Times New Roman" w:hAnsi="Times New Roman"/>
-          <w:sz w:val="24"/>
-          <w:szCs w:val="24"/>
-        </w:rPr>
-        <w:t xml:space="preserve">Many applications today include a general-purpose AI chatbot, but such chatbots are often not very helpful: they give generic answers and do not know anything about the user's actual situation. Our AI assistant is designed differently. It is not a separate chatbot but a part of each trip: it knows the trip's dates, budget, participants, plan, votes and weather, and it can make changes to the plan directly. Every change proposed by the assistant is shown to the user for confirmation before it is applied.</w:t>
-      </w:r>
-    </w:p>
-    <w:p>
-      <w:pPr>
-        <w:spacing w:after="120" w:line="300"/>
-        <w:jc w:val="both"/>
-      </w:pPr>
-      <w:r>
-        <w:rPr>
-          <w:rFonts w:ascii="Times New Roman" w:cs="Times New Roman" w:eastAsia="Times New Roman" w:hAnsi="Times New Roman"/>
-          <w:sz w:val="24"/>
-          <w:szCs w:val="24"/>
-        </w:rPr>
-        <w:t xml:space="preserve">Examples of what the assistant can do:</w:t>
-      </w:r>
-    </w:p>
-    <w:p>
-      <w:pPr>
-        <w:pStyle w:val="ListParagraph"/>
-        <w:numPr>
-          <w:ilvl w:val="0"/>
-          <w:numId w:val="2"/>
-        </w:numPr>
-        <w:spacing w:after="80" w:line="300"/>
-        <w:jc w:val="both"/>
-      </w:pPr>
-      <w:r>
-        <w:rPr>
-          <w:rFonts w:ascii="Times New Roman" w:cs="Times New Roman" w:eastAsia="Times New Roman" w:hAnsi="Times New Roman"/>
-          <w:b/>
-          <w:bCs/>
-          <w:sz w:val="24"/>
-          <w:szCs w:val="24"/>
-        </w:rPr>
-        <w:t xml:space="preserve">Change the plan:</w:t>
-      </w:r>
-      <w:r>
-        <w:rPr>
-          <w:rFonts w:ascii="Times New Roman" w:cs="Times New Roman" w:eastAsia="Times New Roman" w:hAnsi="Times New Roman"/>
-          <w:sz w:val="24"/>
-          <w:szCs w:val="24"/>
-        </w:rPr>
-        <w:t xml:space="preserve"> "Make Day 2 cheaper", "Replace this restaurant with a place that has vegetarian food", "Add something for children on Saturday".</w:t>
-      </w:r>
-    </w:p>
-    <w:p>
-      <w:pPr>
-        <w:pStyle w:val="ListParagraph"/>
-        <w:numPr>
-          <w:ilvl w:val="0"/>
-          <w:numId w:val="2"/>
-        </w:numPr>
-        <w:spacing w:after="80" w:line="300"/>
-        <w:jc w:val="both"/>
-      </w:pPr>
-      <w:r>
-        <w:rPr>
-          <w:rFonts w:ascii="Times New Roman" w:cs="Times New Roman" w:eastAsia="Times New Roman" w:hAnsi="Times New Roman"/>
-          <w:b/>
-          <w:bCs/>
-          <w:sz w:val="24"/>
-          <w:szCs w:val="24"/>
-        </w:rPr>
-        <w:t xml:space="preserve">Answer questions about the trip:</w:t>
-      </w:r>
-      <w:r>
-        <w:rPr>
-          <w:rFonts w:ascii="Times New Roman" w:cs="Times New Roman" w:eastAsia="Times New Roman" w:hAnsi="Times New Roman"/>
-          <w:sz w:val="24"/>
-          <w:szCs w:val="24"/>
-        </w:rPr>
-        <w:t xml:space="preserve"> "How much money do we have left for Day 3?", "How far is the hotel from Baiterek?", "What should we wear on Friday?".</w:t>
-      </w:r>
-    </w:p>
-    <w:p>
-      <w:pPr>
-        <w:pStyle w:val="ListParagraph"/>
-        <w:numPr>
-          <w:ilvl w:val="0"/>
-          <w:numId w:val="2"/>
-        </w:numPr>
-        <w:spacing w:after="80" w:line="300"/>
-        <w:jc w:val="both"/>
-      </w:pPr>
-      <w:r>
-        <w:rPr>
-          <w:rFonts w:ascii="Times New Roman" w:cs="Times New Roman" w:eastAsia="Times New Roman" w:hAnsi="Times New Roman"/>
-          <w:b/>
-          <w:bCs/>
-          <w:sz w:val="24"/>
-          <w:szCs w:val="24"/>
-        </w:rPr>
-        <w:t xml:space="preserve">React to changes:</w:t>
-      </w:r>
-      <w:r>
-        <w:rPr>
-          <w:rFonts w:ascii="Times New Roman" w:cs="Times New Roman" w:eastAsia="Times New Roman" w:hAnsi="Times New Roman"/>
-          <w:sz w:val="24"/>
-          <w:szCs w:val="24"/>
-        </w:rPr>
-        <w:t xml:space="preserve"> if rain is forecast or a place turns out to be closed, the assistant suggests a ready replacement.</w:t>
-      </w:r>
-    </w:p>
-    <w:p>
-      <w:pPr>
-        <w:pStyle w:val="ListParagraph"/>
-        <w:numPr>
-          <w:ilvl w:val="0"/>
-          <w:numId w:val="2"/>
-        </w:numPr>
-        <w:spacing w:after="80" w:line="300"/>
-        <w:jc w:val="both"/>
-      </w:pPr>
-      <w:r>
-        <w:rPr>
-          <w:rFonts w:ascii="Times New Roman" w:cs="Times New Roman" w:eastAsia="Times New Roman" w:hAnsi="Times New Roman"/>
-          <w:b/>
-          <w:bCs/>
-          <w:sz w:val="24"/>
-          <w:szCs w:val="24"/>
-        </w:rPr>
-        <w:t xml:space="preserve">Help the group decide:</w:t>
-      </w:r>
-      <w:r>
-        <w:rPr>
-          <w:rFonts w:ascii="Times New Roman" w:cs="Times New Roman" w:eastAsia="Times New Roman" w:hAnsi="Times New Roman"/>
-          <w:sz w:val="24"/>
-          <w:szCs w:val="24"/>
-        </w:rPr>
-        <w:t xml:space="preserve"> summarize votes and comments, for example "3 of 4 participants prefer Hotel 2; one person is worried about the price".</w:t>
-      </w:r>
-    </w:p>
-    <w:p>
-      <w:pPr>
-        <w:pStyle w:val="ListParagraph"/>
-        <w:numPr>
-          <w:ilvl w:val="0"/>
-          <w:numId w:val="2"/>
-        </w:numPr>
-        <w:spacing w:after="80" w:line="300"/>
-        <w:jc w:val="both"/>
-      </w:pPr>
-      <w:r>
-        <w:rPr>
-          <w:rFonts w:ascii="Times New Roman" w:cs="Times New Roman" w:eastAsia="Times New Roman" w:hAnsi="Times New Roman"/>
-          <w:b/>
-          <w:bCs/>
-          <w:sz w:val="24"/>
-          <w:szCs w:val="24"/>
-        </w:rPr>
-        <w:t xml:space="preserve">Give local advice:</w:t>
-      </w:r>
-      <w:r>
-        <w:rPr>
-          <w:rFonts w:ascii="Times New Roman" w:cs="Times New Roman" w:eastAsia="Times New Roman" w:hAnsi="Times New Roman"/>
-          <w:sz w:val="24"/>
-          <w:szCs w:val="24"/>
-        </w:rPr>
-        <w:t xml:space="preserve"> tips about transport, payment methods and local customs, based on verified information and the results of our survey of Astana residents.</w:t>
-      </w:r>
-    </w:p>
-    <w:p>
-      <w:pPr>
-        <w:spacing w:after="120" w:line="300"/>
-        <w:jc w:val="both"/>
-      </w:pPr>
-      <w:r>
-        <w:rPr>
-          <w:rFonts w:ascii="Times New Roman" w:cs="Times New Roman" w:eastAsia="Times New Roman" w:hAnsi="Times New Roman"/>
-          <w:sz w:val="24"/>
-          <w:szCs w:val="24"/>
-        </w:rPr>
-        <w:t xml:space="preserve">The assistant has clear limits: it only recommends places that exist in the application's database, it always shows the price and the effect on the budget, and it does not make bookings or payments on behalf of the user. Whether users find the assistant useful will be checked in the survey and during user testing; if it does not prove useful, it can be reduced to the core plan-editing commands.</w:t>
-      </w:r>
-    </w:p>
-    <w:p>
-      <w:pPr>
-        <w:pStyle w:val="Heading1"/>
-        <w:spacing w:after="120" w:before="240"/>
-      </w:pPr>
-      <w:r>
-        <w:rPr>
-          <w:rFonts w:ascii="Times New Roman" w:cs="Times New Roman" w:eastAsia="Times New Roman" w:hAnsi="Times New Roman"/>
-          <w:b/>
-          <w:bCs/>
-          <w:color w:val="000000"/>
-          <w:sz w:val="28"/>
-          <w:szCs w:val="28"/>
-        </w:rPr>
-        <w:t xml:space="preserve">9. Proposed Technology Stack</w:t>
-      </w:r>
-    </w:p>
-    <w:p>
-      <w:pPr>
-        <w:spacing w:after="120" w:line="300"/>
-        <w:jc w:val="both"/>
-      </w:pPr>
-      <w:r>
-        <w:rPr>
-          <w:rFonts w:ascii="Times New Roman" w:cs="Times New Roman" w:eastAsia="Times New Roman" w:hAnsi="Times New Roman"/>
-          <w:sz w:val="24"/>
-          <w:szCs w:val="24"/>
-        </w:rPr>
-        <w:t xml:space="preserve">The technology stack is preliminary and may change during development.</w:t>
+        <w:t xml:space="preserve">9. Technology Stack</w:t>
       </w:r>
     </w:p>
     <w:tbl>
@@ -4369,7 +3586,7 @@
                 <w:sz w:val="22"/>
                 <w:szCs w:val="22"/>
               </w:rPr>
-              <w:t xml:space="preserve">Proposed technology</w:t>
+              <w:t xml:space="preserve">Selected technology (not yet implemented)</w:t>
             </w:r>
           </w:p>
         </w:tc>
@@ -4495,7 +3712,7 @@
                 <w:sz w:val="22"/>
                 <w:szCs w:val="22"/>
               </w:rPr>
-              <w:t xml:space="preserve">Supabase: PostgreSQL database, authentication, row-level access policies and server functions</w:t>
+              <w:t xml:space="preserve">Supabase: PostgreSQL, authentication, row-level security, REST and Realtime</w:t>
             </w:r>
           </w:p>
         </w:tc>
@@ -4529,7 +3746,7 @@
                 <w:sz w:val="22"/>
                 <w:szCs w:val="22"/>
               </w:rPr>
-              <w:t xml:space="preserve">Real-time collaboration</w:t>
+              <w:t xml:space="preserve">AI</w:t>
             </w:r>
           </w:p>
         </w:tc>
@@ -4558,7 +3775,7 @@
                 <w:sz w:val="22"/>
                 <w:szCs w:val="22"/>
               </w:rPr>
-              <w:t xml:space="preserve">Supabase Realtime subscriptions for the shared plan, votes, comments and trip chat</w:t>
+              <w:t xml:space="preserve">Large language model API called from the server; hybrid design with catalog and code validation</w:t>
             </w:r>
           </w:p>
         </w:tc>
@@ -4592,7 +3809,7 @@
                 <w:sz w:val="22"/>
                 <w:szCs w:val="22"/>
               </w:rPr>
-              <w:t xml:space="preserve">AI module</w:t>
+              <w:t xml:space="preserve">Maps</w:t>
             </w:r>
           </w:p>
         </w:tc>
@@ -4621,7 +3838,7 @@
                 <w:sz w:val="22"/>
                 <w:szCs w:val="22"/>
               </w:rPr>
-              <w:t xml:space="preserve">Large language model API for plan generation and re-planning</w:t>
+              <w:t xml:space="preserve">Google Maps Platform (2GIS as an alternative), to be tested for Astana</w:t>
             </w:r>
           </w:p>
         </w:tc>
@@ -4655,7 +3872,7 @@
                 <w:sz w:val="22"/>
                 <w:szCs w:val="22"/>
               </w:rPr>
-              <w:t xml:space="preserve">Maps and places</w:t>
+              <w:t xml:space="preserve">Budget calculation</w:t>
             </w:r>
           </w:p>
         </w:tc>
@@ -4684,196 +3901,7 @@
                 <w:sz w:val="22"/>
                 <w:szCs w:val="22"/>
               </w:rPr>
-              <w:t xml:space="preserve">Google Maps / 2GIS API for maps, routes and place data</w:t>
-            </w:r>
-          </w:p>
-        </w:tc>
-      </w:tr>
-      <w:tr>
-        <w:trPr>
-          <w:tblHeader w:val="false"/>
-        </w:trPr>
-        <w:tc>
-          <w:tcPr>
-            <w:tcW w:type="dxa" w:w="2800"/>
-            <w:tcBorders>
-              <w:top w:val="single" w:color="000000" w:sz="4"/>
-              <w:left w:val="single" w:color="000000" w:sz="4"/>
-              <w:bottom w:val="single" w:color="000000" w:sz="4"/>
-              <w:right w:val="single" w:color="000000" w:sz="4"/>
-            </w:tcBorders>
-            <w:tcMar>
-              <w:top w:type="dxa" w:w="60"/>
-              <w:left w:type="dxa" w:w="100"/>
-              <w:bottom w:type="dxa" w:w="60"/>
-              <w:right w:type="dxa" w:w="100"/>
-            </w:tcMar>
-          </w:tcPr>
-          <w:p>
-            <w:r>
-              <w:rPr>
-                <w:rFonts w:ascii="Times New Roman" w:cs="Times New Roman" w:eastAsia="Times New Roman" w:hAnsi="Times New Roman"/>
-                <w:b w:val="false"/>
-                <w:bCs w:val="false"/>
-                <w:sz w:val="22"/>
-                <w:szCs w:val="22"/>
-              </w:rPr>
-              <w:t xml:space="preserve">Weather</w:t>
-            </w:r>
-          </w:p>
-        </w:tc>
-        <w:tc>
-          <w:tcPr>
-            <w:tcW w:type="dxa" w:w="6226"/>
-            <w:tcBorders>
-              <w:top w:val="single" w:color="000000" w:sz="4"/>
-              <w:left w:val="single" w:color="000000" w:sz="4"/>
-              <w:bottom w:val="single" w:color="000000" w:sz="4"/>
-              <w:right w:val="single" w:color="000000" w:sz="4"/>
-            </w:tcBorders>
-            <w:tcMar>
-              <w:top w:type="dxa" w:w="60"/>
-              <w:left w:type="dxa" w:w="100"/>
-              <w:bottom w:type="dxa" w:w="60"/>
-              <w:right w:type="dxa" w:w="100"/>
-            </w:tcMar>
-          </w:tcPr>
-          <w:p>
-            <w:r>
-              <w:rPr>
-                <w:rFonts w:ascii="Times New Roman" w:cs="Times New Roman" w:eastAsia="Times New Roman" w:hAnsi="Times New Roman"/>
-                <w:b w:val="false"/>
-                <w:bCs w:val="false"/>
-                <w:sz w:val="22"/>
-                <w:szCs w:val="22"/>
-              </w:rPr>
-              <w:t xml:space="preserve">Weather forecast API (for example, OpenWeatherMap)</w:t>
-            </w:r>
-          </w:p>
-        </w:tc>
-      </w:tr>
-      <w:tr>
-        <w:trPr>
-          <w:tblHeader w:val="false"/>
-        </w:trPr>
-        <w:tc>
-          <w:tcPr>
-            <w:tcW w:type="dxa" w:w="2800"/>
-            <w:tcBorders>
-              <w:top w:val="single" w:color="000000" w:sz="4"/>
-              <w:left w:val="single" w:color="000000" w:sz="4"/>
-              <w:bottom w:val="single" w:color="000000" w:sz="4"/>
-              <w:right w:val="single" w:color="000000" w:sz="4"/>
-            </w:tcBorders>
-            <w:tcMar>
-              <w:top w:type="dxa" w:w="60"/>
-              <w:left w:type="dxa" w:w="100"/>
-              <w:bottom w:type="dxa" w:w="60"/>
-              <w:right w:type="dxa" w:w="100"/>
-            </w:tcMar>
-          </w:tcPr>
-          <w:p>
-            <w:r>
-              <w:rPr>
-                <w:rFonts w:ascii="Times New Roman" w:cs="Times New Roman" w:eastAsia="Times New Roman" w:hAnsi="Times New Roman"/>
-                <w:b w:val="false"/>
-                <w:bCs w:val="false"/>
-                <w:sz w:val="22"/>
-                <w:szCs w:val="22"/>
-              </w:rPr>
-              <w:t xml:space="preserve">Events</w:t>
-            </w:r>
-          </w:p>
-        </w:tc>
-        <w:tc>
-          <w:tcPr>
-            <w:tcW w:type="dxa" w:w="6226"/>
-            <w:tcBorders>
-              <w:top w:val="single" w:color="000000" w:sz="4"/>
-              <w:left w:val="single" w:color="000000" w:sz="4"/>
-              <w:bottom w:val="single" w:color="000000" w:sz="4"/>
-              <w:right w:val="single" w:color="000000" w:sz="4"/>
-            </w:tcBorders>
-            <w:tcMar>
-              <w:top w:type="dxa" w:w="60"/>
-              <w:left w:type="dxa" w:w="100"/>
-              <w:bottom w:type="dxa" w:w="60"/>
-              <w:right w:type="dxa" w:w="100"/>
-            </w:tcMar>
-          </w:tcPr>
-          <w:p>
-            <w:r>
-              <w:rPr>
-                <w:rFonts w:ascii="Times New Roman" w:cs="Times New Roman" w:eastAsia="Times New Roman" w:hAnsi="Times New Roman"/>
-                <w:b w:val="false"/>
-                <w:bCs w:val="false"/>
-                <w:sz w:val="22"/>
-                <w:szCs w:val="22"/>
-              </w:rPr>
-              <w:t xml:space="preserve">Event data from open sources and local event platforms</w:t>
-            </w:r>
-          </w:p>
-        </w:tc>
-      </w:tr>
-      <w:tr>
-        <w:trPr>
-          <w:tblHeader w:val="false"/>
-        </w:trPr>
-        <w:tc>
-          <w:tcPr>
-            <w:tcW w:type="dxa" w:w="2800"/>
-            <w:tcBorders>
-              <w:top w:val="single" w:color="000000" w:sz="4"/>
-              <w:left w:val="single" w:color="000000" w:sz="4"/>
-              <w:bottom w:val="single" w:color="000000" w:sz="4"/>
-              <w:right w:val="single" w:color="000000" w:sz="4"/>
-            </w:tcBorders>
-            <w:tcMar>
-              <w:top w:type="dxa" w:w="60"/>
-              <w:left w:type="dxa" w:w="100"/>
-              <w:bottom w:type="dxa" w:w="60"/>
-              <w:right w:type="dxa" w:w="100"/>
-            </w:tcMar>
-          </w:tcPr>
-          <w:p>
-            <w:r>
-              <w:rPr>
-                <w:rFonts w:ascii="Times New Roman" w:cs="Times New Roman" w:eastAsia="Times New Roman" w:hAnsi="Times New Roman"/>
-                <w:b w:val="false"/>
-                <w:bCs w:val="false"/>
-                <w:sz w:val="22"/>
-                <w:szCs w:val="22"/>
-              </w:rPr>
-              <w:t xml:space="preserve">Offline mode</w:t>
-            </w:r>
-          </w:p>
-        </w:tc>
-        <w:tc>
-          <w:tcPr>
-            <w:tcW w:type="dxa" w:w="6226"/>
-            <w:tcBorders>
-              <w:top w:val="single" w:color="000000" w:sz="4"/>
-              <w:left w:val="single" w:color="000000" w:sz="4"/>
-              <w:bottom w:val="single" w:color="000000" w:sz="4"/>
-              <w:right w:val="single" w:color="000000" w:sz="4"/>
-            </w:tcBorders>
-            <w:tcMar>
-              <w:top w:type="dxa" w:w="60"/>
-              <w:left w:type="dxa" w:w="100"/>
-              <w:bottom w:type="dxa" w:w="60"/>
-              <w:right w:type="dxa" w:w="100"/>
-            </w:tcMar>
-          </w:tcPr>
-          <w:p>
-            <w:r>
-              <w:rPr>
-                <w:rFonts w:ascii="Times New Roman" w:cs="Times New Roman" w:eastAsia="Times New Roman" w:hAnsi="Times New Roman"/>
-                <w:b w:val="false"/>
-                <w:bCs w:val="false"/>
-                <w:sz w:val="22"/>
-                <w:szCs w:val="22"/>
-              </w:rPr>
-              <w:t xml:space="preserve">Local storage on the device (for example, Hive or SQLite)</w:t>
+              <w:t xml:space="preserve">Dart budget core (initial version implemented, DIP-42)</w:t>
             </w:r>
           </w:p>
         </w:tc>
@@ -4895,20 +3923,6 @@
           <w:szCs w:val="28"/>
         </w:rPr>
         <w:t xml:space="preserve">10. System Architecture</w:t>
-      </w:r>
-    </w:p>
-    <w:p>
-      <w:pPr>
-        <w:spacing w:after="120" w:line="300"/>
-        <w:jc w:val="both"/>
-      </w:pPr>
-      <w:r>
-        <w:rPr>
-          <w:rFonts w:ascii="Times New Roman" w:cs="Times New Roman" w:eastAsia="Times New Roman" w:hAnsi="Times New Roman"/>
-          <w:sz w:val="24"/>
-          <w:szCs w:val="24"/>
-        </w:rPr>
-        <w:t xml:space="preserve">The system consists of three main layers:</w:t>
       </w:r>
     </w:p>
     <w:p>
@@ -4927,7 +3941,7 @@
           <w:sz w:val="24"/>
           <w:szCs w:val="24"/>
         </w:rPr>
-        <w:t xml:space="preserve">Mobile and web clients (Flutter, one codebase): user interface, map display, plan editing, voting, comments and offline storage of the plan.</w:t>
+        <w:t xml:space="preserve">Clients (Flutter, one codebase for mobile and web): trip form, draft preview, plan list, budget, map, editor and voting.</w:t>
       </w:r>
     </w:p>
     <w:p>
@@ -4948,15 +3962,15 @@
           <w:sz w:val="24"/>
           <w:szCs w:val="24"/>
         </w:rPr>
-        <w:t xml:space="preserve">Backend:</w:t>
-      </w:r>
-      <w:r>
-        <w:rPr>
-          <w:rFonts w:ascii="Times New Roman" w:cs="Times New Roman" w:eastAsia="Times New Roman" w:hAnsi="Times New Roman"/>
-          <w:sz w:val="24"/>
-          <w:szCs w:val="24"/>
-        </w:rPr>
-        <w:t xml:space="preserve"> user accounts, trips, participants, votes, comments, chat messages, posts and expenses; real-time synchronization between all members of a trip.</w:t>
+        <w:t xml:space="preserve">Backend (Supabase):</w:t>
+      </w:r>
+      <w:r>
+        <w:rPr>
+          <w:rFonts w:ascii="Times New Roman" w:cs="Times New Roman" w:eastAsia="Times New Roman" w:hAnsi="Times New Roman"/>
+          <w:sz w:val="24"/>
+          <w:szCs w:val="24"/>
+        </w:rPr>
+        <w:t xml:space="preserve"> authentication, trips, membership and invitations, versioned itinerary storage, votes, row-level security and Realtime notifications.</w:t>
       </w:r>
     </w:p>
     <w:p>
@@ -4977,15 +3991,15 @@
           <w:sz w:val="24"/>
           <w:szCs w:val="24"/>
         </w:rPr>
-        <w:t xml:space="preserve">External services and AI:</w:t>
-      </w:r>
-      <w:r>
-        <w:rPr>
-          <w:rFonts w:ascii="Times New Roman" w:cs="Times New Roman" w:eastAsia="Times New Roman" w:hAnsi="Times New Roman"/>
-          <w:sz w:val="24"/>
-          <w:szCs w:val="24"/>
-        </w:rPr>
-        <w:t xml:space="preserve"> the AI module generates and updates plans using data from map, weather and event services.</w:t>
+        <w:t xml:space="preserve">Server-side AI and providers:</w:t>
+      </w:r>
+      <w:r>
+        <w:rPr>
+          <w:rFonts w:ascii="Times New Roman" w:cs="Times New Roman" w:eastAsia="Times New Roman" w:hAnsi="Times New Roman"/>
+          <w:sz w:val="24"/>
+          <w:szCs w:val="24"/>
+        </w:rPr>
+        <w:t xml:space="preserve"> candidate selection, the LLM call and map/route services; drafts are stored privately until confirmation.</w:t>
       </w:r>
     </w:p>
     <w:p>
@@ -4999,7 +4013,7 @@
           <w:sz w:val="24"/>
           <w:szCs w:val="24"/>
         </w:rPr>
-        <w:t xml:space="preserve">The main flow is as follows: the user enters the trip parameters in the mobile application; the request is sent to the backend; the backend collects data about places, weather and events and passes it to the AI module; the AI module returns a structured plan; the plan is saved and immediately becomes visible to all trip participants. Any change made by one participant, such as a vote or a comment, is synchronized with the other participants in real time.</w:t>
+        <w:t xml:space="preserve">Detailed diagrams (system context, Use Case, overall and backend components, database) are in the diagrams folder and docs/architecture-and-use-cases.md.</w:t>
       </w:r>
     </w:p>
     <w:p>
@@ -5021,29 +4035,7 @@
     </w:p>
     <w:p>
       <w:pPr>
-        <w:pStyle w:val="Heading2"/>
-        <w:spacing w:after="100" w:before="180"/>
-      </w:pPr>
-      <w:r>
-        <w:rPr>
-          <w:rFonts w:ascii="Times New Roman" w:cs="Times New Roman" w:eastAsia="Times New Roman" w:hAnsi="Times New Roman"/>
-          <w:b/>
-          <w:bCs/>
-          <w:color w:val="000000"/>
-          <w:sz w:val="24"/>
-          <w:szCs w:val="24"/>
-        </w:rPr>
-        <w:t xml:space="preserve">11.1 Functional Requirements</w:t>
-      </w:r>
-    </w:p>
-    <w:p>
-      <w:pPr>
-        <w:pStyle w:val="ListParagraph"/>
-        <w:numPr>
-          <w:ilvl w:val="0"/>
-          <w:numId w:val="2"/>
-        </w:numPr>
-        <w:spacing w:after="80" w:line="300"/>
+        <w:spacing w:after="120" w:line="300"/>
         <w:jc w:val="both"/>
       </w:pPr>
       <w:r>
@@ -5052,474 +4044,7 @@
           <w:sz w:val="24"/>
           <w:szCs w:val="24"/>
         </w:rPr>
-        <w:t xml:space="preserve">The user can register and log in.</w:t>
-      </w:r>
-    </w:p>
-    <w:p>
-      <w:pPr>
-        <w:pStyle w:val="ListParagraph"/>
-        <w:numPr>
-          <w:ilvl w:val="0"/>
-          <w:numId w:val="2"/>
-        </w:numPr>
-        <w:spacing w:after="80" w:line="300"/>
-        <w:jc w:val="both"/>
-      </w:pPr>
-      <w:r>
-        <w:rPr>
-          <w:rFonts w:ascii="Times New Roman" w:cs="Times New Roman" w:eastAsia="Times New Roman" w:hAnsi="Times New Roman"/>
-          <w:sz w:val="24"/>
-          <w:szCs w:val="24"/>
-        </w:rPr>
-        <w:t xml:space="preserve">The user can create a trip by specifying destination, dates, number of people, budget, trip type and interests.</w:t>
-      </w:r>
-    </w:p>
-    <w:p>
-      <w:pPr>
-        <w:pStyle w:val="ListParagraph"/>
-        <w:numPr>
-          <w:ilvl w:val="0"/>
-          <w:numId w:val="2"/>
-        </w:numPr>
-        <w:spacing w:after="80" w:line="300"/>
-        <w:jc w:val="both"/>
-      </w:pPr>
-      <w:r>
-        <w:rPr>
-          <w:rFonts w:ascii="Times New Roman" w:cs="Times New Roman" w:eastAsia="Times New Roman" w:hAnsi="Times New Roman"/>
-          <w:sz w:val="24"/>
-          <w:szCs w:val="24"/>
-        </w:rPr>
-        <w:t xml:space="preserve">The system generates a day-by-day plan with accommodation, food places, attractions and events.</w:t>
-      </w:r>
-    </w:p>
-    <w:p>
-      <w:pPr>
-        <w:pStyle w:val="ListParagraph"/>
-        <w:numPr>
-          <w:ilvl w:val="0"/>
-          <w:numId w:val="2"/>
-        </w:numPr>
-        <w:spacing w:after="80" w:line="300"/>
-        <w:jc w:val="both"/>
-      </w:pPr>
-      <w:r>
-        <w:rPr>
-          <w:rFonts w:ascii="Times New Roman" w:cs="Times New Roman" w:eastAsia="Times New Roman" w:hAnsi="Times New Roman"/>
-          <w:sz w:val="24"/>
-          <w:szCs w:val="24"/>
-        </w:rPr>
-        <w:t xml:space="preserve">The system distributes the budget across the days and shows the estimated cost of each item.</w:t>
-      </w:r>
-    </w:p>
-    <w:p>
-      <w:pPr>
-        <w:pStyle w:val="ListParagraph"/>
-        <w:numPr>
-          <w:ilvl w:val="0"/>
-          <w:numId w:val="2"/>
-        </w:numPr>
-        <w:spacing w:after="80" w:line="300"/>
-        <w:jc w:val="both"/>
-      </w:pPr>
-      <w:r>
-        <w:rPr>
-          <w:rFonts w:ascii="Times New Roman" w:cs="Times New Roman" w:eastAsia="Times New Roman" w:hAnsi="Times New Roman"/>
-          <w:sz w:val="24"/>
-          <w:szCs w:val="24"/>
-        </w:rPr>
-        <w:t xml:space="preserve">The system displays the plan on an interactive map.</w:t>
-      </w:r>
-    </w:p>
-    <w:p>
-      <w:pPr>
-        <w:pStyle w:val="ListParagraph"/>
-        <w:numPr>
-          <w:ilvl w:val="0"/>
-          <w:numId w:val="2"/>
-        </w:numPr>
-        <w:spacing w:after="80" w:line="300"/>
-        <w:jc w:val="both"/>
-      </w:pPr>
-      <w:r>
-        <w:rPr>
-          <w:rFonts w:ascii="Times New Roman" w:cs="Times New Roman" w:eastAsia="Times New Roman" w:hAnsi="Times New Roman"/>
-          <w:sz w:val="24"/>
-          <w:szCs w:val="24"/>
-        </w:rPr>
-        <w:t xml:space="preserve">The user can edit the plan, and the budget is recalculated.</w:t>
-      </w:r>
-    </w:p>
-    <w:p>
-      <w:pPr>
-        <w:pStyle w:val="ListParagraph"/>
-        <w:numPr>
-          <w:ilvl w:val="0"/>
-          <w:numId w:val="2"/>
-        </w:numPr>
-        <w:spacing w:after="80" w:line="300"/>
-        <w:jc w:val="both"/>
-      </w:pPr>
-      <w:r>
-        <w:rPr>
-          <w:rFonts w:ascii="Times New Roman" w:cs="Times New Roman" w:eastAsia="Times New Roman" w:hAnsi="Times New Roman"/>
-          <w:sz w:val="24"/>
-          <w:szCs w:val="24"/>
-        </w:rPr>
-        <w:t xml:space="preserve">The user can invite other users to the trip by link or code.</w:t>
-      </w:r>
-    </w:p>
-    <w:p>
-      <w:pPr>
-        <w:pStyle w:val="ListParagraph"/>
-        <w:numPr>
-          <w:ilvl w:val="0"/>
-          <w:numId w:val="2"/>
-        </w:numPr>
-        <w:spacing w:after="80" w:line="300"/>
-        <w:jc w:val="both"/>
-      </w:pPr>
-      <w:r>
-        <w:rPr>
-          <w:rFonts w:ascii="Times New Roman" w:cs="Times New Roman" w:eastAsia="Times New Roman" w:hAnsi="Times New Roman"/>
-          <w:sz w:val="24"/>
-          <w:szCs w:val="24"/>
-        </w:rPr>
-        <w:t xml:space="preserve">Participants can vote for and comment on plan items.</w:t>
-      </w:r>
-    </w:p>
-    <w:p>
-      <w:pPr>
-        <w:pStyle w:val="ListParagraph"/>
-        <w:numPr>
-          <w:ilvl w:val="0"/>
-          <w:numId w:val="2"/>
-        </w:numPr>
-        <w:spacing w:after="80" w:line="300"/>
-        <w:jc w:val="both"/>
-      </w:pPr>
-      <w:r>
-        <w:rPr>
-          <w:rFonts w:ascii="Times New Roman" w:cs="Times New Roman" w:eastAsia="Times New Roman" w:hAnsi="Times New Roman"/>
-          <w:sz w:val="24"/>
-          <w:szCs w:val="24"/>
-        </w:rPr>
-        <w:t xml:space="preserve">Participants can exchange messages in the trip chat.</w:t>
-      </w:r>
-    </w:p>
-    <w:p>
-      <w:pPr>
-        <w:pStyle w:val="ListParagraph"/>
-        <w:numPr>
-          <w:ilvl w:val="0"/>
-          <w:numId w:val="2"/>
-        </w:numPr>
-        <w:spacing w:after="80" w:line="300"/>
-        <w:jc w:val="both"/>
-      </w:pPr>
-      <w:r>
-        <w:rPr>
-          <w:rFonts w:ascii="Times New Roman" w:cs="Times New Roman" w:eastAsia="Times New Roman" w:hAnsi="Times New Roman"/>
-          <w:sz w:val="24"/>
-          <w:szCs w:val="24"/>
-        </w:rPr>
-        <w:t xml:space="preserve">Users can publish posts with photos and reviews of places in the public feed, view other users' posts and report inappropriate posts.</w:t>
-      </w:r>
-    </w:p>
-    <w:p>
-      <w:pPr>
-        <w:pStyle w:val="ListParagraph"/>
-        <w:numPr>
-          <w:ilvl w:val="0"/>
-          <w:numId w:val="2"/>
-        </w:numPr>
-        <w:spacing w:after="80" w:line="300"/>
-        <w:jc w:val="both"/>
-      </w:pPr>
-      <w:r>
-        <w:rPr>
-          <w:rFonts w:ascii="Times New Roman" w:cs="Times New Roman" w:eastAsia="Times New Roman" w:hAnsi="Times New Roman"/>
-          <w:sz w:val="24"/>
-          <w:szCs w:val="24"/>
-        </w:rPr>
-        <w:t xml:space="preserve">The user can ask the AI assistant to answer questions about the trip or to change the plan, and must confirm each change before it is applied.</w:t>
-      </w:r>
-    </w:p>
-    <w:p>
-      <w:pPr>
-        <w:pStyle w:val="ListParagraph"/>
-        <w:numPr>
-          <w:ilvl w:val="0"/>
-          <w:numId w:val="2"/>
-        </w:numPr>
-        <w:spacing w:after="80" w:line="300"/>
-        <w:jc w:val="both"/>
-      </w:pPr>
-      <w:r>
-        <w:rPr>
-          <w:rFonts w:ascii="Times New Roman" w:cs="Times New Roman" w:eastAsia="Times New Roman" w:hAnsi="Times New Roman"/>
-          <w:sz w:val="24"/>
-          <w:szCs w:val="24"/>
-        </w:rPr>
-        <w:t xml:space="preserve">Participants can enable or disable expense splitting and record expenses.</w:t>
-      </w:r>
-    </w:p>
-    <w:p>
-      <w:pPr>
-        <w:pStyle w:val="ListParagraph"/>
-        <w:numPr>
-          <w:ilvl w:val="0"/>
-          <w:numId w:val="2"/>
-        </w:numPr>
-        <w:spacing w:after="80" w:line="300"/>
-        <w:jc w:val="both"/>
-      </w:pPr>
-      <w:r>
-        <w:rPr>
-          <w:rFonts w:ascii="Times New Roman" w:cs="Times New Roman" w:eastAsia="Times New Roman" w:hAnsi="Times New Roman"/>
-          <w:sz w:val="24"/>
-          <w:szCs w:val="24"/>
-        </w:rPr>
-        <w:t xml:space="preserve">The system considers the weather forecast and local events for the travel dates.</w:t>
-      </w:r>
-    </w:p>
-    <w:p>
-      <w:pPr>
-        <w:pStyle w:val="ListParagraph"/>
-        <w:numPr>
-          <w:ilvl w:val="0"/>
-          <w:numId w:val="2"/>
-        </w:numPr>
-        <w:spacing w:after="80" w:line="300"/>
-        <w:jc w:val="both"/>
-      </w:pPr>
-      <w:r>
-        <w:rPr>
-          <w:rFonts w:ascii="Times New Roman" w:cs="Times New Roman" w:eastAsia="Times New Roman" w:hAnsi="Times New Roman"/>
-          <w:sz w:val="24"/>
-          <w:szCs w:val="24"/>
-        </w:rPr>
-        <w:t xml:space="preserve">The user can open booking links and view the plan offline.</w:t>
-      </w:r>
-    </w:p>
-    <w:p>
-      <w:pPr>
-        <w:pStyle w:val="Heading2"/>
-        <w:spacing w:after="100" w:before="180"/>
-      </w:pPr>
-      <w:r>
-        <w:rPr>
-          <w:rFonts w:ascii="Times New Roman" w:cs="Times New Roman" w:eastAsia="Times New Roman" w:hAnsi="Times New Roman"/>
-          <w:b/>
-          <w:bCs/>
-          <w:color w:val="000000"/>
-          <w:sz w:val="24"/>
-          <w:szCs w:val="24"/>
-        </w:rPr>
-        <w:t xml:space="preserve">11.2 Non-Functional Requirements</w:t>
-      </w:r>
-    </w:p>
-    <w:p>
-      <w:pPr>
-        <w:pStyle w:val="ListParagraph"/>
-        <w:numPr>
-          <w:ilvl w:val="0"/>
-          <w:numId w:val="2"/>
-        </w:numPr>
-        <w:spacing w:after="80" w:line="300"/>
-        <w:jc w:val="both"/>
-      </w:pPr>
-      <w:r>
-        <w:rPr>
-          <w:rFonts w:ascii="Times New Roman" w:cs="Times New Roman" w:eastAsia="Times New Roman" w:hAnsi="Times New Roman"/>
-          <w:b/>
-          <w:bCs/>
-          <w:sz w:val="24"/>
-          <w:szCs w:val="24"/>
-        </w:rPr>
-        <w:t xml:space="preserve">Usability:</w:t>
-      </w:r>
-      <w:r>
-        <w:rPr>
-          <w:rFonts w:ascii="Times New Roman" w:cs="Times New Roman" w:eastAsia="Times New Roman" w:hAnsi="Times New Roman"/>
-          <w:sz w:val="24"/>
-          <w:szCs w:val="24"/>
-        </w:rPr>
-        <w:t xml:space="preserve"> the interface should be simple enough to create a trip in a few minutes.</w:t>
-      </w:r>
-    </w:p>
-    <w:p>
-      <w:pPr>
-        <w:pStyle w:val="ListParagraph"/>
-        <w:numPr>
-          <w:ilvl w:val="0"/>
-          <w:numId w:val="2"/>
-        </w:numPr>
-        <w:spacing w:after="80" w:line="300"/>
-        <w:jc w:val="both"/>
-      </w:pPr>
-      <w:r>
-        <w:rPr>
-          <w:rFonts w:ascii="Times New Roman" w:cs="Times New Roman" w:eastAsia="Times New Roman" w:hAnsi="Times New Roman"/>
-          <w:b/>
-          <w:bCs/>
-          <w:sz w:val="24"/>
-          <w:szCs w:val="24"/>
-        </w:rPr>
-        <w:t xml:space="preserve">Performance:</w:t>
-      </w:r>
-      <w:r>
-        <w:rPr>
-          <w:rFonts w:ascii="Times New Roman" w:cs="Times New Roman" w:eastAsia="Times New Roman" w:hAnsi="Times New Roman"/>
-          <w:sz w:val="24"/>
-          <w:szCs w:val="24"/>
-        </w:rPr>
-        <w:t xml:space="preserve"> a plan should be generated within a reasonable time (target: under 30 seconds).</w:t>
-      </w:r>
-    </w:p>
-    <w:p>
-      <w:pPr>
-        <w:pStyle w:val="ListParagraph"/>
-        <w:numPr>
-          <w:ilvl w:val="0"/>
-          <w:numId w:val="2"/>
-        </w:numPr>
-        <w:spacing w:after="80" w:line="300"/>
-        <w:jc w:val="both"/>
-      </w:pPr>
-      <w:r>
-        <w:rPr>
-          <w:rFonts w:ascii="Times New Roman" w:cs="Times New Roman" w:eastAsia="Times New Roman" w:hAnsi="Times New Roman"/>
-          <w:b/>
-          <w:bCs/>
-          <w:sz w:val="24"/>
-          <w:szCs w:val="24"/>
-        </w:rPr>
-        <w:t xml:space="preserve">Synchronization:</w:t>
-      </w:r>
-      <w:r>
-        <w:rPr>
-          <w:rFonts w:ascii="Times New Roman" w:cs="Times New Roman" w:eastAsia="Times New Roman" w:hAnsi="Times New Roman"/>
-          <w:sz w:val="24"/>
-          <w:szCs w:val="24"/>
-        </w:rPr>
-        <w:t xml:space="preserve"> changes made by one participant should appear for others almost instantly.</w:t>
-      </w:r>
-    </w:p>
-    <w:p>
-      <w:pPr>
-        <w:pStyle w:val="ListParagraph"/>
-        <w:numPr>
-          <w:ilvl w:val="0"/>
-          <w:numId w:val="2"/>
-        </w:numPr>
-        <w:spacing w:after="80" w:line="300"/>
-        <w:jc w:val="both"/>
-      </w:pPr>
-      <w:r>
-        <w:rPr>
-          <w:rFonts w:ascii="Times New Roman" w:cs="Times New Roman" w:eastAsia="Times New Roman" w:hAnsi="Times New Roman"/>
-          <w:b/>
-          <w:bCs/>
-          <w:sz w:val="24"/>
-          <w:szCs w:val="24"/>
-        </w:rPr>
-        <w:t xml:space="preserve">Security:</w:t>
-      </w:r>
-      <w:r>
-        <w:rPr>
-          <w:rFonts w:ascii="Times New Roman" w:cs="Times New Roman" w:eastAsia="Times New Roman" w:hAnsi="Times New Roman"/>
-          <w:sz w:val="24"/>
-          <w:szCs w:val="24"/>
-        </w:rPr>
-        <w:t xml:space="preserve"> user data and trip information are accessible only to the trip participants.</w:t>
-      </w:r>
-    </w:p>
-    <w:p>
-      <w:pPr>
-        <w:pStyle w:val="ListParagraph"/>
-        <w:numPr>
-          <w:ilvl w:val="0"/>
-          <w:numId w:val="2"/>
-        </w:numPr>
-        <w:spacing w:after="80" w:line="300"/>
-        <w:jc w:val="both"/>
-      </w:pPr>
-      <w:r>
-        <w:rPr>
-          <w:rFonts w:ascii="Times New Roman" w:cs="Times New Roman" w:eastAsia="Times New Roman" w:hAnsi="Times New Roman"/>
-          <w:b/>
-          <w:bCs/>
-          <w:sz w:val="24"/>
-          <w:szCs w:val="24"/>
-        </w:rPr>
-        <w:t xml:space="preserve">Availability:</w:t>
-      </w:r>
-      <w:r>
-        <w:rPr>
-          <w:rFonts w:ascii="Times New Roman" w:cs="Times New Roman" w:eastAsia="Times New Roman" w:hAnsi="Times New Roman"/>
-          <w:sz w:val="24"/>
-          <w:szCs w:val="24"/>
-        </w:rPr>
-        <w:t xml:space="preserve"> the saved plan must be accessible offline.</w:t>
-      </w:r>
-    </w:p>
-    <w:p>
-      <w:pPr>
-        <w:pStyle w:val="ListParagraph"/>
-        <w:numPr>
-          <w:ilvl w:val="0"/>
-          <w:numId w:val="2"/>
-        </w:numPr>
-        <w:spacing w:after="80" w:line="300"/>
-        <w:jc w:val="both"/>
-      </w:pPr>
-      <w:r>
-        <w:rPr>
-          <w:rFonts w:ascii="Times New Roman" w:cs="Times New Roman" w:eastAsia="Times New Roman" w:hAnsi="Times New Roman"/>
-          <w:b/>
-          <w:bCs/>
-          <w:sz w:val="24"/>
-          <w:szCs w:val="24"/>
-        </w:rPr>
-        <w:t xml:space="preserve">Cross-platform:</w:t>
-      </w:r>
-      <w:r>
-        <w:rPr>
-          <w:rFonts w:ascii="Times New Roman" w:cs="Times New Roman" w:eastAsia="Times New Roman" w:hAnsi="Times New Roman"/>
-          <w:sz w:val="24"/>
-          <w:szCs w:val="24"/>
-        </w:rPr>
-        <w:t xml:space="preserve"> the application must work on Android and iOS, and a web version must be available in a browser.</w:t>
-      </w:r>
-    </w:p>
-    <w:p>
-      <w:pPr>
-        <w:pStyle w:val="ListParagraph"/>
-        <w:numPr>
-          <w:ilvl w:val="0"/>
-          <w:numId w:val="2"/>
-        </w:numPr>
-        <w:spacing w:after="80" w:line="300"/>
-        <w:jc w:val="both"/>
-      </w:pPr>
-      <w:r>
-        <w:rPr>
-          <w:rFonts w:ascii="Times New Roman" w:cs="Times New Roman" w:eastAsia="Times New Roman" w:hAnsi="Times New Roman"/>
-          <w:b/>
-          <w:bCs/>
-          <w:sz w:val="24"/>
-          <w:szCs w:val="24"/>
-        </w:rPr>
-        <w:t xml:space="preserve">Language:</w:t>
-      </w:r>
-      <w:r>
-        <w:rPr>
-          <w:rFonts w:ascii="Times New Roman" w:cs="Times New Roman" w:eastAsia="Times New Roman" w:hAnsi="Times New Roman"/>
-          <w:sz w:val="24"/>
-          <w:szCs w:val="24"/>
-        </w:rPr>
-        <w:t xml:space="preserve"> the interface should support English, Russian and Kazakh.</w:t>
+        <w:t xml:space="preserve">The full specification with acceptance criteria is docs/requirements-specification.md. The MVP outcomes map to the Must requirements as follows: M1 — FR-01/02; M2 — FR-03/04; M3 — FR-06; M4 — FR-07; M5 — FR-05/08/09. Key non-functional requirements include draft generation in under 30 seconds (NFR-01), access control (NFR-03), no secrets in the client (NFR-06), the Android/iOS/web build matrix (NFR-07), catalog-only place IDs (NFR-09), recoverable provider errors (NFR-10) and explicit cost units and sources (NFR-11). Deferred features are Could requirements FR-10 to FR-19.</w:t>
       </w:r>
     </w:p>
     <w:p>
@@ -5536,7 +4061,308 @@
           <w:sz w:val="28"/>
           <w:szCs w:val="28"/>
         </w:rPr>
-        <w:t xml:space="preserve">12. Development Plan</w:t>
+        <w:t xml:space="preserve">12. Team Responsibilities</w:t>
+      </w:r>
+    </w:p>
+    <w:tbl>
+      <w:tblPr>
+        <w:tblW w:type="dxa" w:w="9026"/>
+        <w:tblBorders>
+          <w:top w:val="single" w:color="auto" w:sz="4"/>
+          <w:left w:val="single" w:color="auto" w:sz="4"/>
+          <w:bottom w:val="single" w:color="auto" w:sz="4"/>
+          <w:right w:val="single" w:color="auto" w:sz="4"/>
+          <w:insideH w:val="single" w:color="auto" w:sz="4"/>
+          <w:insideV w:val="single" w:color="auto" w:sz="4"/>
+        </w:tblBorders>
+      </w:tblPr>
+      <w:tblGrid>
+        <w:gridCol w:w="2500"/>
+        <w:gridCol w:w="6526"/>
+      </w:tblGrid>
+      <w:tr>
+        <w:trPr>
+          <w:tblHeader/>
+        </w:trPr>
+        <w:tc>
+          <w:tcPr>
+            <w:tcW w:type="dxa" w:w="2500"/>
+            <w:tcBorders>
+              <w:top w:val="single" w:color="000000" w:sz="4"/>
+              <w:left w:val="single" w:color="000000" w:sz="4"/>
+              <w:bottom w:val="single" w:color="000000" w:sz="4"/>
+              <w:right w:val="single" w:color="000000" w:sz="4"/>
+            </w:tcBorders>
+            <w:tcMar>
+              <w:top w:type="dxa" w:w="60"/>
+              <w:left w:type="dxa" w:w="100"/>
+              <w:bottom w:type="dxa" w:w="60"/>
+              <w:right w:type="dxa" w:w="100"/>
+            </w:tcMar>
+          </w:tcPr>
+          <w:p>
+            <w:r>
+              <w:rPr>
+                <w:rFonts w:ascii="Times New Roman" w:cs="Times New Roman" w:eastAsia="Times New Roman" w:hAnsi="Times New Roman"/>
+                <w:b/>
+                <w:bCs/>
+                <w:sz w:val="22"/>
+                <w:szCs w:val="22"/>
+              </w:rPr>
+              <w:t xml:space="preserve">Member</w:t>
+            </w:r>
+          </w:p>
+        </w:tc>
+        <w:tc>
+          <w:tcPr>
+            <w:tcW w:type="dxa" w:w="6526"/>
+            <w:tcBorders>
+              <w:top w:val="single" w:color="000000" w:sz="4"/>
+              <w:left w:val="single" w:color="000000" w:sz="4"/>
+              <w:bottom w:val="single" w:color="000000" w:sz="4"/>
+              <w:right w:val="single" w:color="000000" w:sz="4"/>
+            </w:tcBorders>
+            <w:tcMar>
+              <w:top w:type="dxa" w:w="60"/>
+              <w:left w:type="dxa" w:w="100"/>
+              <w:bottom w:type="dxa" w:w="60"/>
+              <w:right w:type="dxa" w:w="100"/>
+            </w:tcMar>
+          </w:tcPr>
+          <w:p>
+            <w:r>
+              <w:rPr>
+                <w:rFonts w:ascii="Times New Roman" w:cs="Times New Roman" w:eastAsia="Times New Roman" w:hAnsi="Times New Roman"/>
+                <w:b/>
+                <w:bCs/>
+                <w:sz w:val="22"/>
+                <w:szCs w:val="22"/>
+              </w:rPr>
+              <w:t xml:space="preserve">Proposed technical ownership (pending review)</w:t>
+            </w:r>
+          </w:p>
+        </w:tc>
+      </w:tr>
+      <w:tr>
+        <w:trPr>
+          <w:tblHeader w:val="false"/>
+        </w:trPr>
+        <w:tc>
+          <w:tcPr>
+            <w:tcW w:type="dxa" w:w="2500"/>
+            <w:tcBorders>
+              <w:top w:val="single" w:color="000000" w:sz="4"/>
+              <w:left w:val="single" w:color="000000" w:sz="4"/>
+              <w:bottom w:val="single" w:color="000000" w:sz="4"/>
+              <w:right w:val="single" w:color="000000" w:sz="4"/>
+            </w:tcBorders>
+            <w:tcMar>
+              <w:top w:type="dxa" w:w="60"/>
+              <w:left w:type="dxa" w:w="100"/>
+              <w:bottom w:type="dxa" w:w="60"/>
+              <w:right w:type="dxa" w:w="100"/>
+            </w:tcMar>
+          </w:tcPr>
+          <w:p>
+            <w:r>
+              <w:rPr>
+                <w:rFonts w:ascii="Times New Roman" w:cs="Times New Roman" w:eastAsia="Times New Roman" w:hAnsi="Times New Roman"/>
+                <w:b w:val="false"/>
+                <w:bCs w:val="false"/>
+                <w:sz w:val="22"/>
+                <w:szCs w:val="22"/>
+              </w:rPr>
+              <w:t xml:space="preserve">Kabysheva Zukhra Yerzhankyzy</w:t>
+            </w:r>
+          </w:p>
+        </w:tc>
+        <w:tc>
+          <w:tcPr>
+            <w:tcW w:type="dxa" w:w="6526"/>
+            <w:tcBorders>
+              <w:top w:val="single" w:color="000000" w:sz="4"/>
+              <w:left w:val="single" w:color="000000" w:sz="4"/>
+              <w:bottom w:val="single" w:color="000000" w:sz="4"/>
+              <w:right w:val="single" w:color="000000" w:sz="4"/>
+            </w:tcBorders>
+            <w:tcMar>
+              <w:top w:type="dxa" w:w="60"/>
+              <w:left w:type="dxa" w:w="100"/>
+              <w:bottom w:type="dxa" w:w="60"/>
+              <w:right w:type="dxa" w:w="100"/>
+            </w:tcMar>
+          </w:tcPr>
+          <w:p>
+            <w:r>
+              <w:rPr>
+                <w:rFonts w:ascii="Times New Roman" w:cs="Times New Roman" w:eastAsia="Times New Roman" w:hAnsi="Times New Roman"/>
+                <w:b w:val="false"/>
+                <w:bCs w:val="false"/>
+                <w:sz w:val="22"/>
+                <w:szCs w:val="22"/>
+              </w:rPr>
+              <w:t xml:space="preserve">Trip form and validation; planned-cost model and budget core (DIP-42); route editor with budget preview; voting client; unit and client tests. Requirements, research and report coordination.</w:t>
+            </w:r>
+          </w:p>
+        </w:tc>
+      </w:tr>
+      <w:tr>
+        <w:trPr>
+          <w:tblHeader w:val="false"/>
+        </w:trPr>
+        <w:tc>
+          <w:tcPr>
+            <w:tcW w:type="dxa" w:w="2500"/>
+            <w:tcBorders>
+              <w:top w:val="single" w:color="000000" w:sz="4"/>
+              <w:left w:val="single" w:color="000000" w:sz="4"/>
+              <w:bottom w:val="single" w:color="000000" w:sz="4"/>
+              <w:right w:val="single" w:color="000000" w:sz="4"/>
+            </w:tcBorders>
+            <w:tcMar>
+              <w:top w:type="dxa" w:w="60"/>
+              <w:left w:type="dxa" w:w="100"/>
+              <w:bottom w:type="dxa" w:w="60"/>
+              <w:right w:type="dxa" w:w="100"/>
+            </w:tcMar>
+          </w:tcPr>
+          <w:p>
+            <w:r>
+              <w:rPr>
+                <w:rFonts w:ascii="Times New Roman" w:cs="Times New Roman" w:eastAsia="Times New Roman" w:hAnsi="Times New Roman"/>
+                <w:b w:val="false"/>
+                <w:bCs w:val="false"/>
+                <w:sz w:val="22"/>
+                <w:szCs w:val="22"/>
+              </w:rPr>
+              <w:t xml:space="preserve">Aman Yerassyl</w:t>
+            </w:r>
+          </w:p>
+        </w:tc>
+        <w:tc>
+          <w:tcPr>
+            <w:tcW w:type="dxa" w:w="6526"/>
+            <w:tcBorders>
+              <w:top w:val="single" w:color="000000" w:sz="4"/>
+              <w:left w:val="single" w:color="000000" w:sz="4"/>
+              <w:bottom w:val="single" w:color="000000" w:sz="4"/>
+              <w:right w:val="single" w:color="000000" w:sz="4"/>
+            </w:tcBorders>
+            <w:tcMar>
+              <w:top w:type="dxa" w:w="60"/>
+              <w:left w:type="dxa" w:w="100"/>
+              <w:bottom w:type="dxa" w:w="60"/>
+              <w:right w:type="dxa" w:w="100"/>
+            </w:tcMar>
+          </w:tcPr>
+          <w:p>
+            <w:r>
+              <w:rPr>
+                <w:rFonts w:ascii="Times New Roman" w:cs="Times New Roman" w:eastAsia="Times New Roman" w:hAnsi="Times New Roman"/>
+                <w:b w:val="false"/>
+                <w:bCs w:val="false"/>
+                <w:sz w:val="22"/>
+                <w:szCs w:val="22"/>
+              </w:rPr>
+              <w:t xml:space="preserve">Supabase, schema and migrations, authentication and row-level security; invitations; versioned persistence and confirmation; server voting and synchronization; server tests.</w:t>
+            </w:r>
+          </w:p>
+        </w:tc>
+      </w:tr>
+      <w:tr>
+        <w:trPr>
+          <w:tblHeader w:val="false"/>
+        </w:trPr>
+        <w:tc>
+          <w:tcPr>
+            <w:tcW w:type="dxa" w:w="2500"/>
+            <w:tcBorders>
+              <w:top w:val="single" w:color="000000" w:sz="4"/>
+              <w:left w:val="single" w:color="000000" w:sz="4"/>
+              <w:bottom w:val="single" w:color="000000" w:sz="4"/>
+              <w:right w:val="single" w:color="000000" w:sz="4"/>
+            </w:tcBorders>
+            <w:tcMar>
+              <w:top w:type="dxa" w:w="60"/>
+              <w:left w:type="dxa" w:w="100"/>
+              <w:bottom w:type="dxa" w:w="60"/>
+              <w:right w:type="dxa" w:w="100"/>
+            </w:tcMar>
+          </w:tcPr>
+          <w:p>
+            <w:r>
+              <w:rPr>
+                <w:rFonts w:ascii="Times New Roman" w:cs="Times New Roman" w:eastAsia="Times New Roman" w:hAnsi="Times New Roman"/>
+                <w:b w:val="false"/>
+                <w:bCs w:val="false"/>
+                <w:sz w:val="22"/>
+                <w:szCs w:val="22"/>
+              </w:rPr>
+              <w:t xml:space="preserve">Shauzat Sayakhat Anarbekuly</w:t>
+            </w:r>
+          </w:p>
+        </w:tc>
+        <w:tc>
+          <w:tcPr>
+            <w:tcW w:type="dxa" w:w="6526"/>
+            <w:tcBorders>
+              <w:top w:val="single" w:color="000000" w:sz="4"/>
+              <w:left w:val="single" w:color="000000" w:sz="4"/>
+              <w:bottom w:val="single" w:color="000000" w:sz="4"/>
+              <w:right w:val="single" w:color="000000" w:sz="4"/>
+            </w:tcBorders>
+            <w:tcMar>
+              <w:top w:type="dxa" w:w="60"/>
+              <w:left w:type="dxa" w:w="100"/>
+              <w:bottom w:type="dxa" w:w="60"/>
+              <w:right w:type="dxa" w:w="100"/>
+            </w:tcMar>
+          </w:tcPr>
+          <w:p>
+            <w:r>
+              <w:rPr>
+                <w:rFonts w:ascii="Times New Roman" w:cs="Times New Roman" w:eastAsia="Times New Roman" w:hAnsi="Times New Roman"/>
+                <w:b w:val="false"/>
+                <w:bCs w:val="false"/>
+                <w:sz w:val="22"/>
+                <w:szCs w:val="22"/>
+              </w:rPr>
+              <w:t xml:space="preserve">Flutter shell and navigation; AI route-draft generation and candidate selection; day plan and map; provider errors; AI and map integration tests. Proposal, UX and risk documents.</w:t>
+            </w:r>
+          </w:p>
+        </w:tc>
+      </w:tr>
+    </w:tbl>
+    <w:p/>
+    <w:p>
+      <w:pPr>
+        <w:pStyle w:val="Heading1"/>
+        <w:spacing w:after="120" w:before="240"/>
+      </w:pPr>
+      <w:r>
+        <w:rPr>
+          <w:rFonts w:ascii="Times New Roman" w:cs="Times New Roman" w:eastAsia="Times New Roman" w:hAnsi="Times New Roman"/>
+          <w:b/>
+          <w:bCs/>
+          <w:color w:val="000000"/>
+          <w:sz w:val="28"/>
+          <w:szCs w:val="28"/>
+        </w:rPr>
+        <w:t xml:space="preserve">13. Development Plan and Current Status</w:t>
+      </w:r>
+    </w:p>
+    <w:p>
+      <w:pPr>
+        <w:spacing w:after="120" w:line="300"/>
+        <w:jc w:val="both"/>
+      </w:pPr>
+      <w:r>
+        <w:rPr>
+          <w:rFonts w:ascii="Times New Roman" w:cs="Times New Roman" w:eastAsia="Times New Roman" w:hAnsi="Times New Roman"/>
+          <w:sz w:val="24"/>
+          <w:szCs w:val="24"/>
+        </w:rPr>
+        <w:t xml:space="preserve">Status on 24 October 2026: requirements, diagrams, comparisons, literature review, survey analysis, static wireframes and the verification plan are prepared. The only implemented code is Zukhra's initial standalone Dart budget core (34 deterministic checks reported as passing). The Flutter application, the backend, AI generation and the map are not implemented yet, and no application tests have been run.</w:t>
       </w:r>
     </w:p>
     <w:tbl>
@@ -5706,7 +4532,7 @@
                 <w:sz w:val="22"/>
                 <w:szCs w:val="22"/>
               </w:rPr>
-              <w:t xml:space="preserve">Research and analysis</w:t>
+              <w:t xml:space="preserve">Analysis and design (done for pre-defense 1)</w:t>
             </w:r>
           </w:p>
         </w:tc>
@@ -5735,7 +4561,7 @@
                 <w:sz w:val="22"/>
                 <w:szCs w:val="22"/>
               </w:rPr>
-              <w:t xml:space="preserve">Study competitors, interview potential users, define requirements</w:t>
+              <w:t xml:space="preserve">Requirements, architecture, database, research, wireframes</w:t>
             </w:r>
           </w:p>
         </w:tc>
@@ -5798,7 +4624,7 @@
                 <w:sz w:val="22"/>
                 <w:szCs w:val="22"/>
               </w:rPr>
-              <w:t xml:space="preserve">Design</w:t>
+              <w:t xml:space="preserve">Foundation</w:t>
             </w:r>
           </w:p>
         </w:tc>
@@ -5827,7 +4653,7 @@
                 <w:sz w:val="22"/>
                 <w:szCs w:val="22"/>
               </w:rPr>
-              <w:t xml:space="preserve">Architecture, database structure, user flows and interface design</w:t>
+              <w:t xml:space="preserve">Flutter shell, trip form, Supabase project, authentication and CreateTrip</w:t>
             </w:r>
           </w:p>
         </w:tc>
@@ -5890,7 +4716,7 @@
                 <w:sz w:val="22"/>
                 <w:szCs w:val="22"/>
               </w:rPr>
-              <w:t xml:space="preserve">Core development</w:t>
+              <w:t xml:space="preserve">Route and budget</w:t>
             </w:r>
           </w:p>
         </w:tc>
@@ -5919,7 +4745,7 @@
                 <w:sz w:val="22"/>
                 <w:szCs w:val="22"/>
               </w:rPr>
-              <w:t xml:space="preserve">Trip creation, AI plan generation, budget distribution, map</w:t>
+              <w:t xml:space="preserve">Candidate selection, AI draft, budget integration, preview and confirmation</w:t>
             </w:r>
           </w:p>
         </w:tc>
@@ -5982,7 +4808,7 @@
                 <w:sz w:val="22"/>
                 <w:szCs w:val="22"/>
               </w:rPr>
-              <w:t xml:space="preserve">Collaboration and community</w:t>
+              <w:t xml:space="preserve">Map</w:t>
             </w:r>
           </w:p>
         </w:tc>
@@ -6011,7 +4837,7 @@
                 <w:sz w:val="22"/>
                 <w:szCs w:val="22"/>
               </w:rPr>
-              <w:t xml:space="preserve">Invitations, voting, comments, trip chat, expense splitting, public feed</w:t>
+              <w:t xml:space="preserve">Day plan and map with provider-error handling</w:t>
             </w:r>
           </w:p>
         </w:tc>
@@ -6074,7 +4900,7 @@
                 <w:sz w:val="22"/>
                 <w:szCs w:val="22"/>
               </w:rPr>
-              <w:t xml:space="preserve">Integrations</w:t>
+              <w:t xml:space="preserve">Collaboration</w:t>
             </w:r>
           </w:p>
         </w:tc>
@@ -6103,7 +4929,7 @@
                 <w:sz w:val="22"/>
                 <w:szCs w:val="22"/>
               </w:rPr>
-              <w:t xml:space="preserve">Weather, events, booking links, offline mode</w:t>
+              <w:t xml:space="preserve">Invitations, versioned editing, voting and synchronization</w:t>
             </w:r>
           </w:p>
         </w:tc>
@@ -6195,7 +5021,7 @@
                 <w:sz w:val="22"/>
                 <w:szCs w:val="22"/>
               </w:rPr>
-              <w:t xml:space="preserve">Functional testing, testing with real users, bug fixing</w:t>
+              <w:t xml:space="preserve">Acceptance, integration, security and usability tests</w:t>
             </w:r>
           </w:p>
         </w:tc>
@@ -6287,13 +5113,27 @@
                 <w:sz w:val="22"/>
                 <w:szCs w:val="22"/>
               </w:rPr>
-              <w:t xml:space="preserve">Improvements based on feedback, documentation, defense preparation</w:t>
+              <w:t xml:space="preserve">Fixes, documentation and defense preparation</w:t>
             </w:r>
           </w:p>
         </w:tc>
       </w:tr>
     </w:tbl>
     <w:p/>
+    <w:p>
+      <w:pPr>
+        <w:spacing w:after="120" w:line="300"/>
+        <w:jc w:val="both"/>
+      </w:pPr>
+      <w:r>
+        <w:rPr>
+          <w:rFonts w:ascii="Times New Roman" w:cs="Times New Roman" w:eastAsia="Times New Roman" w:hAnsi="Times New Roman"/>
+          <w:sz w:val="24"/>
+          <w:szCs w:val="24"/>
+        </w:rPr>
+        <w:t xml:space="preserve">Dates for stages 2–7 will be agreed with the team and the supervisor.</w:t>
+      </w:r>
+    </w:p>
     <w:p>
       <w:pPr>
         <w:pStyle w:val="Heading1"/>
@@ -6308,21 +5148,7 @@
           <w:sz w:val="28"/>
           <w:szCs w:val="28"/>
         </w:rPr>
-        <w:t xml:space="preserve">13. Expected Results</w:t>
-      </w:r>
-    </w:p>
-    <w:p>
-      <w:pPr>
-        <w:spacing w:after="120" w:line="300"/>
-        <w:jc w:val="both"/>
-      </w:pPr>
-      <w:r>
-        <w:rPr>
-          <w:rFonts w:ascii="Times New Roman" w:cs="Times New Roman" w:eastAsia="Times New Roman" w:hAnsi="Times New Roman"/>
-          <w:sz w:val="24"/>
-          <w:szCs w:val="24"/>
-        </w:rPr>
-        <w:t xml:space="preserve">As a result of the project, we expect to deliver a working cross-platform mobile application with a web version that:</w:t>
+        <w:t xml:space="preserve">14. Expected Results</w:t>
       </w:r>
     </w:p>
     <w:p>
@@ -6341,7 +5167,7 @@
           <w:sz w:val="24"/>
           <w:szCs w:val="24"/>
         </w:rPr>
-        <w:t xml:space="preserve">generates a personalized day-by-day trip plan in a few minutes instead of hours of manual research;</w:t>
+        <w:t xml:space="preserve">A Flutter application for Android, iOS and the web with a shared Supabase backend that supports the full MVP scenario.</w:t>
       </w:r>
     </w:p>
     <w:p>
@@ -6360,7 +5186,7 @@
           <w:sz w:val="24"/>
           <w:szCs w:val="24"/>
         </w:rPr>
-        <w:t xml:space="preserve">recommends places verified by local residents, starting with Astana;</w:t>
+        <w:t xml:space="preserve">Route drafts that use only checked catalog places, with prices taken from the catalog and never from the AI model.</w:t>
       </w:r>
     </w:p>
     <w:p>
@@ -6379,7 +5205,7 @@
           <w:sz w:val="24"/>
           <w:szCs w:val="24"/>
         </w:rPr>
-        <w:t xml:space="preserve">lets users adjust the plan in plain language through the AI assistant;</w:t>
+        <w:t xml:space="preserve">Exact planned-budget estimates by day, category and whole trip, with missing data shown instead of counted as zero.</w:t>
       </w:r>
     </w:p>
     <w:p>
@@ -6398,7 +5224,7 @@
           <w:sz w:val="24"/>
           <w:szCs w:val="24"/>
         </w:rPr>
-        <w:t xml:space="preserve">helps travelers stay within their budget by distributing it across the days of the trip;</w:t>
+        <w:t xml:space="preserve">Shared editing and voting without silently lost changes.</w:t>
       </w:r>
     </w:p>
     <w:p>
@@ -6417,64 +5243,7 @@
           <w:sz w:val="24"/>
           <w:szCs w:val="24"/>
         </w:rPr>
-        <w:t xml:space="preserve">makes group trip planning transparent through shared plans, voting, comments and a trip chat;</w:t>
-      </w:r>
-    </w:p>
-    <w:p>
-      <w:pPr>
-        <w:pStyle w:val="ListParagraph"/>
-        <w:numPr>
-          <w:ilvl w:val="0"/>
-          <w:numId w:val="2"/>
-        </w:numPr>
-        <w:spacing w:after="80" w:line="300"/>
-        <w:jc w:val="both"/>
-      </w:pPr>
-      <w:r>
-        <w:rPr>
-          <w:rFonts w:ascii="Times New Roman" w:cs="Times New Roman" w:eastAsia="Times New Roman" w:hAnsi="Times New Roman"/>
-          <w:sz w:val="24"/>
-          <w:szCs w:val="24"/>
-        </w:rPr>
-        <w:t xml:space="preserve">helps travelers learn from each other through a community feed of real experiences;</w:t>
-      </w:r>
-    </w:p>
-    <w:p>
-      <w:pPr>
-        <w:pStyle w:val="ListParagraph"/>
-        <w:numPr>
-          <w:ilvl w:val="0"/>
-          <w:numId w:val="2"/>
-        </w:numPr>
-        <w:spacing w:after="80" w:line="300"/>
-        <w:jc w:val="both"/>
-      </w:pPr>
-      <w:r>
-        <w:rPr>
-          <w:rFonts w:ascii="Times New Roman" w:cs="Times New Roman" w:eastAsia="Times New Roman" w:hAnsi="Times New Roman"/>
-          <w:sz w:val="24"/>
-          <w:szCs w:val="24"/>
-        </w:rPr>
-        <w:t xml:space="preserve">helps travelers discover local events and adapt their plans to the weather;</w:t>
-      </w:r>
-    </w:p>
-    <w:p>
-      <w:pPr>
-        <w:pStyle w:val="ListParagraph"/>
-        <w:numPr>
-          <w:ilvl w:val="0"/>
-          <w:numId w:val="2"/>
-        </w:numPr>
-        <w:spacing w:after="80" w:line="300"/>
-        <w:jc w:val="both"/>
-      </w:pPr>
-      <w:r>
-        <w:rPr>
-          <w:rFonts w:ascii="Times New Roman" w:cs="Times New Roman" w:eastAsia="Times New Roman" w:hAnsi="Times New Roman"/>
-          <w:sz w:val="24"/>
-          <w:szCs w:val="24"/>
-        </w:rPr>
-        <w:t xml:space="preserve">promotes local tourism by showing restaurants, attractions and events in Kazakhstan cities.</w:t>
+        <w:t xml:space="preserve">Executed test evidence, including a usability study with at least 10 users (target mean SUS ≥ 70).</w:t>
       </w:r>
     </w:p>
     <w:p>
@@ -6491,7 +5260,7 @@
           <w:sz w:val="28"/>
           <w:szCs w:val="28"/>
         </w:rPr>
-        <w:t xml:space="preserve">14. Future Development</w:t>
+        <w:t xml:space="preserve">15. Future Development</w:t>
       </w:r>
     </w:p>
     <w:p>
@@ -6505,123 +5274,7 @@
           <w:sz w:val="24"/>
           <w:szCs w:val="24"/>
         </w:rPr>
-        <w:t xml:space="preserve">During the diploma project, the application will focus on Astana, because a reliable database of places, prices and events can be built and verified for one city, partly with the help of the survey of local residents. After the core functionality is tested, the application will be extended to other cities of Kazakhstan; expansion outside Kazakhstan is not planned. The following directions are planned:</w:t>
-      </w:r>
-    </w:p>
-    <w:p>
-      <w:pPr>
-        <w:pStyle w:val="ListParagraph"/>
-        <w:numPr>
-          <w:ilvl w:val="0"/>
-          <w:numId w:val="2"/>
-        </w:numPr>
-        <w:spacing w:after="80" w:line="300"/>
-        <w:jc w:val="both"/>
-      </w:pPr>
-      <w:r>
-        <w:rPr>
-          <w:rFonts w:ascii="Times New Roman" w:cs="Times New Roman" w:eastAsia="Times New Roman" w:hAnsi="Times New Roman"/>
-          <w:b/>
-          <w:bCs/>
-          <w:sz w:val="24"/>
-          <w:szCs w:val="24"/>
-        </w:rPr>
-        <w:t xml:space="preserve">Other cities of Kazakhstan:</w:t>
-      </w:r>
-      <w:r>
-        <w:rPr>
-          <w:rFonts w:ascii="Times New Roman" w:cs="Times New Roman" w:eastAsia="Times New Roman" w:hAnsi="Times New Roman"/>
-          <w:sz w:val="24"/>
-          <w:szCs w:val="24"/>
-        </w:rPr>
-        <w:t xml:space="preserve"> adding Almaty, Shymkent, Turkistan and other popular destinations.</w:t>
-      </w:r>
-    </w:p>
-    <w:p>
-      <w:pPr>
-        <w:pStyle w:val="ListParagraph"/>
-        <w:numPr>
-          <w:ilvl w:val="0"/>
-          <w:numId w:val="2"/>
-        </w:numPr>
-        <w:spacing w:after="80" w:line="300"/>
-        <w:jc w:val="both"/>
-      </w:pPr>
-      <w:r>
-        <w:rPr>
-          <w:rFonts w:ascii="Times New Roman" w:cs="Times New Roman" w:eastAsia="Times New Roman" w:hAnsi="Times New Roman"/>
-          <w:b/>
-          <w:bCs/>
-          <w:sz w:val="24"/>
-          <w:szCs w:val="24"/>
-        </w:rPr>
-        <w:t xml:space="preserve">Holidays and events across Kazakhstan:</w:t>
-      </w:r>
-      <w:r>
-        <w:rPr>
-          <w:rFonts w:ascii="Times New Roman" w:cs="Times New Roman" w:eastAsia="Times New Roman" w:hAnsi="Times New Roman"/>
-          <w:sz w:val="24"/>
-          <w:szCs w:val="24"/>
-        </w:rPr>
-        <w:t xml:space="preserve"> information about national and regional holidays, festivals and seasonal events in each supported city, so that travelers can plan their trip for the best time.</w:t>
-      </w:r>
-    </w:p>
-    <w:p>
-      <w:pPr>
-        <w:pStyle w:val="ListParagraph"/>
-        <w:numPr>
-          <w:ilvl w:val="0"/>
-          <w:numId w:val="2"/>
-        </w:numPr>
-        <w:spacing w:after="80" w:line="300"/>
-        <w:jc w:val="both"/>
-      </w:pPr>
-      <w:r>
-        <w:rPr>
-          <w:rFonts w:ascii="Times New Roman" w:cs="Times New Roman" w:eastAsia="Times New Roman" w:hAnsi="Times New Roman"/>
-          <w:b/>
-          <w:bCs/>
-          <w:sz w:val="24"/>
-          <w:szCs w:val="24"/>
-        </w:rPr>
-        <w:t xml:space="preserve">Community-based recommendations:</w:t>
-      </w:r>
-      <w:r>
-        <w:rPr>
-          <w:rFonts w:ascii="Times New Roman" w:cs="Times New Roman" w:eastAsia="Times New Roman" w:hAnsi="Times New Roman"/>
-          <w:sz w:val="24"/>
-          <w:szCs w:val="24"/>
-        </w:rPr>
-        <w:t xml:space="preserve"> using the posts and ratings from the community feed to improve the recommendations of the AI.</w:t>
-      </w:r>
-    </w:p>
-    <w:p>
-      <w:pPr>
-        <w:pStyle w:val="ListParagraph"/>
-        <w:numPr>
-          <w:ilvl w:val="0"/>
-          <w:numId w:val="2"/>
-        </w:numPr>
-        <w:spacing w:after="80" w:line="300"/>
-        <w:jc w:val="both"/>
-      </w:pPr>
-      <w:r>
-        <w:rPr>
-          <w:rFonts w:ascii="Times New Roman" w:cs="Times New Roman" w:eastAsia="Times New Roman" w:hAnsi="Times New Roman"/>
-          <w:b/>
-          <w:bCs/>
-          <w:sz w:val="24"/>
-          <w:szCs w:val="24"/>
-        </w:rPr>
-        <w:t xml:space="preserve">Partnerships:</w:t>
-      </w:r>
-      <w:r>
-        <w:rPr>
-          <w:rFonts w:ascii="Times New Roman" w:cs="Times New Roman" w:eastAsia="Times New Roman" w:hAnsi="Times New Roman"/>
-          <w:sz w:val="24"/>
-          <w:szCs w:val="24"/>
-        </w:rPr>
-        <w:t xml:space="preserve"> cooperation with local businesses and event organizers to keep information about places and events up to date.</w:t>
+        <w:t xml:space="preserve">After the MVP is complete and tested, the deferred features can be added: trip chat and comments, the conversational AI assistant, actual expense splitting, weather-aware suggestions and local events, offline access, booking links and a community feed. Geographically, the application will stay within Kazakhstan: after Astana, other cities such as Almaty, Shymkent and Turkistan can be added once their place data is checked.</w:t>
       </w:r>
     </w:p>
     <w:p>
@@ -6638,7 +5291,7 @@
           <w:sz w:val="28"/>
           <w:szCs w:val="28"/>
         </w:rPr>
-        <w:t xml:space="preserve">15. Conclusion</w:t>
+        <w:t xml:space="preserve">16. Conclusion</w:t>
       </w:r>
     </w:p>
     <w:p>
@@ -6652,7 +5305,7 @@
           <w:sz w:val="24"/>
           <w:szCs w:val="24"/>
         </w:rPr>
-        <w:t xml:space="preserve">The proposed mobile application addresses a common real-life problem: planning a trip, especially with a group, takes too much time and effort, and the information is scattered across many services. By combining AI-based plan generation, budget distribution, an interactive map, local events, weather awareness, an AI travel assistant, recommendations from local residents, a community feed and collaborative tools such as voting and a trip chat in one application, we aim to make trip planning fast, convenient and enjoyable. The project is practically useful, technically feasible with modern tools such as Flutter, cloud backends and AI services, and has clear potential for further development after the diploma work.</w:t>
+        <w:t xml:space="preserve">Planning a group trip takes too much time and effort because information is scattered and group decisions are hard to coordinate. Following the supervisor's feedback, our project focuses on five essential functions: creating a trip, generating a grounded route draft, estimating the budget, showing the route on a map, and editing and voting together. The AI is used in a limited, verifiable way, and every member of the team owns a real technical module. The design work for this stage is complete; implementation and testing are the next steps.</w:t>
       </w:r>
     </w:p>
     <w:sectPr>

</xml_diff>